<commit_message>
feat: add 'MEMORIAL_ESPECIFICA', 'PLANILHA_OR', 'PROJETO_ELETRICO_HIDROSANIT' and 'PROJETO_ESTRUTURAL04_2024' files
</commit_message>
<xml_diff>
--- a/obras-arquivos/or0001-ament/1. RELATÓRIO CONCORRÊNCIA Nº 00004-2024 (AMENT).docx
+++ b/obras-arquivos/or0001-ament/1. RELATÓRIO CONCORRÊNCIA Nº 00004-2024 (AMENT).docx
@@ -1,8 +1,8 @@
 
 <file path=word/document.xml><?xml version="1.0" encoding="utf-8"?>
-<w:document xmlns:w14="http://schemas.microsoft.com/office/word/2010/wordml" xmlns:wp14="http://schemas.microsoft.com/office/word/2010/wordprocessingDrawing" xmlns:ve="http://schemas.openxmlformats.org/markup-compatibility/2006" xmlns:o="urn:schemas-microsoft-com:office:office" xmlns:r="http://schemas.openxmlformats.org/officeDocument/2006/relationships" xmlns:m="http://schemas.openxmlformats.org/officeDocument/2006/math" xmlns:v="urn:schemas-microsoft-com:vml" xmlns:wp="http://schemas.openxmlformats.org/drawingml/2006/wordprocessingDrawing" xmlns:w10="urn:schemas-microsoft-com:office:word" xmlns:w="http://schemas.openxmlformats.org/wordprocessingml/2006/main" xmlns:wne="http://schemas.microsoft.com/office/word/2006/wordml" xmlns:mc="http://schemas.openxmlformats.org/markup-compatibility/2006" mc:Ignorable="w14 wp14">
+<w:document xmlns:wpc="http://schemas.microsoft.com/office/word/2010/wordprocessingCanvas" xmlns:cx="http://schemas.microsoft.com/office/drawing/2014/chartex" xmlns:cx1="http://schemas.microsoft.com/office/drawing/2015/9/8/chartex" xmlns:cx2="http://schemas.microsoft.com/office/drawing/2015/10/21/chartex" xmlns:cx3="http://schemas.microsoft.com/office/drawing/2016/5/9/chartex" xmlns:cx4="http://schemas.microsoft.com/office/drawing/2016/5/10/chartex" xmlns:cx5="http://schemas.microsoft.com/office/drawing/2016/5/11/chartex" xmlns:cx6="http://schemas.microsoft.com/office/drawing/2016/5/12/chartex" xmlns:cx7="http://schemas.microsoft.com/office/drawing/2016/5/13/chartex" xmlns:cx8="http://schemas.microsoft.com/office/drawing/2016/5/14/chartex" xmlns:mc="http://schemas.openxmlformats.org/markup-compatibility/2006" xmlns:aink="http://schemas.microsoft.com/office/drawing/2016/ink" xmlns:am3d="http://schemas.microsoft.com/office/drawing/2017/model3d" xmlns:o="urn:schemas-microsoft-com:office:office" xmlns:r="http://schemas.openxmlformats.org/officeDocument/2006/relationships" xmlns:m="http://schemas.openxmlformats.org/officeDocument/2006/math" xmlns:v="urn:schemas-microsoft-com:vml" xmlns:wp14="http://schemas.microsoft.com/office/word/2010/wordprocessingDrawing" xmlns:wp="http://schemas.openxmlformats.org/drawingml/2006/wordprocessingDrawing" xmlns:w10="urn:schemas-microsoft-com:office:word" xmlns:w="http://schemas.openxmlformats.org/wordprocessingml/2006/main" xmlns:w14="http://schemas.microsoft.com/office/word/2010/wordml" xmlns:w15="http://schemas.microsoft.com/office/word/2012/wordml" xmlns:w16cex="http://schemas.microsoft.com/office/word/2018/wordml/cex" xmlns:w16cid="http://schemas.microsoft.com/office/word/2016/wordml/cid" xmlns:w16="http://schemas.microsoft.com/office/word/2018/wordml" xmlns:w16sdtdh="http://schemas.microsoft.com/office/word/2020/wordml/sdtdatahash" xmlns:w16se="http://schemas.microsoft.com/office/word/2015/wordml/symex" xmlns:wpg="http://schemas.microsoft.com/office/word/2010/wordprocessingGroup" xmlns:wpi="http://schemas.microsoft.com/office/word/2010/wordprocessingInk" xmlns:wne="http://schemas.microsoft.com/office/word/2006/wordml" xmlns:wps="http://schemas.microsoft.com/office/word/2010/wordprocessingShape" mc:Ignorable="w14 w15 w16se w16cid w16 w16cex w16sdtdh wp14">
   <w:body>
-    <w:p xmlns:wp14="http://schemas.microsoft.com/office/word/2010/wordml" wp14:textId="03AF62E2">
+    <w:p>
       <w:pPr>
         <w:pStyle w:val="Ttulo7"/>
         <w:shd w:val="clear" w:color="auto" w:fill="FFFFFF" w:themeFill="background1"/>
@@ -22,24 +22,24 @@
       <w:r>
         <w:rPr>
           <w:rFonts w:ascii="Times New Roman" w:hAnsi="Times New Roman"/>
-          <w:b w:val="1"/>
-          <w:bCs w:val="1"/>
+          <w:b/>
+          <w:bCs/>
         </w:rPr>
         <w:t>CONCORRÊNCIA</w:t>
       </w:r>
       <w:r>
         <w:rPr>
           <w:rFonts w:ascii="Times New Roman" w:hAnsi="Times New Roman"/>
-          <w:b w:val="1"/>
-          <w:bCs w:val="1"/>
+          <w:b/>
+          <w:bCs/>
         </w:rPr>
         <w:t xml:space="preserve"> Nº </w:t>
       </w:r>
       <w:r>
         <w:rPr>
           <w:rFonts w:ascii="Times New Roman" w:hAnsi="Times New Roman"/>
-          <w:b w:val="1"/>
-          <w:bCs w:val="1"/>
+          <w:b/>
+          <w:bCs/>
         </w:rPr>
         <w:t>00004/2024</w:t>
       </w:r>
@@ -63,18 +63,9 @@
       </w:r>
       <w:r>
         <w:rPr>
-          <w:rFonts w:ascii="Times New Roman" w:hAnsi="Times New Roman" w:eastAsia="Times New Roman" w:cs="Times New Roman"/>
-          <w:b w:val="0"/>
-          <w:bCs w:val="0"/>
-          <w:i w:val="0"/>
-          <w:iCs w:val="0"/>
-          <w:caps w:val="0"/>
-          <w:smallCaps w:val="0"/>
-          <w:noProof w:val="0"/>
-          <w:color w:val="000000" w:themeColor="text1" w:themeTint="FF" w:themeShade="FF"/>
-          <w:sz w:val="24"/>
+          <w:rFonts w:ascii="Times New Roman" w:hAnsi="Times New Roman"/>
+          <w:color w:val="000000" w:themeColor="text1"/>
           <w:szCs w:val="24"/>
-          <w:lang w:val="pt-BR"/>
         </w:rPr>
         <w:t>CL CONSTRUCOES E SERVICOS LTDA</w:t>
       </w:r>
@@ -86,18 +77,9 @@
       </w:r>
       <w:r>
         <w:rPr>
-          <w:rFonts w:ascii="Times New Roman" w:hAnsi="Times New Roman" w:eastAsia="Times New Roman" w:cs="Times New Roman"/>
-          <w:b w:val="0"/>
-          <w:bCs w:val="0"/>
-          <w:i w:val="0"/>
-          <w:iCs w:val="0"/>
-          <w:caps w:val="0"/>
-          <w:smallCaps w:val="0"/>
-          <w:noProof w:val="0"/>
-          <w:color w:val="000000" w:themeColor="text1" w:themeTint="FF" w:themeShade="FF"/>
-          <w:sz w:val="24"/>
+          <w:rFonts w:ascii="Times New Roman" w:hAnsi="Times New Roman"/>
+          <w:color w:val="000000" w:themeColor="text1"/>
           <w:szCs w:val="24"/>
-          <w:lang w:val="pt-BR"/>
         </w:rPr>
         <w:t>09.335.002/0001-06</w:t>
       </w:r>
@@ -109,18 +91,9 @@
       </w:r>
       <w:r>
         <w:rPr>
-          <w:rFonts w:ascii="Times New Roman" w:hAnsi="Times New Roman" w:eastAsia="Times New Roman" w:cs="Times New Roman"/>
-          <w:b w:val="0"/>
-          <w:bCs w:val="0"/>
-          <w:i w:val="0"/>
-          <w:iCs w:val="0"/>
-          <w:caps w:val="0"/>
-          <w:smallCaps w:val="0"/>
-          <w:noProof w:val="0"/>
-          <w:color w:val="000000" w:themeColor="text1" w:themeTint="FF" w:themeShade="FF"/>
-          <w:sz w:val="24"/>
+          <w:rFonts w:ascii="Times New Roman" w:hAnsi="Times New Roman"/>
+          <w:color w:val="000000" w:themeColor="text1"/>
           <w:szCs w:val="24"/>
-          <w:lang w:val="pt-BR"/>
         </w:rPr>
         <w:t>Rua Cel. Joao Severino</w:t>
       </w:r>
@@ -240,47 +213,27 @@
       </w:r>
       <w:r>
         <w:rPr>
-          <w:rFonts w:ascii="Times New Roman" w:hAnsi="Times New Roman" w:eastAsia="Times New Roman" w:cs="Times New Roman"/>
-          <w:color w:val="000000" w:themeColor="text1" w:themeTint="FF" w:themeShade="FF"/>
-          <w:sz w:val="24"/>
+          <w:rFonts w:ascii="Times New Roman" w:hAnsi="Times New Roman"/>
+          <w:color w:val="000000" w:themeColor="text1"/>
           <w:szCs w:val="24"/>
         </w:rPr>
         <w:t>a</w:t>
       </w:r>
       <w:r>
         <w:rPr>
-          <w:rFonts w:ascii="Times New Roman" w:hAnsi="Times New Roman" w:eastAsia="Times New Roman" w:cs="Times New Roman"/>
-          <w:color w:val="000000" w:themeColor="text1" w:themeTint="FF" w:themeShade="FF"/>
-          <w:sz w:val="24"/>
+          <w:rFonts w:ascii="Times New Roman" w:hAnsi="Times New Roman"/>
+          <w:color w:val="000000" w:themeColor="text1"/>
           <w:szCs w:val="24"/>
         </w:rPr>
         <w:t xml:space="preserve"> </w:t>
       </w:r>
       <w:r>
         <w:rPr>
-          <w:rFonts w:ascii="Times New Roman" w:hAnsi="Times New Roman" w:eastAsia="Times New Roman" w:cs="Times New Roman"/>
-          <w:color w:val="000000" w:themeColor="text1" w:themeTint="FF" w:themeShade="FF"/>
-          <w:sz w:val="24"/>
+          <w:rFonts w:ascii="Times New Roman" w:hAnsi="Times New Roman"/>
+          <w:color w:val="000000" w:themeColor="text1"/>
           <w:szCs w:val="24"/>
         </w:rPr>
-        <w:t>C</w:t>
-      </w:r>
-      <w:r>
-        <w:rPr>
-          <w:rFonts w:ascii="Times New Roman" w:hAnsi="Times New Roman" w:eastAsia="Times New Roman" w:cs="Times New Roman"/>
-          <w:b w:val="0"/>
-          <w:bCs w:val="0"/>
-          <w:i w:val="0"/>
-          <w:iCs w:val="0"/>
-          <w:caps w:val="0"/>
-          <w:smallCaps w:val="0"/>
-          <w:noProof w:val="0"/>
-          <w:color w:val="000000" w:themeColor="text1" w:themeTint="FF" w:themeShade="FF"/>
-          <w:sz w:val="24"/>
-          <w:szCs w:val="24"/>
-          <w:lang w:val="pt-BR"/>
-        </w:rPr>
-        <w:t>onstrução de 01 (um) Centro Especializado em Atenção à Saúde Mental para atender às necessidades da Secretaria Municipal de Saúde em Coremas/PB</w:t>
+        <w:t>Construção de 01 (um) Centro Especializado em Atenção à Saúde Mental para atender às necessidades da Secretaria Municipal de Saúde em Coremas/PB</w:t>
       </w:r>
       <w:r>
         <w:rPr>
@@ -289,17 +242,13 @@
         <w:t>.</w:t>
       </w:r>
     </w:p>
-    <w:p xmlns:wp14="http://schemas.microsoft.com/office/word/2010/wordml" wp14:textId="5C5F8CD1">
-      <w:pPr>
-        <w:pStyle w:val="Normal"/>
-      </w:pPr>
-    </w:p>
+    <w:p/>
     <w:tbl>
       <w:tblPr>
         <w:tblW w:w="5436" w:type="pct"/>
         <w:tblInd w:w="96" w:type="dxa"/>
         <w:tblBorders>
-          <w:bottom w:val="single" w:color="006633" w:sz="24" w:space="0"/>
+          <w:bottom w:val="single" w:sz="24" w:space="0" w:color="006633"/>
         </w:tblBorders>
         <w:tblCellMar>
           <w:left w:w="0" w:type="dxa"/>
@@ -311,7 +260,7 @@
         <w:gridCol w:w="3224"/>
         <w:gridCol w:w="6131"/>
       </w:tblGrid>
-      <w:tr xmlns:wp14="http://schemas.microsoft.com/office/word/2010/wordml" wp14:textId="77777777">
+      <w:tr>
         <w:trPr>
           <w:tblHeader/>
         </w:trPr>
@@ -320,10 +269,10 @@
             <w:tcW w:w="5000" w:type="pct"/>
             <w:gridSpan w:val="2"/>
             <w:tcBorders>
-              <w:top w:val="single" w:color="auto" w:sz="4" w:space="0"/>
-              <w:left w:val="single" w:color="auto" w:sz="4" w:space="0"/>
-              <w:bottom w:val="single" w:color="auto" w:sz="4" w:space="0"/>
-              <w:right w:val="single" w:color="auto" w:sz="4" w:space="0"/>
+              <w:top w:val="single" w:sz="4" w:space="0" w:color="auto"/>
+              <w:left w:val="single" w:sz="4" w:space="0" w:color="auto"/>
+              <w:bottom w:val="single" w:sz="4" w:space="0" w:color="auto"/>
+              <w:right w:val="single" w:sz="4" w:space="0" w:color="auto"/>
             </w:tcBorders>
             <w:shd w:val="clear" w:color="auto" w:fill="FFFFFF" w:themeFill="background1"/>
             <w:tcMar>
@@ -335,24 +284,24 @@
             <w:vAlign w:val="center"/>
             <w:hideMark/>
           </w:tcPr>
-          <w:p wp14:textId="69385381">
+          <w:p>
             <w:pPr>
               <w:shd w:val="clear" w:color="auto" w:fill="FFFFFF" w:themeFill="background1"/>
               <w:spacing w:after="0" w:line="240" w:lineRule="auto"/>
               <w:jc w:val="center"/>
               <w:rPr>
                 <w:rFonts w:ascii="Times New Roman" w:hAnsi="Times New Roman" w:cs="Times New Roman"/>
-                <w:b w:val="1"/>
-                <w:bCs w:val="1"/>
-                <w:sz w:val="24"/>
-                <w:szCs w:val="24"/>
-              </w:rPr>
-            </w:pPr>
-            <w:r>
-              <w:rPr>
-                <w:rFonts w:ascii="Times New Roman" w:hAnsi="Times New Roman" w:cs="Times New Roman"/>
-                <w:b w:val="1"/>
-                <w:bCs w:val="1"/>
+                <w:b/>
+                <w:bCs/>
+                <w:sz w:val="24"/>
+                <w:szCs w:val="24"/>
+              </w:rPr>
+            </w:pPr>
+            <w:r>
+              <w:rPr>
+                <w:rFonts w:ascii="Times New Roman" w:hAnsi="Times New Roman" w:cs="Times New Roman"/>
+                <w:b/>
+                <w:bCs/>
                 <w:sz w:val="24"/>
                 <w:szCs w:val="24"/>
               </w:rPr>
@@ -361,8 +310,8 @@
             <w:r>
               <w:rPr>
                 <w:rFonts w:ascii="Times New Roman" w:hAnsi="Times New Roman" w:cs="Times New Roman"/>
-                <w:b w:val="1"/>
-                <w:bCs w:val="1"/>
+                <w:b/>
+                <w:bCs/>
                 <w:sz w:val="24"/>
                 <w:szCs w:val="24"/>
               </w:rPr>
@@ -371,8 +320,8 @@
             <w:r>
               <w:rPr>
                 <w:rFonts w:ascii="Times New Roman" w:hAnsi="Times New Roman" w:cs="Times New Roman"/>
-                <w:b w:val="1"/>
-                <w:bCs w:val="1"/>
+                <w:b/>
+                <w:bCs/>
                 <w:sz w:val="24"/>
                 <w:szCs w:val="24"/>
               </w:rPr>
@@ -381,28 +330,18 @@
             <w:r>
               <w:rPr>
                 <w:rFonts w:ascii="Times New Roman" w:hAnsi="Times New Roman" w:cs="Times New Roman"/>
-                <w:b w:val="1"/>
-                <w:bCs w:val="1"/>
-                <w:sz w:val="24"/>
-                <w:szCs w:val="24"/>
-              </w:rPr>
-              <w:t xml:space="preserve"> </w:t>
-            </w:r>
-            <w:r>
-              <w:rPr>
-                <w:rFonts w:ascii="Times New Roman" w:hAnsi="Times New Roman" w:cs="Times New Roman"/>
-                <w:b w:val="1"/>
-                <w:bCs w:val="1"/>
-                <w:sz w:val="24"/>
-                <w:szCs w:val="24"/>
-              </w:rPr>
-              <w:t>Nº 00</w:t>
-            </w:r>
-            <w:r>
-              <w:rPr>
-                <w:rFonts w:ascii="Times New Roman" w:hAnsi="Times New Roman" w:cs="Times New Roman"/>
-                <w:b w:val="1"/>
-                <w:bCs w:val="1"/>
+                <w:b/>
+                <w:bCs/>
+                <w:sz w:val="24"/>
+                <w:szCs w:val="24"/>
+              </w:rPr>
+              <w:t xml:space="preserve"> Nº 00</w:t>
+            </w:r>
+            <w:r>
+              <w:rPr>
+                <w:rFonts w:ascii="Times New Roman" w:hAnsi="Times New Roman" w:cs="Times New Roman"/>
+                <w:b/>
+                <w:bCs/>
                 <w:sz w:val="24"/>
                 <w:szCs w:val="24"/>
               </w:rPr>
@@ -411,15 +350,15 @@
           </w:p>
         </w:tc>
       </w:tr>
-      <w:tr xmlns:wp14="http://schemas.microsoft.com/office/word/2010/wordml" wp14:textId="77777777">
+      <w:tr>
         <w:tc>
           <w:tcPr>
             <w:tcW w:w="1723" w:type="pct"/>
             <w:tcBorders>
-              <w:top w:val="single" w:color="auto" w:sz="4" w:space="0"/>
-              <w:left w:val="single" w:color="auto" w:sz="4" w:space="0"/>
-              <w:bottom w:val="single" w:color="auto" w:sz="4" w:space="0"/>
-              <w:right w:val="single" w:color="auto" w:sz="4" w:space="0"/>
+              <w:top w:val="single" w:sz="4" w:space="0" w:color="auto"/>
+              <w:left w:val="single" w:sz="4" w:space="0" w:color="auto"/>
+              <w:bottom w:val="single" w:sz="4" w:space="0" w:color="auto"/>
+              <w:right w:val="single" w:sz="4" w:space="0" w:color="auto"/>
             </w:tcBorders>
             <w:shd w:val="clear" w:color="auto" w:fill="F2F2F2" w:themeFill="background1" w:themeFillShade="F2"/>
             <w:noWrap/>
@@ -431,7 +370,7 @@
             </w:tcMar>
             <w:vAlign w:val="center"/>
           </w:tcPr>
-          <w:p wp14:textId="77777777">
+          <w:p>
             <w:pPr>
               <w:spacing w:after="0" w:line="240" w:lineRule="auto"/>
               <w:rPr>
@@ -454,10 +393,10 @@
           <w:tcPr>
             <w:tcW w:w="3277" w:type="pct"/>
             <w:tcBorders>
-              <w:top w:val="single" w:color="auto" w:sz="4" w:space="0"/>
-              <w:left w:val="single" w:color="auto" w:sz="4" w:space="0"/>
-              <w:bottom w:val="single" w:color="auto" w:sz="4" w:space="0"/>
-              <w:right w:val="single" w:color="auto" w:sz="4" w:space="0"/>
+              <w:top w:val="single" w:sz="4" w:space="0" w:color="auto"/>
+              <w:left w:val="single" w:sz="4" w:space="0" w:color="auto"/>
+              <w:bottom w:val="single" w:sz="4" w:space="0" w:color="auto"/>
+              <w:right w:val="single" w:sz="4" w:space="0" w:color="auto"/>
             </w:tcBorders>
             <w:shd w:val="clear" w:color="auto" w:fill="F2F2F2" w:themeFill="background1" w:themeFillShade="F2"/>
             <w:tcMar>
@@ -468,48 +407,38 @@
             </w:tcMar>
             <w:vAlign w:val="center"/>
           </w:tcPr>
-          <w:p wp14:textId="23B5DDF9">
+          <w:p>
             <w:pPr>
               <w:spacing w:after="0" w:line="240" w:lineRule="auto"/>
               <w:jc w:val="both"/>
               <w:rPr>
-                <w:rFonts w:ascii="Times New Roman" w:hAnsi="Times New Roman" w:eastAsia="Times New Roman" w:cs="Times New Roman"/>
-                <w:noProof w:val="0"/>
-                <w:color w:val="000000" w:themeColor="text1" w:themeTint="FF" w:themeShade="FF"/>
-                <w:sz w:val="24"/>
-                <w:szCs w:val="24"/>
-                <w:lang w:val="pt-BR"/>
-              </w:rPr>
-            </w:pPr>
-            <w:r>
-              <w:rPr>
-                <w:rFonts w:ascii="Times New Roman" w:hAnsi="Times New Roman" w:eastAsia="Times New Roman" w:cs="Times New Roman"/>
-                <w:b w:val="0"/>
-                <w:bCs w:val="0"/>
-                <w:i w:val="0"/>
-                <w:iCs w:val="0"/>
-                <w:caps w:val="0"/>
-                <w:smallCaps w:val="0"/>
-                <w:noProof w:val="0"/>
-                <w:color w:val="000000" w:themeColor="text1" w:themeTint="FF" w:themeShade="FF"/>
-                <w:sz w:val="24"/>
-                <w:szCs w:val="24"/>
-                <w:lang w:val="pt-BR"/>
+                <w:rFonts w:ascii="Times New Roman" w:eastAsia="Times New Roman" w:hAnsi="Times New Roman" w:cs="Times New Roman"/>
+                <w:color w:val="000000" w:themeColor="text1"/>
+                <w:sz w:val="24"/>
+                <w:szCs w:val="24"/>
+              </w:rPr>
+            </w:pPr>
+            <w:r>
+              <w:rPr>
+                <w:rFonts w:ascii="Times New Roman" w:eastAsia="Times New Roman" w:hAnsi="Times New Roman" w:cs="Times New Roman"/>
+                <w:color w:val="000000" w:themeColor="text1"/>
+                <w:sz w:val="24"/>
+                <w:szCs w:val="24"/>
               </w:rPr>
               <w:t>Transferência da União Referente à Compensação Financeira de Recursos Minerais</w:t>
             </w:r>
           </w:p>
         </w:tc>
       </w:tr>
-      <w:tr xmlns:wp14="http://schemas.microsoft.com/office/word/2010/wordml" wp14:textId="77777777">
+      <w:tr>
         <w:tc>
           <w:tcPr>
             <w:tcW w:w="1723" w:type="pct"/>
             <w:tcBorders>
-              <w:top w:val="single" w:color="auto" w:sz="4" w:space="0"/>
-              <w:left w:val="single" w:color="auto" w:sz="4" w:space="0"/>
-              <w:bottom w:val="single" w:color="auto" w:sz="4" w:space="0"/>
-              <w:right w:val="single" w:color="auto" w:sz="4" w:space="0"/>
+              <w:top w:val="single" w:sz="4" w:space="0" w:color="auto"/>
+              <w:left w:val="single" w:sz="4" w:space="0" w:color="auto"/>
+              <w:bottom w:val="single" w:sz="4" w:space="0" w:color="auto"/>
+              <w:right w:val="single" w:sz="4" w:space="0" w:color="auto"/>
             </w:tcBorders>
             <w:noWrap/>
             <w:tcMar>
@@ -521,7 +450,7 @@
             <w:vAlign w:val="center"/>
             <w:hideMark/>
           </w:tcPr>
-          <w:p wp14:textId="77777777">
+          <w:p>
             <w:pPr>
               <w:spacing w:after="0" w:line="240" w:lineRule="auto"/>
               <w:rPr>
@@ -561,10 +490,10 @@
           <w:tcPr>
             <w:tcW w:w="3277" w:type="pct"/>
             <w:tcBorders>
-              <w:top w:val="single" w:color="auto" w:sz="4" w:space="0"/>
-              <w:left w:val="single" w:color="auto" w:sz="4" w:space="0"/>
-              <w:bottom w:val="single" w:color="auto" w:sz="4" w:space="0"/>
-              <w:right w:val="single" w:color="auto" w:sz="4" w:space="0"/>
+              <w:top w:val="single" w:sz="4" w:space="0" w:color="auto"/>
+              <w:left w:val="single" w:sz="4" w:space="0" w:color="auto"/>
+              <w:bottom w:val="single" w:sz="4" w:space="0" w:color="auto"/>
+              <w:right w:val="single" w:sz="4" w:space="0" w:color="auto"/>
             </w:tcBorders>
             <w:tcMar>
               <w:top w:w="24" w:type="dxa"/>
@@ -575,47 +504,37 @@
             <w:vAlign w:val="center"/>
             <w:hideMark/>
           </w:tcPr>
-          <w:p wp14:textId="5A205AC9">
+          <w:p>
             <w:pPr>
               <w:spacing w:after="0" w:line="360" w:lineRule="auto"/>
               <w:rPr>
-                <w:rFonts w:ascii="Times New Roman" w:hAnsi="Times New Roman" w:eastAsia="Times New Roman" w:cs="Times New Roman"/>
-                <w:noProof w:val="0"/>
-                <w:color w:val="000000" w:themeColor="text1" w:themeTint="FF" w:themeShade="FF"/>
-                <w:sz w:val="24"/>
-                <w:szCs w:val="24"/>
-                <w:lang w:val="pt-BR"/>
-              </w:rPr>
-            </w:pPr>
-            <w:r>
-              <w:rPr>
-                <w:rFonts w:ascii="Times New Roman" w:hAnsi="Times New Roman" w:eastAsia="Times New Roman" w:cs="Times New Roman"/>
-                <w:b w:val="0"/>
-                <w:bCs w:val="0"/>
-                <w:i w:val="0"/>
-                <w:iCs w:val="0"/>
-                <w:caps w:val="0"/>
-                <w:smallCaps w:val="0"/>
-                <w:noProof w:val="0"/>
-                <w:color w:val="000000" w:themeColor="text1" w:themeTint="FF" w:themeShade="FF"/>
-                <w:sz w:val="24"/>
-                <w:szCs w:val="24"/>
-                <w:lang w:val="pt-BR"/>
+                <w:rFonts w:ascii="Times New Roman" w:eastAsia="Times New Roman" w:hAnsi="Times New Roman" w:cs="Times New Roman"/>
+                <w:color w:val="000000" w:themeColor="text1"/>
+                <w:sz w:val="24"/>
+                <w:szCs w:val="24"/>
+              </w:rPr>
+            </w:pPr>
+            <w:r>
+              <w:rPr>
+                <w:rFonts w:ascii="Times New Roman" w:eastAsia="Times New Roman" w:hAnsi="Times New Roman" w:cs="Times New Roman"/>
+                <w:color w:val="000000" w:themeColor="text1"/>
+                <w:sz w:val="24"/>
+                <w:szCs w:val="24"/>
               </w:rPr>
               <w:t>20/09/2024</w:t>
             </w:r>
           </w:p>
         </w:tc>
       </w:tr>
-      <w:tr xmlns:wp14="http://schemas.microsoft.com/office/word/2010/wordml" wp14:textId="77777777">
+      <w:tr>
         <w:tc>
           <w:tcPr>
             <w:tcW w:w="1723" w:type="pct"/>
             <w:tcBorders>
-              <w:top w:val="single" w:color="auto" w:sz="4" w:space="0"/>
-              <w:left w:val="single" w:color="auto" w:sz="4" w:space="0"/>
-              <w:bottom w:val="single" w:color="auto" w:sz="4" w:space="0"/>
-              <w:right w:val="single" w:color="auto" w:sz="4" w:space="0"/>
+              <w:top w:val="single" w:sz="4" w:space="0" w:color="auto"/>
+              <w:left w:val="single" w:sz="4" w:space="0" w:color="auto"/>
+              <w:bottom w:val="single" w:sz="4" w:space="0" w:color="auto"/>
+              <w:right w:val="single" w:sz="4" w:space="0" w:color="auto"/>
             </w:tcBorders>
             <w:shd w:val="clear" w:color="auto" w:fill="EFEFF1"/>
             <w:noWrap/>
@@ -628,7 +547,7 @@
             <w:vAlign w:val="center"/>
             <w:hideMark/>
           </w:tcPr>
-          <w:p wp14:textId="77777777">
+          <w:p>
             <w:pPr>
               <w:spacing w:after="0" w:line="240" w:lineRule="auto"/>
               <w:rPr>
@@ -675,10 +594,10 @@
           <w:tcPr>
             <w:tcW w:w="3277" w:type="pct"/>
             <w:tcBorders>
-              <w:top w:val="single" w:color="auto" w:sz="4" w:space="0"/>
-              <w:left w:val="single" w:color="auto" w:sz="4" w:space="0"/>
-              <w:bottom w:val="single" w:color="auto" w:sz="4" w:space="0"/>
-              <w:right w:val="single" w:color="auto" w:sz="4" w:space="0"/>
+              <w:top w:val="single" w:sz="4" w:space="0" w:color="auto"/>
+              <w:left w:val="single" w:sz="4" w:space="0" w:color="auto"/>
+              <w:bottom w:val="single" w:sz="4" w:space="0" w:color="auto"/>
+              <w:right w:val="single" w:sz="4" w:space="0" w:color="auto"/>
             </w:tcBorders>
             <w:shd w:val="clear" w:color="auto" w:fill="EFEFF1"/>
             <w:tcMar>
@@ -690,47 +609,37 @@
             <w:vAlign w:val="center"/>
             <w:hideMark/>
           </w:tcPr>
-          <w:p wp14:textId="663B97DD">
+          <w:p>
             <w:pPr>
               <w:spacing w:after="0" w:line="360" w:lineRule="auto"/>
               <w:rPr>
-                <w:rFonts w:ascii="Times New Roman" w:hAnsi="Times New Roman" w:eastAsia="Times New Roman" w:cs="Times New Roman"/>
-                <w:noProof w:val="0"/>
-                <w:color w:val="000000" w:themeColor="text1" w:themeTint="FF" w:themeShade="FF"/>
-                <w:sz w:val="24"/>
-                <w:szCs w:val="24"/>
-                <w:lang w:val="pt-BR"/>
-              </w:rPr>
-            </w:pPr>
-            <w:r>
-              <w:rPr>
-                <w:rFonts w:ascii="Times New Roman" w:hAnsi="Times New Roman" w:eastAsia="Times New Roman" w:cs="Times New Roman"/>
-                <w:b w:val="0"/>
-                <w:bCs w:val="0"/>
-                <w:i w:val="0"/>
-                <w:iCs w:val="0"/>
-                <w:caps w:val="0"/>
-                <w:smallCaps w:val="0"/>
-                <w:noProof w:val="0"/>
-                <w:color w:val="000000" w:themeColor="text1" w:themeTint="FF" w:themeShade="FF"/>
-                <w:sz w:val="24"/>
-                <w:szCs w:val="24"/>
-                <w:lang w:val="pt-BR"/>
+                <w:rFonts w:ascii="Times New Roman" w:eastAsia="Times New Roman" w:hAnsi="Times New Roman" w:cs="Times New Roman"/>
+                <w:color w:val="000000" w:themeColor="text1"/>
+                <w:sz w:val="24"/>
+                <w:szCs w:val="24"/>
+              </w:rPr>
+            </w:pPr>
+            <w:r>
+              <w:rPr>
+                <w:rFonts w:ascii="Times New Roman" w:eastAsia="Times New Roman" w:hAnsi="Times New Roman" w:cs="Times New Roman"/>
+                <w:color w:val="000000" w:themeColor="text1"/>
+                <w:sz w:val="24"/>
+                <w:szCs w:val="24"/>
               </w:rPr>
               <w:t>1.150.000,00</w:t>
             </w:r>
           </w:p>
         </w:tc>
       </w:tr>
-      <w:tr xmlns:wp14="http://schemas.microsoft.com/office/word/2010/wordml" wp14:textId="77777777">
+      <w:tr>
         <w:tc>
           <w:tcPr>
             <w:tcW w:w="1723" w:type="pct"/>
             <w:tcBorders>
-              <w:top w:val="single" w:color="auto" w:sz="4" w:space="0"/>
-              <w:left w:val="single" w:color="auto" w:sz="4" w:space="0"/>
-              <w:bottom w:val="single" w:color="auto" w:sz="4" w:space="0"/>
-              <w:right w:val="single" w:color="auto" w:sz="4" w:space="0"/>
+              <w:top w:val="single" w:sz="4" w:space="0" w:color="auto"/>
+              <w:left w:val="single" w:sz="4" w:space="0" w:color="auto"/>
+              <w:bottom w:val="single" w:sz="4" w:space="0" w:color="auto"/>
+              <w:right w:val="single" w:sz="4" w:space="0" w:color="auto"/>
             </w:tcBorders>
             <w:noWrap/>
             <w:tcMar>
@@ -742,7 +651,7 @@
             <w:vAlign w:val="center"/>
             <w:hideMark/>
           </w:tcPr>
-          <w:p wp14:textId="77777777">
+          <w:p>
             <w:pPr>
               <w:spacing w:after="0" w:line="240" w:lineRule="auto"/>
               <w:rPr>
@@ -790,10 +699,10 @@
           <w:tcPr>
             <w:tcW w:w="3277" w:type="pct"/>
             <w:tcBorders>
-              <w:top w:val="single" w:color="auto" w:sz="4" w:space="0"/>
-              <w:left w:val="single" w:color="auto" w:sz="4" w:space="0"/>
-              <w:bottom w:val="single" w:color="auto" w:sz="4" w:space="0"/>
-              <w:right w:val="single" w:color="auto" w:sz="4" w:space="0"/>
+              <w:top w:val="single" w:sz="4" w:space="0" w:color="auto"/>
+              <w:left w:val="single" w:sz="4" w:space="0" w:color="auto"/>
+              <w:bottom w:val="single" w:sz="4" w:space="0" w:color="auto"/>
+              <w:right w:val="single" w:sz="4" w:space="0" w:color="auto"/>
             </w:tcBorders>
             <w:tcMar>
               <w:top w:w="24" w:type="dxa"/>
@@ -804,32 +713,30 @@
             <w:vAlign w:val="center"/>
             <w:hideMark/>
           </w:tcPr>
-          <w:p wp14:textId="67F966B2">
+          <w:p>
             <w:pPr>
               <w:spacing w:after="0" w:line="360" w:lineRule="auto"/>
             </w:pPr>
             <w:r>
               <w:rPr>
-                <w:rFonts w:ascii="Times New Roman" w:hAnsi="Times New Roman" w:eastAsia="Times New Roman" w:cs="Times New Roman"/>
-                <w:noProof w:val="0"/>
-                <w:sz w:val="24"/>
-                <w:szCs w:val="24"/>
-                <w:lang w:val="pt-BR"/>
+                <w:rFonts w:ascii="Times New Roman" w:eastAsia="Times New Roman" w:hAnsi="Times New Roman" w:cs="Times New Roman"/>
+                <w:sz w:val="24"/>
+                <w:szCs w:val="24"/>
               </w:rPr>
               <w:t>00000328/2024</w:t>
             </w:r>
           </w:p>
         </w:tc>
       </w:tr>
-      <w:tr xmlns:wp14="http://schemas.microsoft.com/office/word/2010/wordml" wp14:textId="77777777">
+      <w:tr>
         <w:tc>
           <w:tcPr>
             <w:tcW w:w="1723" w:type="pct"/>
             <w:tcBorders>
-              <w:top w:val="single" w:color="auto" w:sz="4" w:space="0"/>
-              <w:left w:val="single" w:color="auto" w:sz="4" w:space="0"/>
-              <w:bottom w:val="single" w:color="auto" w:sz="4" w:space="0"/>
-              <w:right w:val="single" w:color="auto" w:sz="4" w:space="0"/>
+              <w:top w:val="single" w:sz="4" w:space="0" w:color="auto"/>
+              <w:left w:val="single" w:sz="4" w:space="0" w:color="auto"/>
+              <w:bottom w:val="single" w:sz="4" w:space="0" w:color="auto"/>
+              <w:right w:val="single" w:sz="4" w:space="0" w:color="auto"/>
             </w:tcBorders>
             <w:shd w:val="clear" w:color="auto" w:fill="EFEFF1"/>
             <w:noWrap/>
@@ -842,7 +749,7 @@
             <w:vAlign w:val="center"/>
             <w:hideMark/>
           </w:tcPr>
-          <w:p wp14:textId="77777777">
+          <w:p>
             <w:pPr>
               <w:spacing w:after="0" w:line="240" w:lineRule="auto"/>
               <w:rPr>
@@ -889,10 +796,10 @@
           <w:tcPr>
             <w:tcW w:w="3277" w:type="pct"/>
             <w:tcBorders>
-              <w:top w:val="single" w:color="auto" w:sz="4" w:space="0"/>
-              <w:left w:val="single" w:color="auto" w:sz="4" w:space="0"/>
-              <w:bottom w:val="single" w:color="auto" w:sz="4" w:space="0"/>
-              <w:right w:val="single" w:color="auto" w:sz="4" w:space="0"/>
+              <w:top w:val="single" w:sz="4" w:space="0" w:color="auto"/>
+              <w:left w:val="single" w:sz="4" w:space="0" w:color="auto"/>
+              <w:bottom w:val="single" w:sz="4" w:space="0" w:color="auto"/>
+              <w:right w:val="single" w:sz="4" w:space="0" w:color="auto"/>
             </w:tcBorders>
             <w:shd w:val="clear" w:color="auto" w:fill="EFEFF1"/>
             <w:tcMar>
@@ -904,32 +811,30 @@
             <w:vAlign w:val="center"/>
             <w:hideMark/>
           </w:tcPr>
-          <w:p wp14:textId="4F8ED249">
+          <w:p>
             <w:pPr>
               <w:spacing w:after="0" w:line="360" w:lineRule="auto"/>
             </w:pPr>
             <w:r>
               <w:rPr>
-                <w:rFonts w:ascii="Times New Roman" w:hAnsi="Times New Roman" w:eastAsia="Times New Roman" w:cs="Times New Roman"/>
-                <w:noProof w:val="0"/>
-                <w:sz w:val="24"/>
-                <w:szCs w:val="24"/>
-                <w:lang w:val="pt-BR"/>
+                <w:rFonts w:ascii="Times New Roman" w:eastAsia="Times New Roman" w:hAnsi="Times New Roman" w:cs="Times New Roman"/>
+                <w:sz w:val="24"/>
+                <w:szCs w:val="24"/>
               </w:rPr>
               <w:t>15/10/2024</w:t>
             </w:r>
           </w:p>
         </w:tc>
       </w:tr>
-      <w:tr xmlns:wp14="http://schemas.microsoft.com/office/word/2010/wordml" wp14:textId="77777777">
+      <w:tr>
         <w:tc>
           <w:tcPr>
             <w:tcW w:w="1723" w:type="pct"/>
             <w:tcBorders>
-              <w:top w:val="single" w:color="auto" w:sz="4" w:space="0"/>
-              <w:left w:val="single" w:color="auto" w:sz="4" w:space="0"/>
-              <w:bottom w:val="single" w:color="auto" w:sz="4" w:space="0"/>
-              <w:right w:val="single" w:color="auto" w:sz="4" w:space="0"/>
+              <w:top w:val="single" w:sz="4" w:space="0" w:color="auto"/>
+              <w:left w:val="single" w:sz="4" w:space="0" w:color="auto"/>
+              <w:bottom w:val="single" w:sz="4" w:space="0" w:color="auto"/>
+              <w:right w:val="single" w:sz="4" w:space="0" w:color="auto"/>
             </w:tcBorders>
             <w:noWrap/>
             <w:tcMar>
@@ -941,7 +846,7 @@
             <w:vAlign w:val="center"/>
             <w:hideMark/>
           </w:tcPr>
-          <w:p wp14:textId="77777777">
+          <w:p>
             <w:pPr>
               <w:spacing w:after="0" w:line="240" w:lineRule="auto"/>
               <w:rPr>
@@ -972,10 +877,10 @@
           <w:tcPr>
             <w:tcW w:w="3277" w:type="pct"/>
             <w:tcBorders>
-              <w:top w:val="single" w:color="auto" w:sz="4" w:space="0"/>
-              <w:left w:val="single" w:color="auto" w:sz="4" w:space="0"/>
-              <w:bottom w:val="single" w:color="auto" w:sz="4" w:space="0"/>
-              <w:right w:val="single" w:color="auto" w:sz="4" w:space="0"/>
+              <w:top w:val="single" w:sz="4" w:space="0" w:color="auto"/>
+              <w:left w:val="single" w:sz="4" w:space="0" w:color="auto"/>
+              <w:bottom w:val="single" w:sz="4" w:space="0" w:color="auto"/>
+              <w:right w:val="single" w:sz="4" w:space="0" w:color="auto"/>
             </w:tcBorders>
             <w:tcMar>
               <w:top w:w="24" w:type="dxa"/>
@@ -986,32 +891,30 @@
             <w:vAlign w:val="center"/>
             <w:hideMark/>
           </w:tcPr>
-          <w:p wp14:textId="61D0D46B">
+          <w:p>
             <w:pPr>
               <w:spacing w:after="0" w:line="360" w:lineRule="auto"/>
             </w:pPr>
             <w:r>
               <w:rPr>
-                <w:rFonts w:ascii="Times New Roman" w:hAnsi="Times New Roman" w:eastAsia="Times New Roman" w:cs="Times New Roman"/>
-                <w:noProof w:val="0"/>
-                <w:sz w:val="24"/>
-                <w:szCs w:val="24"/>
-                <w:lang w:val="pt-BR"/>
+                <w:rFonts w:ascii="Times New Roman" w:eastAsia="Times New Roman" w:hAnsi="Times New Roman" w:cs="Times New Roman"/>
+                <w:sz w:val="24"/>
+                <w:szCs w:val="24"/>
               </w:rPr>
               <w:t>1.150.000,00</w:t>
             </w:r>
           </w:p>
         </w:tc>
       </w:tr>
-      <w:tr xmlns:wp14="http://schemas.microsoft.com/office/word/2010/wordml" wp14:textId="77777777">
+      <w:tr>
         <w:tc>
           <w:tcPr>
             <w:tcW w:w="1723" w:type="pct"/>
             <w:tcBorders>
-              <w:top w:val="single" w:color="auto" w:sz="4" w:space="0"/>
-              <w:left w:val="single" w:color="auto" w:sz="4" w:space="0"/>
-              <w:bottom w:val="single" w:color="auto" w:sz="4" w:space="0"/>
-              <w:right w:val="single" w:color="auto" w:sz="4" w:space="0"/>
+              <w:top w:val="single" w:sz="4" w:space="0" w:color="auto"/>
+              <w:left w:val="single" w:sz="4" w:space="0" w:color="auto"/>
+              <w:bottom w:val="single" w:sz="4" w:space="0" w:color="auto"/>
+              <w:right w:val="single" w:sz="4" w:space="0" w:color="auto"/>
             </w:tcBorders>
             <w:shd w:val="clear" w:color="auto" w:fill="EFEFF1"/>
             <w:noWrap/>
@@ -1024,7 +927,7 @@
             <w:vAlign w:val="center"/>
             <w:hideMark/>
           </w:tcPr>
-          <w:p wp14:textId="77777777">
+          <w:p>
             <w:pPr>
               <w:spacing w:after="0" w:line="240" w:lineRule="auto"/>
               <w:rPr>
@@ -1055,10 +958,10 @@
           <w:tcPr>
             <w:tcW w:w="3277" w:type="pct"/>
             <w:tcBorders>
-              <w:top w:val="single" w:color="auto" w:sz="4" w:space="0"/>
-              <w:left w:val="single" w:color="auto" w:sz="4" w:space="0"/>
-              <w:bottom w:val="single" w:color="auto" w:sz="4" w:space="0"/>
-              <w:right w:val="single" w:color="auto" w:sz="4" w:space="0"/>
+              <w:top w:val="single" w:sz="4" w:space="0" w:color="auto"/>
+              <w:left w:val="single" w:sz="4" w:space="0" w:color="auto"/>
+              <w:bottom w:val="single" w:sz="4" w:space="0" w:color="auto"/>
+              <w:right w:val="single" w:sz="4" w:space="0" w:color="auto"/>
             </w:tcBorders>
             <w:shd w:val="clear" w:color="auto" w:fill="EFEFF1"/>
             <w:tcMar>
@@ -1070,32 +973,30 @@
             <w:vAlign w:val="center"/>
             <w:hideMark/>
           </w:tcPr>
-          <w:p wp14:textId="21A43CD4">
+          <w:p>
             <w:pPr>
               <w:spacing w:after="0" w:line="360" w:lineRule="auto"/>
             </w:pPr>
             <w:r>
               <w:rPr>
-                <w:rFonts w:ascii="Times New Roman" w:hAnsi="Times New Roman" w:eastAsia="Times New Roman" w:cs="Times New Roman"/>
-                <w:noProof w:val="0"/>
-                <w:sz w:val="24"/>
-                <w:szCs w:val="24"/>
-                <w:lang w:val="pt-BR"/>
+                <w:rFonts w:ascii="Times New Roman" w:eastAsia="Times New Roman" w:hAnsi="Times New Roman" w:cs="Times New Roman"/>
+                <w:sz w:val="24"/>
+                <w:szCs w:val="24"/>
               </w:rPr>
               <w:t>15/10/2024</w:t>
             </w:r>
           </w:p>
         </w:tc>
       </w:tr>
-      <w:tr xmlns:wp14="http://schemas.microsoft.com/office/word/2010/wordml" wp14:textId="77777777">
+      <w:tr>
         <w:tc>
           <w:tcPr>
             <w:tcW w:w="1723" w:type="pct"/>
             <w:tcBorders>
-              <w:top w:val="single" w:color="auto" w:sz="4" w:space="0"/>
-              <w:left w:val="single" w:color="auto" w:sz="4" w:space="0"/>
-              <w:bottom w:val="single" w:color="auto" w:sz="4" w:space="0"/>
-              <w:right w:val="single" w:color="auto" w:sz="4" w:space="0"/>
+              <w:top w:val="single" w:sz="4" w:space="0" w:color="auto"/>
+              <w:left w:val="single" w:sz="4" w:space="0" w:color="auto"/>
+              <w:bottom w:val="single" w:sz="4" w:space="0" w:color="auto"/>
+              <w:right w:val="single" w:sz="4" w:space="0" w:color="auto"/>
             </w:tcBorders>
             <w:noWrap/>
             <w:tcMar>
@@ -1107,7 +1008,7 @@
             <w:vAlign w:val="center"/>
             <w:hideMark/>
           </w:tcPr>
-          <w:p wp14:textId="77777777">
+          <w:p>
             <w:pPr>
               <w:spacing w:after="0" w:line="240" w:lineRule="auto"/>
               <w:rPr>
@@ -1130,10 +1031,10 @@
           <w:tcPr>
             <w:tcW w:w="3277" w:type="pct"/>
             <w:tcBorders>
-              <w:top w:val="single" w:color="auto" w:sz="4" w:space="0"/>
-              <w:left w:val="single" w:color="auto" w:sz="4" w:space="0"/>
-              <w:bottom w:val="single" w:color="auto" w:sz="4" w:space="0"/>
-              <w:right w:val="single" w:color="auto" w:sz="4" w:space="0"/>
+              <w:top w:val="single" w:sz="4" w:space="0" w:color="auto"/>
+              <w:left w:val="single" w:sz="4" w:space="0" w:color="auto"/>
+              <w:bottom w:val="single" w:sz="4" w:space="0" w:color="auto"/>
+              <w:right w:val="single" w:sz="4" w:space="0" w:color="auto"/>
             </w:tcBorders>
             <w:tcMar>
               <w:top w:w="24" w:type="dxa"/>
@@ -1144,32 +1045,30 @@
             <w:vAlign w:val="center"/>
             <w:hideMark/>
           </w:tcPr>
-          <w:p wp14:textId="00D6ABCC">
+          <w:p>
             <w:pPr>
               <w:spacing w:after="0" w:line="360" w:lineRule="auto"/>
             </w:pPr>
             <w:r>
               <w:rPr>
-                <w:rFonts w:ascii="Times New Roman" w:hAnsi="Times New Roman" w:eastAsia="Times New Roman" w:cs="Times New Roman"/>
-                <w:noProof w:val="0"/>
-                <w:sz w:val="24"/>
-                <w:szCs w:val="24"/>
-                <w:lang w:val="pt-BR"/>
+                <w:rFonts w:ascii="Times New Roman" w:eastAsia="Times New Roman" w:hAnsi="Times New Roman" w:cs="Times New Roman"/>
+                <w:sz w:val="24"/>
+                <w:szCs w:val="24"/>
               </w:rPr>
               <w:t>14/10/2025</w:t>
             </w:r>
           </w:p>
         </w:tc>
       </w:tr>
-      <w:tr xmlns:wp14="http://schemas.microsoft.com/office/word/2010/wordml" wp14:textId="77777777">
+      <w:tr>
         <w:tc>
           <w:tcPr>
             <w:tcW w:w="1723" w:type="pct"/>
             <w:tcBorders>
-              <w:top w:val="single" w:color="auto" w:sz="4" w:space="0"/>
-              <w:left w:val="single" w:color="auto" w:sz="4" w:space="0"/>
-              <w:bottom w:val="single" w:color="auto" w:sz="4" w:space="0"/>
-              <w:right w:val="single" w:color="auto" w:sz="4" w:space="0"/>
+              <w:top w:val="single" w:sz="4" w:space="0" w:color="auto"/>
+              <w:left w:val="single" w:sz="4" w:space="0" w:color="auto"/>
+              <w:bottom w:val="single" w:sz="4" w:space="0" w:color="auto"/>
+              <w:right w:val="single" w:sz="4" w:space="0" w:color="auto"/>
             </w:tcBorders>
             <w:shd w:val="clear" w:color="auto" w:fill="EFEFF1"/>
             <w:noWrap/>
@@ -1182,7 +1081,7 @@
             <w:vAlign w:val="center"/>
             <w:hideMark/>
           </w:tcPr>
-          <w:p wp14:textId="77777777">
+          <w:p>
             <w:pPr>
               <w:spacing w:after="0" w:line="240" w:lineRule="auto"/>
               <w:rPr>
@@ -1205,10 +1104,10 @@
           <w:tcPr>
             <w:tcW w:w="3277" w:type="pct"/>
             <w:tcBorders>
-              <w:top w:val="single" w:color="auto" w:sz="4" w:space="0"/>
-              <w:left w:val="single" w:color="auto" w:sz="4" w:space="0"/>
-              <w:bottom w:val="single" w:color="auto" w:sz="4" w:space="0"/>
-              <w:right w:val="single" w:color="auto" w:sz="4" w:space="0"/>
+              <w:top w:val="single" w:sz="4" w:space="0" w:color="auto"/>
+              <w:left w:val="single" w:sz="4" w:space="0" w:color="auto"/>
+              <w:bottom w:val="single" w:sz="4" w:space="0" w:color="auto"/>
+              <w:right w:val="single" w:sz="4" w:space="0" w:color="auto"/>
             </w:tcBorders>
             <w:shd w:val="clear" w:color="auto" w:fill="EFEFF1"/>
             <w:tcMar>
@@ -1220,7 +1119,7 @@
             <w:vAlign w:val="center"/>
             <w:hideMark/>
           </w:tcPr>
-          <w:p wp14:textId="77777777" wp14:noSpellErr="1">
+          <w:p>
             <w:pPr>
               <w:spacing w:after="0" w:line="360" w:lineRule="auto"/>
               <w:jc w:val="both"/>
@@ -1239,7 +1138,7 @@
               <w:t>Aditivo de valor:</w:t>
             </w:r>
           </w:p>
-          <w:p wp14:textId="2DC2F8C1">
+          <w:p>
             <w:pPr>
               <w:spacing w:after="0" w:line="360" w:lineRule="auto"/>
               <w:jc w:val="both"/>
@@ -1251,21 +1150,10 @@
             </w:pPr>
             <w:r>
               <w:rPr>
-                <w:rFonts w:ascii="Times New Roman" w:hAnsi="Times New Roman" w:eastAsia="Times New Roman" w:cs="Times New Roman"/>
-                <w:b w:val="0"/>
-                <w:bCs w:val="0"/>
-                <w:i w:val="0"/>
-                <w:iCs w:val="0"/>
-                <w:caps w:val="0"/>
-                <w:smallCaps w:val="0"/>
-                <w:strike w:val="0"/>
-                <w:dstrike w:val="0"/>
-                <w:noProof w:val="0"/>
-                <w:color w:val="000000" w:themeColor="text1" w:themeTint="FF" w:themeShade="FF"/>
-                <w:sz w:val="24"/>
-                <w:szCs w:val="24"/>
-                <w:u w:val="none"/>
-                <w:lang w:val="pt-BR"/>
+                <w:rFonts w:ascii="Times New Roman" w:eastAsia="Times New Roman" w:hAnsi="Times New Roman" w:cs="Times New Roman"/>
+                <w:color w:val="000000" w:themeColor="text1"/>
+                <w:sz w:val="24"/>
+                <w:szCs w:val="24"/>
               </w:rPr>
               <w:t>Acréscimo de valor</w:t>
             </w:r>
@@ -1326,7 +1214,7 @@
               <w:t>.</w:t>
             </w:r>
           </w:p>
-          <w:p wp14:textId="36165FD1">
+          <w:p>
             <w:pPr>
               <w:spacing w:after="0" w:line="360" w:lineRule="auto"/>
               <w:jc w:val="both"/>
@@ -1369,7 +1257,7 @@
               <w:t>.328.749,99</w:t>
             </w:r>
           </w:p>
-          <w:p wp14:textId="77777777">
+          <w:p>
             <w:pPr>
               <w:spacing w:after="0" w:line="360" w:lineRule="auto"/>
               <w:rPr>
@@ -1386,13 +1274,13 @@
       </w:tr>
     </w:tbl>
     <w:p/>
-    <w:p xmlns:wp14="http://schemas.microsoft.com/office/word/2010/wordml" wp14:textId="77777777">
+    <w:p>
       <w:pPr>
         <w:shd w:val="clear" w:color="auto" w:fill="FFFFFF" w:themeFill="background1"/>
         <w:rPr>
           <w:rFonts w:ascii="Times New Roman" w:hAnsi="Times New Roman" w:cs="Times New Roman"/>
-          <w:b w:val="1"/>
-          <w:bCs w:val="1"/>
+          <w:b/>
+          <w:bCs/>
           <w:sz w:val="24"/>
           <w:szCs w:val="24"/>
         </w:rPr>
@@ -1403,8 +1291,8 @@
         <w:shd w:val="clear" w:color="auto" w:fill="FFFFFF" w:themeFill="background1"/>
         <w:rPr>
           <w:rFonts w:ascii="Times New Roman" w:hAnsi="Times New Roman" w:cs="Times New Roman"/>
-          <w:b w:val="1"/>
-          <w:bCs w:val="1"/>
+          <w:b/>
+          <w:bCs/>
           <w:sz w:val="24"/>
           <w:szCs w:val="24"/>
         </w:rPr>
@@ -1415,8 +1303,8 @@
         <w:shd w:val="clear" w:color="auto" w:fill="FFFFFF" w:themeFill="background1"/>
         <w:rPr>
           <w:rFonts w:ascii="Times New Roman" w:hAnsi="Times New Roman" w:cs="Times New Roman"/>
-          <w:b w:val="1"/>
-          <w:bCs w:val="1"/>
+          <w:b/>
+          <w:bCs/>
           <w:sz w:val="24"/>
           <w:szCs w:val="24"/>
         </w:rPr>
@@ -1427,8 +1315,8 @@
         <w:shd w:val="clear" w:color="auto" w:fill="FFFFFF" w:themeFill="background1"/>
         <w:rPr>
           <w:rFonts w:ascii="Times New Roman" w:hAnsi="Times New Roman" w:cs="Times New Roman"/>
-          <w:b w:val="1"/>
-          <w:bCs w:val="1"/>
+          <w:b/>
+          <w:bCs/>
           <w:sz w:val="24"/>
           <w:szCs w:val="24"/>
         </w:rPr>
@@ -1439,8 +1327,20 @@
         <w:shd w:val="clear" w:color="auto" w:fill="FFFFFF" w:themeFill="background1"/>
         <w:rPr>
           <w:rFonts w:ascii="Times New Roman" w:hAnsi="Times New Roman" w:cs="Times New Roman"/>
-          <w:b w:val="1"/>
-          <w:bCs w:val="1"/>
+          <w:b/>
+          <w:bCs/>
+          <w:sz w:val="24"/>
+          <w:szCs w:val="24"/>
+        </w:rPr>
+      </w:pPr>
+    </w:p>
+    <w:p>
+      <w:pPr>
+        <w:shd w:val="clear" w:color="auto" w:fill="FFFFFF" w:themeFill="background1"/>
+        <w:rPr>
+          <w:rFonts w:ascii="Times New Roman" w:hAnsi="Times New Roman" w:cs="Times New Roman"/>
+          <w:b/>
+          <w:bCs/>
           <w:sz w:val="24"/>
           <w:szCs w:val="24"/>
         </w:rPr>
@@ -1451,20 +1351,20 @@
         <w:tblW w:w="5436" w:type="pct"/>
         <w:tblInd w:w="96" w:type="dxa"/>
         <w:tblBorders>
-          <w:bottom w:val="single" w:color="006633" w:sz="24" w:space="0"/>
+          <w:bottom w:val="single" w:sz="24" w:space="0" w:color="006633"/>
         </w:tblBorders>
         <w:tblCellMar>
           <w:left w:w="0" w:type="dxa"/>
           <w:right w:w="0" w:type="dxa"/>
         </w:tblCellMar>
-        <w:tblLook w:val="04A0"/>
+        <w:tblLook w:val="04A0" w:firstRow="1" w:lastRow="0" w:firstColumn="1" w:lastColumn="0" w:noHBand="0" w:noVBand="1"/>
       </w:tblPr>
       <w:tblGrid>
         <w:gridCol w:w="3383"/>
         <w:gridCol w:w="2563"/>
         <w:gridCol w:w="3409"/>
       </w:tblGrid>
-      <w:tr xmlns:wp14="http://schemas.microsoft.com/office/word/2010/wordml" wp14:textId="77777777">
+      <w:tr>
         <w:trPr>
           <w:tblHeader/>
         </w:trPr>
@@ -1473,10 +1373,10 @@
             <w:tcW w:w="5000" w:type="pct"/>
             <w:gridSpan w:val="3"/>
             <w:tcBorders>
-              <w:top w:val="single" w:color="auto" w:sz="4" w:space="0"/>
-              <w:left w:val="single" w:color="auto" w:sz="4" w:space="0"/>
-              <w:bottom w:val="single" w:color="auto" w:sz="4" w:space="0"/>
-              <w:right w:val="single" w:color="auto" w:sz="4" w:space="0"/>
+              <w:top w:val="single" w:sz="4" w:space="0" w:color="auto"/>
+              <w:left w:val="single" w:sz="4" w:space="0" w:color="auto"/>
+              <w:bottom w:val="single" w:sz="4" w:space="0" w:color="auto"/>
+              <w:right w:val="single" w:sz="4" w:space="0" w:color="auto"/>
             </w:tcBorders>
             <w:shd w:val="clear" w:color="auto" w:fill="FFFFFF" w:themeFill="background1"/>
             <w:tcMar>
@@ -1488,15 +1388,15 @@
             <w:vAlign w:val="center"/>
             <w:hideMark/>
           </w:tcPr>
-          <w:p wp14:textId="77777777" wp14:noSpellErr="1">
+          <w:p>
             <w:pPr>
               <w:shd w:val="clear" w:color="auto" w:fill="FFFFFF" w:themeFill="background1"/>
               <w:spacing w:after="0" w:line="240" w:lineRule="auto"/>
               <w:jc w:val="center"/>
               <w:rPr>
                 <w:rFonts w:ascii="Times New Roman" w:hAnsi="Times New Roman" w:cs="Times New Roman"/>
-                <w:b w:val="1"/>
-                <w:bCs w:val="1"/>
+                <w:b/>
+                <w:bCs/>
                 <w:color w:val="FF0000"/>
                 <w:sz w:val="24"/>
                 <w:szCs w:val="24"/>
@@ -1506,27 +1406,28 @@
             <w:r>
               <w:rPr>
                 <w:rFonts w:ascii="Times New Roman" w:hAnsi="Times New Roman" w:cs="Times New Roman"/>
-                <w:b w:val="1"/>
-                <w:bCs w:val="1"/>
+                <w:b/>
+                <w:bCs/>
                 <w:color w:val="FF0000"/>
                 <w:sz w:val="24"/>
                 <w:szCs w:val="24"/>
                 <w:highlight w:val="yellow"/>
               </w:rPr>
+              <w:lastRenderedPageBreak/>
               <w:t>DETALHES DOS BOLETINS DE MEDIÇÕES</w:t>
             </w:r>
           </w:p>
         </w:tc>
       </w:tr>
-      <w:tr xmlns:wp14="http://schemas.microsoft.com/office/word/2010/wordml" wp14:textId="77777777">
+      <w:tr>
         <w:tc>
           <w:tcPr>
             <w:tcW w:w="1808" w:type="pct"/>
             <w:tcBorders>
-              <w:top w:val="single" w:color="auto" w:sz="4" w:space="0"/>
-              <w:left w:val="single" w:color="auto" w:sz="4" w:space="0"/>
-              <w:bottom w:val="single" w:color="auto" w:sz="4" w:space="0"/>
-              <w:right w:val="single" w:color="auto" w:sz="4" w:space="0"/>
+              <w:top w:val="single" w:sz="4" w:space="0" w:color="auto"/>
+              <w:left w:val="single" w:sz="4" w:space="0" w:color="auto"/>
+              <w:bottom w:val="single" w:sz="4" w:space="0" w:color="auto"/>
+              <w:right w:val="single" w:sz="4" w:space="0" w:color="auto"/>
             </w:tcBorders>
             <w:shd w:val="clear" w:color="auto" w:fill="FFFFFF" w:themeFill="background1"/>
             <w:noWrap/>
@@ -1538,7 +1439,7 @@
             </w:tcMar>
             <w:vAlign w:val="center"/>
           </w:tcPr>
-          <w:p wp14:textId="77777777">
+          <w:p>
             <w:pPr>
               <w:spacing w:after="0" w:line="240" w:lineRule="auto"/>
               <w:rPr>
@@ -1554,10 +1455,10 @@
           <w:tcPr>
             <w:tcW w:w="1370" w:type="pct"/>
             <w:tcBorders>
-              <w:top w:val="single" w:color="auto" w:sz="4" w:space="0"/>
-              <w:left w:val="single" w:color="auto" w:sz="4" w:space="0"/>
-              <w:bottom w:val="single" w:color="auto" w:sz="4" w:space="0"/>
-              <w:right w:val="single" w:color="auto" w:sz="4" w:space="0"/>
+              <w:top w:val="single" w:sz="4" w:space="0" w:color="auto"/>
+              <w:left w:val="single" w:sz="4" w:space="0" w:color="auto"/>
+              <w:bottom w:val="single" w:sz="4" w:space="0" w:color="auto"/>
+              <w:right w:val="single" w:sz="4" w:space="0" w:color="auto"/>
             </w:tcBorders>
             <w:shd w:val="clear" w:color="auto" w:fill="FFFFFF" w:themeFill="background1"/>
             <w:tcMar>
@@ -1568,7 +1469,7 @@
             </w:tcMar>
             <w:vAlign w:val="center"/>
           </w:tcPr>
-          <w:p wp14:textId="77777777">
+          <w:p>
             <w:pPr>
               <w:spacing w:after="0" w:line="360" w:lineRule="auto"/>
               <w:jc w:val="center"/>
@@ -1596,15 +1497,14 @@
           <w:tcPr>
             <w:tcW w:w="1821" w:type="pct"/>
             <w:tcBorders>
-              <w:top w:val="single" w:color="auto" w:sz="4" w:space="0"/>
-              <w:left w:val="single" w:color="auto" w:sz="4" w:space="0"/>
-              <w:bottom w:val="single" w:color="auto" w:sz="4" w:space="0"/>
-              <w:right w:val="single" w:color="auto" w:sz="4" w:space="0"/>
+              <w:top w:val="single" w:sz="4" w:space="0" w:color="auto"/>
+              <w:left w:val="single" w:sz="4" w:space="0" w:color="auto"/>
+              <w:bottom w:val="single" w:sz="4" w:space="0" w:color="auto"/>
+              <w:right w:val="single" w:sz="4" w:space="0" w:color="auto"/>
             </w:tcBorders>
             <w:shd w:val="clear" w:color="auto" w:fill="FFFFFF" w:themeFill="background1"/>
-            <w:tcMar/>
-          </w:tcPr>
-          <w:p wp14:textId="77777777">
+          </w:tcPr>
+          <w:p>
             <w:pPr>
               <w:spacing w:after="0" w:line="360" w:lineRule="auto"/>
               <w:jc w:val="center"/>
@@ -1629,15 +1529,15 @@
           </w:p>
         </w:tc>
       </w:tr>
-      <w:tr xmlns:wp14="http://schemas.microsoft.com/office/word/2010/wordml" wp14:textId="77777777">
+      <w:tr>
         <w:tc>
           <w:tcPr>
             <w:tcW w:w="1808" w:type="pct"/>
             <w:tcBorders>
-              <w:top w:val="single" w:color="auto" w:sz="4" w:space="0"/>
-              <w:left w:val="single" w:color="auto" w:sz="4" w:space="0"/>
-              <w:bottom w:val="single" w:color="auto" w:sz="4" w:space="0"/>
-              <w:right w:val="single" w:color="auto" w:sz="4" w:space="0"/>
+              <w:top w:val="single" w:sz="4" w:space="0" w:color="auto"/>
+              <w:left w:val="single" w:sz="4" w:space="0" w:color="auto"/>
+              <w:bottom w:val="single" w:sz="4" w:space="0" w:color="auto"/>
+              <w:right w:val="single" w:sz="4" w:space="0" w:color="auto"/>
             </w:tcBorders>
             <w:shd w:val="clear" w:color="auto" w:fill="F2F2F2" w:themeFill="background1" w:themeFillShade="F2"/>
             <w:noWrap/>
@@ -1650,7 +1550,7 @@
             <w:vAlign w:val="center"/>
             <w:hideMark/>
           </w:tcPr>
-          <w:p wp14:textId="77777777">
+          <w:p>
             <w:pPr>
               <w:spacing w:after="0" w:line="240" w:lineRule="auto"/>
               <w:rPr>
@@ -1685,10 +1585,10 @@
           <w:tcPr>
             <w:tcW w:w="1370" w:type="pct"/>
             <w:tcBorders>
-              <w:top w:val="single" w:color="auto" w:sz="4" w:space="0"/>
-              <w:left w:val="single" w:color="auto" w:sz="4" w:space="0"/>
-              <w:bottom w:val="single" w:color="auto" w:sz="4" w:space="0"/>
-              <w:right w:val="single" w:color="auto" w:sz="4" w:space="0"/>
+              <w:top w:val="single" w:sz="4" w:space="0" w:color="auto"/>
+              <w:left w:val="single" w:sz="4" w:space="0" w:color="auto"/>
+              <w:bottom w:val="single" w:sz="4" w:space="0" w:color="auto"/>
+              <w:right w:val="single" w:sz="4" w:space="0" w:color="auto"/>
             </w:tcBorders>
             <w:shd w:val="clear" w:color="auto" w:fill="F2F2F2" w:themeFill="background1" w:themeFillShade="F2"/>
             <w:tcMar>
@@ -1700,7 +1600,7 @@
             <w:vAlign w:val="center"/>
             <w:hideMark/>
           </w:tcPr>
-          <w:p wp14:textId="77777777">
+          <w:p>
             <w:pPr>
               <w:spacing w:after="0" w:line="360" w:lineRule="auto"/>
               <w:rPr>
@@ -1727,15 +1627,14 @@
           <w:tcPr>
             <w:tcW w:w="1821" w:type="pct"/>
             <w:tcBorders>
-              <w:top w:val="single" w:color="auto" w:sz="4" w:space="0"/>
-              <w:left w:val="single" w:color="auto" w:sz="4" w:space="0"/>
-              <w:bottom w:val="single" w:color="auto" w:sz="4" w:space="0"/>
-              <w:right w:val="single" w:color="auto" w:sz="4" w:space="0"/>
+              <w:top w:val="single" w:sz="4" w:space="0" w:color="auto"/>
+              <w:left w:val="single" w:sz="4" w:space="0" w:color="auto"/>
+              <w:bottom w:val="single" w:sz="4" w:space="0" w:color="auto"/>
+              <w:right w:val="single" w:sz="4" w:space="0" w:color="auto"/>
             </w:tcBorders>
             <w:shd w:val="clear" w:color="auto" w:fill="F2F2F2" w:themeFill="background1" w:themeFillShade="F2"/>
-            <w:tcMar/>
-          </w:tcPr>
-          <w:p wp14:textId="77777777">
+          </w:tcPr>
+          <w:p>
             <w:pPr>
               <w:spacing w:after="0" w:line="360" w:lineRule="auto"/>
               <w:ind w:left="148"/>
@@ -1810,15 +1709,15 @@
           </w:p>
         </w:tc>
       </w:tr>
-      <w:tr xmlns:wp14="http://schemas.microsoft.com/office/word/2010/wordml" wp14:textId="77777777">
+      <w:tr>
         <w:tc>
           <w:tcPr>
             <w:tcW w:w="1808" w:type="pct"/>
             <w:tcBorders>
-              <w:top w:val="single" w:color="auto" w:sz="4" w:space="0"/>
-              <w:left w:val="single" w:color="auto" w:sz="4" w:space="0"/>
-              <w:bottom w:val="single" w:color="auto" w:sz="4" w:space="0"/>
-              <w:right w:val="single" w:color="auto" w:sz="4" w:space="0"/>
+              <w:top w:val="single" w:sz="4" w:space="0" w:color="auto"/>
+              <w:left w:val="single" w:sz="4" w:space="0" w:color="auto"/>
+              <w:bottom w:val="single" w:sz="4" w:space="0" w:color="auto"/>
+              <w:right w:val="single" w:sz="4" w:space="0" w:color="auto"/>
             </w:tcBorders>
             <w:shd w:val="clear" w:color="auto" w:fill="F2F2F2" w:themeFill="background1" w:themeFillShade="F2"/>
             <w:noWrap/>
@@ -1831,7 +1730,7 @@
             <w:vAlign w:val="center"/>
             <w:hideMark/>
           </w:tcPr>
-          <w:p wp14:textId="77777777">
+          <w:p>
             <w:pPr>
               <w:spacing w:after="0" w:line="240" w:lineRule="auto"/>
               <w:rPr>
@@ -1856,10 +1755,10 @@
           <w:tcPr>
             <w:tcW w:w="1370" w:type="pct"/>
             <w:tcBorders>
-              <w:top w:val="single" w:color="auto" w:sz="4" w:space="0"/>
-              <w:left w:val="single" w:color="auto" w:sz="4" w:space="0"/>
-              <w:bottom w:val="single" w:color="auto" w:sz="4" w:space="0"/>
-              <w:right w:val="single" w:color="auto" w:sz="4" w:space="0"/>
+              <w:top w:val="single" w:sz="4" w:space="0" w:color="auto"/>
+              <w:left w:val="single" w:sz="4" w:space="0" w:color="auto"/>
+              <w:bottom w:val="single" w:sz="4" w:space="0" w:color="auto"/>
+              <w:right w:val="single" w:sz="4" w:space="0" w:color="auto"/>
             </w:tcBorders>
             <w:shd w:val="clear" w:color="auto" w:fill="F2F2F2" w:themeFill="background1" w:themeFillShade="F2"/>
             <w:tcMar>
@@ -1871,7 +1770,7 @@
             <w:vAlign w:val="center"/>
             <w:hideMark/>
           </w:tcPr>
-          <w:p wp14:textId="77777777">
+          <w:p>
             <w:pPr>
               <w:spacing w:after="0" w:line="360" w:lineRule="auto"/>
               <w:rPr>
@@ -1898,7 +1797,7 @@
                 <w:sz w:val="24"/>
                 <w:szCs w:val="24"/>
                 <w:highlight w:val="yellow"/>
-                <w:bdr w:val="none" w:color="auto" w:sz="0" w:space="0" w:frame="1"/>
+                <w:bdr w:val="none" w:sz="0" w:space="0" w:color="auto" w:frame="1"/>
               </w:rPr>
               <w:t xml:space="preserve">/04/2010 a </w:t>
             </w:r>
@@ -1919,7 +1818,7 @@
                 <w:sz w:val="24"/>
                 <w:szCs w:val="24"/>
                 <w:highlight w:val="yellow"/>
-                <w:bdr w:val="none" w:color="auto" w:sz="0" w:space="0" w:frame="1"/>
+                <w:bdr w:val="none" w:sz="0" w:space="0" w:color="auto" w:frame="1"/>
               </w:rPr>
               <w:t xml:space="preserve">/06/2010  </w:t>
             </w:r>
@@ -1929,15 +1828,14 @@
           <w:tcPr>
             <w:tcW w:w="1821" w:type="pct"/>
             <w:tcBorders>
-              <w:top w:val="single" w:color="auto" w:sz="4" w:space="0"/>
-              <w:left w:val="single" w:color="auto" w:sz="4" w:space="0"/>
-              <w:bottom w:val="single" w:color="auto" w:sz="4" w:space="0"/>
-              <w:right w:val="single" w:color="auto" w:sz="4" w:space="0"/>
+              <w:top w:val="single" w:sz="4" w:space="0" w:color="auto"/>
+              <w:left w:val="single" w:sz="4" w:space="0" w:color="auto"/>
+              <w:bottom w:val="single" w:sz="4" w:space="0" w:color="auto"/>
+              <w:right w:val="single" w:sz="4" w:space="0" w:color="auto"/>
             </w:tcBorders>
             <w:shd w:val="clear" w:color="auto" w:fill="F2F2F2" w:themeFill="background1" w:themeFillShade="F2"/>
-            <w:tcMar/>
-          </w:tcPr>
-          <w:p wp14:textId="77777777">
+          </w:tcPr>
+          <w:p>
             <w:pPr>
               <w:spacing w:after="0" w:line="360" w:lineRule="auto"/>
               <w:ind w:left="148"/>
@@ -2014,15 +1912,15 @@
           </w:p>
         </w:tc>
       </w:tr>
-      <w:tr xmlns:wp14="http://schemas.microsoft.com/office/word/2010/wordml" wp14:textId="77777777">
+      <w:tr>
         <w:tc>
           <w:tcPr>
             <w:tcW w:w="1808" w:type="pct"/>
             <w:tcBorders>
-              <w:top w:val="single" w:color="auto" w:sz="4" w:space="0"/>
-              <w:left w:val="single" w:color="auto" w:sz="4" w:space="0"/>
-              <w:bottom w:val="single" w:color="auto" w:sz="4" w:space="0"/>
-              <w:right w:val="single" w:color="auto" w:sz="4" w:space="0"/>
+              <w:top w:val="single" w:sz="4" w:space="0" w:color="auto"/>
+              <w:left w:val="single" w:sz="4" w:space="0" w:color="auto"/>
+              <w:bottom w:val="single" w:sz="4" w:space="0" w:color="auto"/>
+              <w:right w:val="single" w:sz="4" w:space="0" w:color="auto"/>
             </w:tcBorders>
             <w:noWrap/>
             <w:tcMar>
@@ -2034,7 +1932,7 @@
             <w:vAlign w:val="center"/>
             <w:hideMark/>
           </w:tcPr>
-          <w:p wp14:textId="77777777">
+          <w:p>
             <w:pPr>
               <w:spacing w:after="0" w:line="240" w:lineRule="auto"/>
               <w:rPr>
@@ -2060,10 +1958,10 @@
           <w:tcPr>
             <w:tcW w:w="1370" w:type="pct"/>
             <w:tcBorders>
-              <w:top w:val="single" w:color="auto" w:sz="4" w:space="0"/>
-              <w:left w:val="single" w:color="auto" w:sz="4" w:space="0"/>
-              <w:bottom w:val="single" w:color="auto" w:sz="4" w:space="0"/>
-              <w:right w:val="single" w:color="auto" w:sz="4" w:space="0"/>
+              <w:top w:val="single" w:sz="4" w:space="0" w:color="auto"/>
+              <w:left w:val="single" w:sz="4" w:space="0" w:color="auto"/>
+              <w:bottom w:val="single" w:sz="4" w:space="0" w:color="auto"/>
+              <w:right w:val="single" w:sz="4" w:space="0" w:color="auto"/>
             </w:tcBorders>
             <w:tcMar>
               <w:top w:w="24" w:type="dxa"/>
@@ -2074,7 +1972,7 @@
             <w:vAlign w:val="center"/>
             <w:hideMark/>
           </w:tcPr>
-          <w:p wp14:textId="77777777">
+          <w:p>
             <w:pPr>
               <w:spacing w:after="0" w:line="360" w:lineRule="auto"/>
               <w:rPr>
@@ -2101,14 +1999,13 @@
           <w:tcPr>
             <w:tcW w:w="1821" w:type="pct"/>
             <w:tcBorders>
-              <w:top w:val="single" w:color="auto" w:sz="4" w:space="0"/>
-              <w:left w:val="single" w:color="auto" w:sz="4" w:space="0"/>
-              <w:bottom w:val="single" w:color="auto" w:sz="4" w:space="0"/>
-              <w:right w:val="single" w:color="auto" w:sz="4" w:space="0"/>
-            </w:tcBorders>
-            <w:tcMar/>
-          </w:tcPr>
-          <w:p wp14:textId="77777777">
+              <w:top w:val="single" w:sz="4" w:space="0" w:color="auto"/>
+              <w:left w:val="single" w:sz="4" w:space="0" w:color="auto"/>
+              <w:bottom w:val="single" w:sz="4" w:space="0" w:color="auto"/>
+              <w:right w:val="single" w:sz="4" w:space="0" w:color="auto"/>
+            </w:tcBorders>
+          </w:tcPr>
+          <w:p>
             <w:pPr>
               <w:spacing w:after="0" w:line="360" w:lineRule="auto"/>
               <w:ind w:left="148"/>
@@ -2133,15 +2030,15 @@
           </w:p>
         </w:tc>
       </w:tr>
-      <w:tr xmlns:wp14="http://schemas.microsoft.com/office/word/2010/wordml" wp14:textId="77777777">
+      <w:tr>
         <w:tc>
           <w:tcPr>
             <w:tcW w:w="1808" w:type="pct"/>
             <w:tcBorders>
-              <w:top w:val="single" w:color="auto" w:sz="4" w:space="0"/>
-              <w:left w:val="single" w:color="auto" w:sz="4" w:space="0"/>
-              <w:bottom w:val="single" w:color="auto" w:sz="4" w:space="0"/>
-              <w:right w:val="single" w:color="auto" w:sz="4" w:space="0"/>
+              <w:top w:val="single" w:sz="4" w:space="0" w:color="auto"/>
+              <w:left w:val="single" w:sz="4" w:space="0" w:color="auto"/>
+              <w:bottom w:val="single" w:sz="4" w:space="0" w:color="auto"/>
+              <w:right w:val="single" w:sz="4" w:space="0" w:color="auto"/>
             </w:tcBorders>
             <w:shd w:val="clear" w:color="auto" w:fill="FFFFFF" w:themeFill="background1"/>
             <w:noWrap/>
@@ -2154,7 +2051,7 @@
             <w:vAlign w:val="center"/>
             <w:hideMark/>
           </w:tcPr>
-          <w:p wp14:textId="77777777">
+          <w:p>
             <w:pPr>
               <w:spacing w:after="0" w:line="240" w:lineRule="auto"/>
               <w:rPr>
@@ -2180,10 +2077,10 @@
           <w:tcPr>
             <w:tcW w:w="1370" w:type="pct"/>
             <w:tcBorders>
-              <w:top w:val="single" w:color="auto" w:sz="4" w:space="0"/>
-              <w:left w:val="single" w:color="auto" w:sz="4" w:space="0"/>
-              <w:bottom w:val="single" w:color="auto" w:sz="4" w:space="0"/>
-              <w:right w:val="single" w:color="auto" w:sz="4" w:space="0"/>
+              <w:top w:val="single" w:sz="4" w:space="0" w:color="auto"/>
+              <w:left w:val="single" w:sz="4" w:space="0" w:color="auto"/>
+              <w:bottom w:val="single" w:sz="4" w:space="0" w:color="auto"/>
+              <w:right w:val="single" w:sz="4" w:space="0" w:color="auto"/>
             </w:tcBorders>
             <w:shd w:val="clear" w:color="auto" w:fill="FFFFFF" w:themeFill="background1"/>
             <w:tcMar>
@@ -2195,7 +2092,7 @@
             <w:vAlign w:val="center"/>
             <w:hideMark/>
           </w:tcPr>
-          <w:p wp14:textId="77777777">
+          <w:p>
             <w:pPr>
               <w:spacing w:after="0" w:line="360" w:lineRule="auto"/>
               <w:rPr>
@@ -2224,7 +2121,7 @@
                 <w:sz w:val="24"/>
                 <w:szCs w:val="24"/>
                 <w:highlight w:val="yellow"/>
-                <w:bdr w:val="none" w:color="auto" w:sz="0" w:space="0" w:frame="1"/>
+                <w:bdr w:val="none" w:sz="0" w:space="0" w:color="auto" w:frame="1"/>
               </w:rPr>
               <w:t xml:space="preserve">/06/2010 a 31/01/2011  </w:t>
             </w:r>
@@ -2234,15 +2131,14 @@
           <w:tcPr>
             <w:tcW w:w="1821" w:type="pct"/>
             <w:tcBorders>
-              <w:top w:val="single" w:color="auto" w:sz="4" w:space="0"/>
-              <w:left w:val="single" w:color="auto" w:sz="4" w:space="0"/>
-              <w:bottom w:val="single" w:color="auto" w:sz="4" w:space="0"/>
-              <w:right w:val="single" w:color="auto" w:sz="4" w:space="0"/>
+              <w:top w:val="single" w:sz="4" w:space="0" w:color="auto"/>
+              <w:left w:val="single" w:sz="4" w:space="0" w:color="auto"/>
+              <w:bottom w:val="single" w:sz="4" w:space="0" w:color="auto"/>
+              <w:right w:val="single" w:sz="4" w:space="0" w:color="auto"/>
             </w:tcBorders>
             <w:shd w:val="clear" w:color="auto" w:fill="FFFFFF" w:themeFill="background1"/>
-            <w:tcMar/>
-          </w:tcPr>
-          <w:p wp14:textId="77777777">
+          </w:tcPr>
+          <w:p>
             <w:pPr>
               <w:spacing w:after="0" w:line="360" w:lineRule="auto"/>
               <w:ind w:left="148"/>
@@ -2265,15 +2161,15 @@
           </w:p>
         </w:tc>
       </w:tr>
-      <w:tr xmlns:wp14="http://schemas.microsoft.com/office/word/2010/wordml" wp14:textId="77777777">
+      <w:tr>
         <w:tc>
           <w:tcPr>
             <w:tcW w:w="1808" w:type="pct"/>
             <w:tcBorders>
-              <w:top w:val="single" w:color="auto" w:sz="4" w:space="0"/>
-              <w:left w:val="single" w:color="auto" w:sz="4" w:space="0"/>
-              <w:bottom w:val="single" w:color="auto" w:sz="4" w:space="0"/>
-              <w:right w:val="single" w:color="auto" w:sz="4" w:space="0"/>
+              <w:top w:val="single" w:sz="4" w:space="0" w:color="auto"/>
+              <w:left w:val="single" w:sz="4" w:space="0" w:color="auto"/>
+              <w:bottom w:val="single" w:sz="4" w:space="0" w:color="auto"/>
+              <w:right w:val="single" w:sz="4" w:space="0" w:color="auto"/>
             </w:tcBorders>
             <w:shd w:val="clear" w:color="auto" w:fill="F2F2F2" w:themeFill="background1" w:themeFillShade="F2"/>
             <w:noWrap/>
@@ -2286,7 +2182,7 @@
             <w:vAlign w:val="center"/>
             <w:hideMark/>
           </w:tcPr>
-          <w:p wp14:textId="77777777">
+          <w:p>
             <w:pPr>
               <w:spacing w:after="0" w:line="240" w:lineRule="auto"/>
               <w:rPr>
@@ -2312,10 +2208,10 @@
           <w:tcPr>
             <w:tcW w:w="1370" w:type="pct"/>
             <w:tcBorders>
-              <w:top w:val="single" w:color="auto" w:sz="4" w:space="0"/>
-              <w:left w:val="single" w:color="auto" w:sz="4" w:space="0"/>
-              <w:bottom w:val="single" w:color="auto" w:sz="4" w:space="0"/>
-              <w:right w:val="single" w:color="auto" w:sz="4" w:space="0"/>
+              <w:top w:val="single" w:sz="4" w:space="0" w:color="auto"/>
+              <w:left w:val="single" w:sz="4" w:space="0" w:color="auto"/>
+              <w:bottom w:val="single" w:sz="4" w:space="0" w:color="auto"/>
+              <w:right w:val="single" w:sz="4" w:space="0" w:color="auto"/>
             </w:tcBorders>
             <w:shd w:val="clear" w:color="auto" w:fill="F2F2F2" w:themeFill="background1" w:themeFillShade="F2"/>
             <w:tcMar>
@@ -2327,7 +2223,7 @@
             <w:vAlign w:val="center"/>
             <w:hideMark/>
           </w:tcPr>
-          <w:p wp14:textId="77777777">
+          <w:p>
             <w:pPr>
               <w:spacing w:after="0" w:line="360" w:lineRule="auto"/>
               <w:rPr>
@@ -2374,15 +2270,14 @@
           <w:tcPr>
             <w:tcW w:w="1821" w:type="pct"/>
             <w:tcBorders>
-              <w:top w:val="single" w:color="auto" w:sz="4" w:space="0"/>
-              <w:left w:val="single" w:color="auto" w:sz="4" w:space="0"/>
-              <w:bottom w:val="single" w:color="auto" w:sz="4" w:space="0"/>
-              <w:right w:val="single" w:color="auto" w:sz="4" w:space="0"/>
+              <w:top w:val="single" w:sz="4" w:space="0" w:color="auto"/>
+              <w:left w:val="single" w:sz="4" w:space="0" w:color="auto"/>
+              <w:bottom w:val="single" w:sz="4" w:space="0" w:color="auto"/>
+              <w:right w:val="single" w:sz="4" w:space="0" w:color="auto"/>
             </w:tcBorders>
             <w:shd w:val="clear" w:color="auto" w:fill="F2F2F2" w:themeFill="background1" w:themeFillShade="F2"/>
-            <w:tcMar/>
-          </w:tcPr>
-          <w:p wp14:textId="77777777">
+          </w:tcPr>
+          <w:p>
             <w:pPr>
               <w:spacing w:after="0" w:line="360" w:lineRule="auto"/>
               <w:ind w:left="148"/>
@@ -2407,15 +2302,15 @@
           </w:p>
         </w:tc>
       </w:tr>
-      <w:tr xmlns:wp14="http://schemas.microsoft.com/office/word/2010/wordml" wp14:textId="77777777">
+      <w:tr>
         <w:tc>
           <w:tcPr>
             <w:tcW w:w="1808" w:type="pct"/>
             <w:tcBorders>
-              <w:top w:val="single" w:color="auto" w:sz="4" w:space="0"/>
-              <w:left w:val="single" w:color="auto" w:sz="4" w:space="0"/>
-              <w:bottom w:val="single" w:color="auto" w:sz="4" w:space="0"/>
-              <w:right w:val="single" w:color="auto" w:sz="4" w:space="0"/>
+              <w:top w:val="single" w:sz="4" w:space="0" w:color="auto"/>
+              <w:left w:val="single" w:sz="4" w:space="0" w:color="auto"/>
+              <w:bottom w:val="single" w:sz="4" w:space="0" w:color="auto"/>
+              <w:right w:val="single" w:sz="4" w:space="0" w:color="auto"/>
             </w:tcBorders>
             <w:shd w:val="clear" w:color="auto" w:fill="F2F2F2" w:themeFill="background1" w:themeFillShade="F2"/>
             <w:noWrap/>
@@ -2428,7 +2323,7 @@
             <w:vAlign w:val="center"/>
             <w:hideMark/>
           </w:tcPr>
-          <w:p wp14:textId="77777777">
+          <w:p>
             <w:pPr>
               <w:spacing w:after="0" w:line="240" w:lineRule="auto"/>
               <w:rPr>
@@ -2454,10 +2349,10 @@
           <w:tcPr>
             <w:tcW w:w="1370" w:type="pct"/>
             <w:tcBorders>
-              <w:top w:val="single" w:color="auto" w:sz="4" w:space="0"/>
-              <w:left w:val="single" w:color="auto" w:sz="4" w:space="0"/>
-              <w:bottom w:val="single" w:color="auto" w:sz="4" w:space="0"/>
-              <w:right w:val="single" w:color="auto" w:sz="4" w:space="0"/>
+              <w:top w:val="single" w:sz="4" w:space="0" w:color="auto"/>
+              <w:left w:val="single" w:sz="4" w:space="0" w:color="auto"/>
+              <w:bottom w:val="single" w:sz="4" w:space="0" w:color="auto"/>
+              <w:right w:val="single" w:sz="4" w:space="0" w:color="auto"/>
             </w:tcBorders>
             <w:shd w:val="clear" w:color="auto" w:fill="F2F2F2" w:themeFill="background1" w:themeFillShade="F2"/>
             <w:tcMar>
@@ -2469,7 +2364,7 @@
             <w:vAlign w:val="center"/>
             <w:hideMark/>
           </w:tcPr>
-          <w:p wp14:textId="77777777">
+          <w:p>
             <w:pPr>
               <w:spacing w:after="0" w:line="360" w:lineRule="auto"/>
               <w:rPr>
@@ -2497,7 +2392,7 @@
                 <w:sz w:val="24"/>
                 <w:szCs w:val="24"/>
                 <w:highlight w:val="yellow"/>
-                <w:bdr w:val="none" w:color="auto" w:sz="0" w:space="0" w:frame="1"/>
+                <w:bdr w:val="none" w:sz="0" w:space="0" w:color="auto" w:frame="1"/>
               </w:rPr>
               <w:t xml:space="preserve">/02/2011 a 29/08/2011 </w:t>
             </w:r>
@@ -2507,15 +2402,14 @@
           <w:tcPr>
             <w:tcW w:w="1821" w:type="pct"/>
             <w:tcBorders>
-              <w:top w:val="single" w:color="auto" w:sz="4" w:space="0"/>
-              <w:left w:val="single" w:color="auto" w:sz="4" w:space="0"/>
-              <w:bottom w:val="single" w:color="auto" w:sz="4" w:space="0"/>
-              <w:right w:val="single" w:color="auto" w:sz="4" w:space="0"/>
+              <w:top w:val="single" w:sz="4" w:space="0" w:color="auto"/>
+              <w:left w:val="single" w:sz="4" w:space="0" w:color="auto"/>
+              <w:bottom w:val="single" w:sz="4" w:space="0" w:color="auto"/>
+              <w:right w:val="single" w:sz="4" w:space="0" w:color="auto"/>
             </w:tcBorders>
             <w:shd w:val="clear" w:color="auto" w:fill="F2F2F2" w:themeFill="background1" w:themeFillShade="F2"/>
-            <w:tcMar/>
-          </w:tcPr>
-          <w:p wp14:textId="77777777">
+          </w:tcPr>
+          <w:p>
             <w:pPr>
               <w:spacing w:after="0" w:line="360" w:lineRule="auto"/>
               <w:ind w:left="148"/>
@@ -2538,15 +2432,15 @@
           </w:p>
         </w:tc>
       </w:tr>
-      <w:tr xmlns:wp14="http://schemas.microsoft.com/office/word/2010/wordml" wp14:textId="77777777">
+      <w:tr>
         <w:tc>
           <w:tcPr>
             <w:tcW w:w="1808" w:type="pct"/>
             <w:tcBorders>
-              <w:top w:val="single" w:color="auto" w:sz="4" w:space="0"/>
-              <w:left w:val="single" w:color="auto" w:sz="4" w:space="0"/>
-              <w:bottom w:val="single" w:color="auto" w:sz="4" w:space="0"/>
-              <w:right w:val="single" w:color="auto" w:sz="4" w:space="0"/>
+              <w:top w:val="single" w:sz="4" w:space="0" w:color="auto"/>
+              <w:left w:val="single" w:sz="4" w:space="0" w:color="auto"/>
+              <w:bottom w:val="single" w:sz="4" w:space="0" w:color="auto"/>
+              <w:right w:val="single" w:sz="4" w:space="0" w:color="auto"/>
             </w:tcBorders>
             <w:noWrap/>
             <w:tcMar>
@@ -2558,7 +2452,7 @@
             <w:vAlign w:val="center"/>
             <w:hideMark/>
           </w:tcPr>
-          <w:p wp14:textId="77777777">
+          <w:p>
             <w:pPr>
               <w:spacing w:after="0" w:line="240" w:lineRule="auto"/>
               <w:rPr>
@@ -2584,10 +2478,10 @@
           <w:tcPr>
             <w:tcW w:w="1370" w:type="pct"/>
             <w:tcBorders>
-              <w:top w:val="single" w:color="auto" w:sz="4" w:space="0"/>
-              <w:left w:val="single" w:color="auto" w:sz="4" w:space="0"/>
-              <w:bottom w:val="single" w:color="auto" w:sz="4" w:space="0"/>
-              <w:right w:val="single" w:color="auto" w:sz="4" w:space="0"/>
+              <w:top w:val="single" w:sz="4" w:space="0" w:color="auto"/>
+              <w:left w:val="single" w:sz="4" w:space="0" w:color="auto"/>
+              <w:bottom w:val="single" w:sz="4" w:space="0" w:color="auto"/>
+              <w:right w:val="single" w:sz="4" w:space="0" w:color="auto"/>
             </w:tcBorders>
             <w:tcMar>
               <w:top w:w="24" w:type="dxa"/>
@@ -2598,7 +2492,7 @@
             <w:vAlign w:val="center"/>
             <w:hideMark/>
           </w:tcPr>
-          <w:p wp14:textId="77777777">
+          <w:p>
             <w:pPr>
               <w:spacing w:after="0" w:line="360" w:lineRule="auto"/>
               <w:rPr>
@@ -2625,14 +2519,13 @@
           <w:tcPr>
             <w:tcW w:w="1821" w:type="pct"/>
             <w:tcBorders>
-              <w:top w:val="single" w:color="auto" w:sz="4" w:space="0"/>
-              <w:left w:val="single" w:color="auto" w:sz="4" w:space="0"/>
-              <w:bottom w:val="single" w:color="auto" w:sz="4" w:space="0"/>
-              <w:right w:val="single" w:color="auto" w:sz="4" w:space="0"/>
-            </w:tcBorders>
-            <w:tcMar/>
-          </w:tcPr>
-          <w:p wp14:textId="77777777">
+              <w:top w:val="single" w:sz="4" w:space="0" w:color="auto"/>
+              <w:left w:val="single" w:sz="4" w:space="0" w:color="auto"/>
+              <w:bottom w:val="single" w:sz="4" w:space="0" w:color="auto"/>
+              <w:right w:val="single" w:sz="4" w:space="0" w:color="auto"/>
+            </w:tcBorders>
+          </w:tcPr>
+          <w:p>
             <w:pPr>
               <w:spacing w:after="0" w:line="360" w:lineRule="auto"/>
               <w:ind w:left="148"/>
@@ -2657,15 +2550,15 @@
           </w:p>
         </w:tc>
       </w:tr>
-      <w:tr xmlns:wp14="http://schemas.microsoft.com/office/word/2010/wordml" wp14:textId="77777777">
+      <w:tr>
         <w:tc>
           <w:tcPr>
             <w:tcW w:w="1808" w:type="pct"/>
             <w:tcBorders>
-              <w:top w:val="single" w:color="auto" w:sz="4" w:space="0"/>
-              <w:left w:val="single" w:color="auto" w:sz="4" w:space="0"/>
-              <w:bottom w:val="single" w:color="auto" w:sz="4" w:space="0"/>
-              <w:right w:val="single" w:color="auto" w:sz="4" w:space="0"/>
+              <w:top w:val="single" w:sz="4" w:space="0" w:color="auto"/>
+              <w:left w:val="single" w:sz="4" w:space="0" w:color="auto"/>
+              <w:bottom w:val="single" w:sz="4" w:space="0" w:color="auto"/>
+              <w:right w:val="single" w:sz="4" w:space="0" w:color="auto"/>
             </w:tcBorders>
             <w:shd w:val="clear" w:color="auto" w:fill="FFFFFF" w:themeFill="background1"/>
             <w:noWrap/>
@@ -2678,7 +2571,7 @@
             <w:vAlign w:val="center"/>
             <w:hideMark/>
           </w:tcPr>
-          <w:p wp14:textId="77777777">
+          <w:p>
             <w:pPr>
               <w:spacing w:after="0" w:line="240" w:lineRule="auto"/>
               <w:rPr>
@@ -2704,10 +2597,10 @@
           <w:tcPr>
             <w:tcW w:w="1370" w:type="pct"/>
             <w:tcBorders>
-              <w:top w:val="single" w:color="auto" w:sz="4" w:space="0"/>
-              <w:left w:val="single" w:color="auto" w:sz="4" w:space="0"/>
-              <w:bottom w:val="single" w:color="auto" w:sz="4" w:space="0"/>
-              <w:right w:val="single" w:color="auto" w:sz="4" w:space="0"/>
+              <w:top w:val="single" w:sz="4" w:space="0" w:color="auto"/>
+              <w:left w:val="single" w:sz="4" w:space="0" w:color="auto"/>
+              <w:bottom w:val="single" w:sz="4" w:space="0" w:color="auto"/>
+              <w:right w:val="single" w:sz="4" w:space="0" w:color="auto"/>
             </w:tcBorders>
             <w:shd w:val="clear" w:color="auto" w:fill="FFFFFF" w:themeFill="background1"/>
             <w:tcMar>
@@ -2719,7 +2612,7 @@
             <w:vAlign w:val="center"/>
             <w:hideMark/>
           </w:tcPr>
-          <w:p wp14:textId="77777777">
+          <w:p>
             <w:pPr>
               <w:spacing w:after="0" w:line="360" w:lineRule="auto"/>
               <w:rPr>
@@ -2747,7 +2640,7 @@
                 <w:sz w:val="24"/>
                 <w:szCs w:val="24"/>
                 <w:highlight w:val="yellow"/>
-                <w:bdr w:val="none" w:color="auto" w:sz="0" w:space="0" w:frame="1"/>
+                <w:bdr w:val="none" w:sz="0" w:space="0" w:color="auto" w:frame="1"/>
               </w:rPr>
               <w:t>/08/2011 a 14/02/2012</w:t>
             </w:r>
@@ -2757,15 +2650,14 @@
           <w:tcPr>
             <w:tcW w:w="1821" w:type="pct"/>
             <w:tcBorders>
-              <w:top w:val="single" w:color="auto" w:sz="4" w:space="0"/>
-              <w:left w:val="single" w:color="auto" w:sz="4" w:space="0"/>
-              <w:bottom w:val="single" w:color="auto" w:sz="4" w:space="0"/>
-              <w:right w:val="single" w:color="auto" w:sz="4" w:space="0"/>
+              <w:top w:val="single" w:sz="4" w:space="0" w:color="auto"/>
+              <w:left w:val="single" w:sz="4" w:space="0" w:color="auto"/>
+              <w:bottom w:val="single" w:sz="4" w:space="0" w:color="auto"/>
+              <w:right w:val="single" w:sz="4" w:space="0" w:color="auto"/>
             </w:tcBorders>
             <w:shd w:val="clear" w:color="auto" w:fill="FFFFFF" w:themeFill="background1"/>
-            <w:tcMar/>
-          </w:tcPr>
-          <w:p wp14:textId="77777777">
+          </w:tcPr>
+          <w:p>
             <w:pPr>
               <w:spacing w:after="0" w:line="360" w:lineRule="auto"/>
               <w:ind w:left="148"/>
@@ -2788,15 +2680,15 @@
           </w:p>
         </w:tc>
       </w:tr>
-      <w:tr xmlns:wp14="http://schemas.microsoft.com/office/word/2010/wordml" wp14:textId="77777777">
+      <w:tr>
         <w:tc>
           <w:tcPr>
             <w:tcW w:w="1808" w:type="pct"/>
             <w:tcBorders>
-              <w:top w:val="single" w:color="auto" w:sz="4" w:space="0"/>
-              <w:left w:val="single" w:color="auto" w:sz="4" w:space="0"/>
-              <w:bottom w:val="single" w:color="auto" w:sz="4" w:space="0"/>
-              <w:right w:val="single" w:color="auto" w:sz="4" w:space="0"/>
+              <w:top w:val="single" w:sz="4" w:space="0" w:color="auto"/>
+              <w:left w:val="single" w:sz="4" w:space="0" w:color="auto"/>
+              <w:bottom w:val="single" w:sz="4" w:space="0" w:color="auto"/>
+              <w:right w:val="single" w:sz="4" w:space="0" w:color="auto"/>
             </w:tcBorders>
             <w:shd w:val="clear" w:color="auto" w:fill="F2F2F2" w:themeFill="background1" w:themeFillShade="F2"/>
             <w:noWrap/>
@@ -2809,7 +2701,7 @@
             <w:vAlign w:val="center"/>
             <w:hideMark/>
           </w:tcPr>
-          <w:p wp14:textId="77777777">
+          <w:p>
             <w:pPr>
               <w:spacing w:after="0" w:line="240" w:lineRule="auto"/>
               <w:rPr>
@@ -2835,10 +2727,10 @@
           <w:tcPr>
             <w:tcW w:w="1370" w:type="pct"/>
             <w:tcBorders>
-              <w:top w:val="single" w:color="auto" w:sz="4" w:space="0"/>
-              <w:left w:val="single" w:color="auto" w:sz="4" w:space="0"/>
-              <w:bottom w:val="single" w:color="auto" w:sz="4" w:space="0"/>
-              <w:right w:val="single" w:color="auto" w:sz="4" w:space="0"/>
+              <w:top w:val="single" w:sz="4" w:space="0" w:color="auto"/>
+              <w:left w:val="single" w:sz="4" w:space="0" w:color="auto"/>
+              <w:bottom w:val="single" w:sz="4" w:space="0" w:color="auto"/>
+              <w:right w:val="single" w:sz="4" w:space="0" w:color="auto"/>
             </w:tcBorders>
             <w:shd w:val="clear" w:color="auto" w:fill="F2F2F2" w:themeFill="background1" w:themeFillShade="F2"/>
             <w:tcMar>
@@ -2850,7 +2742,7 @@
             <w:vAlign w:val="center"/>
             <w:hideMark/>
           </w:tcPr>
-          <w:p wp14:textId="77777777">
+          <w:p>
             <w:pPr>
               <w:spacing w:after="0" w:line="360" w:lineRule="auto"/>
               <w:rPr>
@@ -2879,7 +2771,7 @@
                 <w:sz w:val="24"/>
                 <w:szCs w:val="24"/>
                 <w:highlight w:val="yellow"/>
-                <w:bdr w:val="none" w:color="auto" w:sz="0" w:space="0" w:frame="1"/>
+                <w:bdr w:val="none" w:sz="0" w:space="0" w:color="auto" w:frame="1"/>
               </w:rPr>
               <w:t xml:space="preserve"> </w:t>
             </w:r>
@@ -2889,15 +2781,14 @@
           <w:tcPr>
             <w:tcW w:w="1821" w:type="pct"/>
             <w:tcBorders>
-              <w:top w:val="single" w:color="auto" w:sz="4" w:space="0"/>
-              <w:left w:val="single" w:color="auto" w:sz="4" w:space="0"/>
-              <w:bottom w:val="single" w:color="auto" w:sz="4" w:space="0"/>
-              <w:right w:val="single" w:color="auto" w:sz="4" w:space="0"/>
+              <w:top w:val="single" w:sz="4" w:space="0" w:color="auto"/>
+              <w:left w:val="single" w:sz="4" w:space="0" w:color="auto"/>
+              <w:bottom w:val="single" w:sz="4" w:space="0" w:color="auto"/>
+              <w:right w:val="single" w:sz="4" w:space="0" w:color="auto"/>
             </w:tcBorders>
             <w:shd w:val="clear" w:color="auto" w:fill="F2F2F2" w:themeFill="background1" w:themeFillShade="F2"/>
-            <w:tcMar/>
-          </w:tcPr>
-          <w:p wp14:textId="77777777">
+          </w:tcPr>
+          <w:p>
             <w:pPr>
               <w:spacing w:after="0" w:line="360" w:lineRule="auto"/>
               <w:ind w:left="148"/>
@@ -2922,15 +2813,15 @@
           </w:p>
         </w:tc>
       </w:tr>
-      <w:tr xmlns:wp14="http://schemas.microsoft.com/office/word/2010/wordml" wp14:textId="77777777">
+      <w:tr>
         <w:tc>
           <w:tcPr>
             <w:tcW w:w="1808" w:type="pct"/>
             <w:tcBorders>
-              <w:top w:val="single" w:color="auto" w:sz="4" w:space="0"/>
-              <w:left w:val="single" w:color="auto" w:sz="4" w:space="0"/>
-              <w:bottom w:val="single" w:color="auto" w:sz="4" w:space="0"/>
-              <w:right w:val="single" w:color="auto" w:sz="4" w:space="0"/>
+              <w:top w:val="single" w:sz="4" w:space="0" w:color="auto"/>
+              <w:left w:val="single" w:sz="4" w:space="0" w:color="auto"/>
+              <w:bottom w:val="single" w:sz="4" w:space="0" w:color="auto"/>
+              <w:right w:val="single" w:sz="4" w:space="0" w:color="auto"/>
             </w:tcBorders>
             <w:shd w:val="clear" w:color="auto" w:fill="F2F2F2" w:themeFill="background1" w:themeFillShade="F2"/>
             <w:noWrap/>
@@ -2943,7 +2834,7 @@
             <w:vAlign w:val="center"/>
             <w:hideMark/>
           </w:tcPr>
-          <w:p wp14:textId="77777777">
+          <w:p>
             <w:pPr>
               <w:spacing w:after="0" w:line="240" w:lineRule="auto"/>
               <w:rPr>
@@ -2969,10 +2860,10 @@
           <w:tcPr>
             <w:tcW w:w="1370" w:type="pct"/>
             <w:tcBorders>
-              <w:top w:val="single" w:color="auto" w:sz="4" w:space="0"/>
-              <w:left w:val="single" w:color="auto" w:sz="4" w:space="0"/>
-              <w:bottom w:val="single" w:color="auto" w:sz="4" w:space="0"/>
-              <w:right w:val="single" w:color="auto" w:sz="4" w:space="0"/>
+              <w:top w:val="single" w:sz="4" w:space="0" w:color="auto"/>
+              <w:left w:val="single" w:sz="4" w:space="0" w:color="auto"/>
+              <w:bottom w:val="single" w:sz="4" w:space="0" w:color="auto"/>
+              <w:right w:val="single" w:sz="4" w:space="0" w:color="auto"/>
             </w:tcBorders>
             <w:shd w:val="clear" w:color="auto" w:fill="F2F2F2" w:themeFill="background1" w:themeFillShade="F2"/>
             <w:tcMar>
@@ -2984,7 +2875,7 @@
             <w:vAlign w:val="center"/>
             <w:hideMark/>
           </w:tcPr>
-          <w:p wp14:textId="77777777">
+          <w:p>
             <w:pPr>
               <w:spacing w:after="0" w:line="360" w:lineRule="auto"/>
               <w:rPr>
@@ -3012,7 +2903,7 @@
                 <w:sz w:val="24"/>
                 <w:szCs w:val="24"/>
                 <w:highlight w:val="yellow"/>
-                <w:bdr w:val="none" w:color="auto" w:sz="0" w:space="0" w:frame="1"/>
+                <w:bdr w:val="none" w:sz="0" w:space="0" w:color="auto" w:frame="1"/>
               </w:rPr>
               <w:t xml:space="preserve">/02/2012 a 24/04/2012 </w:t>
             </w:r>
@@ -3022,15 +2913,14 @@
           <w:tcPr>
             <w:tcW w:w="1821" w:type="pct"/>
             <w:tcBorders>
-              <w:top w:val="single" w:color="auto" w:sz="4" w:space="0"/>
-              <w:left w:val="single" w:color="auto" w:sz="4" w:space="0"/>
-              <w:bottom w:val="single" w:color="auto" w:sz="4" w:space="0"/>
-              <w:right w:val="single" w:color="auto" w:sz="4" w:space="0"/>
+              <w:top w:val="single" w:sz="4" w:space="0" w:color="auto"/>
+              <w:left w:val="single" w:sz="4" w:space="0" w:color="auto"/>
+              <w:bottom w:val="single" w:sz="4" w:space="0" w:color="auto"/>
+              <w:right w:val="single" w:sz="4" w:space="0" w:color="auto"/>
             </w:tcBorders>
             <w:shd w:val="clear" w:color="auto" w:fill="F2F2F2" w:themeFill="background1" w:themeFillShade="F2"/>
-            <w:tcMar/>
-          </w:tcPr>
-          <w:p wp14:textId="77777777">
+          </w:tcPr>
+          <w:p>
             <w:pPr>
               <w:spacing w:after="0" w:line="360" w:lineRule="auto"/>
               <w:ind w:left="148"/>
@@ -3107,15 +2997,15 @@
           </w:p>
         </w:tc>
       </w:tr>
-      <w:tr xmlns:wp14="http://schemas.microsoft.com/office/word/2010/wordml" wp14:textId="77777777">
+      <w:tr>
         <w:tc>
           <w:tcPr>
             <w:tcW w:w="1808" w:type="pct"/>
             <w:tcBorders>
-              <w:top w:val="single" w:color="auto" w:sz="4" w:space="0"/>
-              <w:left w:val="single" w:color="auto" w:sz="4" w:space="0"/>
-              <w:bottom w:val="single" w:color="auto" w:sz="4" w:space="0"/>
-              <w:right w:val="single" w:color="auto" w:sz="4" w:space="0"/>
+              <w:top w:val="single" w:sz="4" w:space="0" w:color="auto"/>
+              <w:left w:val="single" w:sz="4" w:space="0" w:color="auto"/>
+              <w:bottom w:val="single" w:sz="4" w:space="0" w:color="auto"/>
+              <w:right w:val="single" w:sz="4" w:space="0" w:color="auto"/>
             </w:tcBorders>
             <w:noWrap/>
             <w:tcMar>
@@ -3127,7 +3017,7 @@
             <w:vAlign w:val="center"/>
             <w:hideMark/>
           </w:tcPr>
-          <w:p wp14:textId="77777777">
+          <w:p>
             <w:pPr>
               <w:spacing w:after="0" w:line="240" w:lineRule="auto"/>
               <w:rPr>
@@ -3153,10 +3043,10 @@
           <w:tcPr>
             <w:tcW w:w="1370" w:type="pct"/>
             <w:tcBorders>
-              <w:top w:val="single" w:color="auto" w:sz="4" w:space="0"/>
-              <w:left w:val="single" w:color="auto" w:sz="4" w:space="0"/>
-              <w:bottom w:val="single" w:color="auto" w:sz="4" w:space="0"/>
-              <w:right w:val="single" w:color="auto" w:sz="4" w:space="0"/>
+              <w:top w:val="single" w:sz="4" w:space="0" w:color="auto"/>
+              <w:left w:val="single" w:sz="4" w:space="0" w:color="auto"/>
+              <w:bottom w:val="single" w:sz="4" w:space="0" w:color="auto"/>
+              <w:right w:val="single" w:sz="4" w:space="0" w:color="auto"/>
             </w:tcBorders>
             <w:tcMar>
               <w:top w:w="24" w:type="dxa"/>
@@ -3167,7 +3057,7 @@
             <w:vAlign w:val="center"/>
             <w:hideMark/>
           </w:tcPr>
-          <w:p wp14:textId="77777777">
+          <w:p>
             <w:pPr>
               <w:spacing w:after="0" w:line="360" w:lineRule="auto"/>
               <w:rPr>
@@ -3194,14 +3084,13 @@
           <w:tcPr>
             <w:tcW w:w="1821" w:type="pct"/>
             <w:tcBorders>
-              <w:top w:val="single" w:color="auto" w:sz="4" w:space="0"/>
-              <w:left w:val="single" w:color="auto" w:sz="4" w:space="0"/>
-              <w:bottom w:val="single" w:color="auto" w:sz="4" w:space="0"/>
-              <w:right w:val="single" w:color="auto" w:sz="4" w:space="0"/>
-            </w:tcBorders>
-            <w:tcMar/>
-          </w:tcPr>
-          <w:p wp14:textId="77777777">
+              <w:top w:val="single" w:sz="4" w:space="0" w:color="auto"/>
+              <w:left w:val="single" w:sz="4" w:space="0" w:color="auto"/>
+              <w:bottom w:val="single" w:sz="4" w:space="0" w:color="auto"/>
+              <w:right w:val="single" w:sz="4" w:space="0" w:color="auto"/>
+            </w:tcBorders>
+          </w:tcPr>
+          <w:p>
             <w:pPr>
               <w:spacing w:after="0" w:line="360" w:lineRule="auto"/>
               <w:ind w:left="148"/>
@@ -3226,15 +3115,15 @@
           </w:p>
         </w:tc>
       </w:tr>
-      <w:tr xmlns:wp14="http://schemas.microsoft.com/office/word/2010/wordml" wp14:textId="77777777">
+      <w:tr>
         <w:tc>
           <w:tcPr>
             <w:tcW w:w="1808" w:type="pct"/>
             <w:tcBorders>
-              <w:top w:val="single" w:color="auto" w:sz="4" w:space="0"/>
-              <w:left w:val="single" w:color="auto" w:sz="4" w:space="0"/>
-              <w:bottom w:val="single" w:color="auto" w:sz="4" w:space="0"/>
-              <w:right w:val="single" w:color="auto" w:sz="4" w:space="0"/>
+              <w:top w:val="single" w:sz="4" w:space="0" w:color="auto"/>
+              <w:left w:val="single" w:sz="4" w:space="0" w:color="auto"/>
+              <w:bottom w:val="single" w:sz="4" w:space="0" w:color="auto"/>
+              <w:right w:val="single" w:sz="4" w:space="0" w:color="auto"/>
             </w:tcBorders>
             <w:shd w:val="clear" w:color="auto" w:fill="FFFFFF" w:themeFill="background1"/>
             <w:noWrap/>
@@ -3247,7 +3136,7 @@
             <w:vAlign w:val="center"/>
             <w:hideMark/>
           </w:tcPr>
-          <w:p wp14:textId="77777777">
+          <w:p>
             <w:pPr>
               <w:spacing w:after="0" w:line="240" w:lineRule="auto"/>
               <w:rPr>
@@ -3273,10 +3162,10 @@
           <w:tcPr>
             <w:tcW w:w="1370" w:type="pct"/>
             <w:tcBorders>
-              <w:top w:val="single" w:color="auto" w:sz="4" w:space="0"/>
-              <w:left w:val="single" w:color="auto" w:sz="4" w:space="0"/>
-              <w:bottom w:val="single" w:color="auto" w:sz="4" w:space="0"/>
-              <w:right w:val="single" w:color="auto" w:sz="4" w:space="0"/>
+              <w:top w:val="single" w:sz="4" w:space="0" w:color="auto"/>
+              <w:left w:val="single" w:sz="4" w:space="0" w:color="auto"/>
+              <w:bottom w:val="single" w:sz="4" w:space="0" w:color="auto"/>
+              <w:right w:val="single" w:sz="4" w:space="0" w:color="auto"/>
             </w:tcBorders>
             <w:shd w:val="clear" w:color="auto" w:fill="FFFFFF" w:themeFill="background1"/>
             <w:tcMar>
@@ -3288,7 +3177,7 @@
             <w:vAlign w:val="center"/>
             <w:hideMark/>
           </w:tcPr>
-          <w:p wp14:textId="77777777">
+          <w:p>
             <w:pPr>
               <w:spacing w:after="0" w:line="360" w:lineRule="auto"/>
               <w:rPr>
@@ -3316,7 +3205,7 @@
                 <w:sz w:val="24"/>
                 <w:szCs w:val="24"/>
                 <w:highlight w:val="yellow"/>
-                <w:bdr w:val="none" w:color="auto" w:sz="0" w:space="0" w:frame="1"/>
+                <w:bdr w:val="none" w:sz="0" w:space="0" w:color="auto" w:frame="1"/>
               </w:rPr>
               <w:t>/04/2012 a 31/08/2012</w:t>
             </w:r>
@@ -3326,15 +3215,14 @@
           <w:tcPr>
             <w:tcW w:w="1821" w:type="pct"/>
             <w:tcBorders>
-              <w:top w:val="single" w:color="auto" w:sz="4" w:space="0"/>
-              <w:left w:val="single" w:color="auto" w:sz="4" w:space="0"/>
-              <w:bottom w:val="single" w:color="auto" w:sz="4" w:space="0"/>
-              <w:right w:val="single" w:color="auto" w:sz="4" w:space="0"/>
+              <w:top w:val="single" w:sz="4" w:space="0" w:color="auto"/>
+              <w:left w:val="single" w:sz="4" w:space="0" w:color="auto"/>
+              <w:bottom w:val="single" w:sz="4" w:space="0" w:color="auto"/>
+              <w:right w:val="single" w:sz="4" w:space="0" w:color="auto"/>
             </w:tcBorders>
             <w:shd w:val="clear" w:color="auto" w:fill="FFFFFF" w:themeFill="background1"/>
-            <w:tcMar/>
-          </w:tcPr>
-          <w:p wp14:textId="77777777">
+          </w:tcPr>
+          <w:p>
             <w:pPr>
               <w:spacing w:after="0" w:line="360" w:lineRule="auto"/>
               <w:ind w:left="148"/>
@@ -3375,15 +3263,15 @@
           </w:p>
         </w:tc>
       </w:tr>
-      <w:tr xmlns:wp14="http://schemas.microsoft.com/office/word/2010/wordml" wp14:textId="77777777">
+      <w:tr>
         <w:tc>
           <w:tcPr>
             <w:tcW w:w="1808" w:type="pct"/>
             <w:tcBorders>
-              <w:top w:val="single" w:color="auto" w:sz="4" w:space="0"/>
-              <w:left w:val="single" w:color="auto" w:sz="4" w:space="0"/>
-              <w:bottom w:val="single" w:color="auto" w:sz="4" w:space="0"/>
-              <w:right w:val="single" w:color="auto" w:sz="4" w:space="0"/>
+              <w:top w:val="single" w:sz="4" w:space="0" w:color="auto"/>
+              <w:left w:val="single" w:sz="4" w:space="0" w:color="auto"/>
+              <w:bottom w:val="single" w:sz="4" w:space="0" w:color="auto"/>
+              <w:right w:val="single" w:sz="4" w:space="0" w:color="auto"/>
             </w:tcBorders>
             <w:shd w:val="clear" w:color="auto" w:fill="F2F2F2" w:themeFill="background1" w:themeFillShade="F2"/>
             <w:noWrap/>
@@ -3396,7 +3284,7 @@
             <w:vAlign w:val="center"/>
             <w:hideMark/>
           </w:tcPr>
-          <w:p wp14:textId="77777777">
+          <w:p>
             <w:pPr>
               <w:spacing w:after="0" w:line="240" w:lineRule="auto"/>
               <w:rPr>
@@ -3422,10 +3310,10 @@
           <w:tcPr>
             <w:tcW w:w="1370" w:type="pct"/>
             <w:tcBorders>
-              <w:top w:val="single" w:color="auto" w:sz="4" w:space="0"/>
-              <w:left w:val="single" w:color="auto" w:sz="4" w:space="0"/>
-              <w:bottom w:val="single" w:color="auto" w:sz="4" w:space="0"/>
-              <w:right w:val="single" w:color="auto" w:sz="4" w:space="0"/>
+              <w:top w:val="single" w:sz="4" w:space="0" w:color="auto"/>
+              <w:left w:val="single" w:sz="4" w:space="0" w:color="auto"/>
+              <w:bottom w:val="single" w:sz="4" w:space="0" w:color="auto"/>
+              <w:right w:val="single" w:sz="4" w:space="0" w:color="auto"/>
             </w:tcBorders>
             <w:shd w:val="clear" w:color="auto" w:fill="F2F2F2" w:themeFill="background1" w:themeFillShade="F2"/>
             <w:tcMar>
@@ -3437,7 +3325,7 @@
             <w:vAlign w:val="center"/>
             <w:hideMark/>
           </w:tcPr>
-          <w:p wp14:textId="77777777">
+          <w:p>
             <w:pPr>
               <w:spacing w:after="0" w:line="360" w:lineRule="auto"/>
               <w:rPr>
@@ -3465,15 +3353,14 @@
           <w:tcPr>
             <w:tcW w:w="1821" w:type="pct"/>
             <w:tcBorders>
-              <w:top w:val="single" w:color="auto" w:sz="4" w:space="0"/>
-              <w:left w:val="single" w:color="auto" w:sz="4" w:space="0"/>
-              <w:bottom w:val="single" w:color="auto" w:sz="4" w:space="0"/>
-              <w:right w:val="single" w:color="auto" w:sz="4" w:space="0"/>
+              <w:top w:val="single" w:sz="4" w:space="0" w:color="auto"/>
+              <w:left w:val="single" w:sz="4" w:space="0" w:color="auto"/>
+              <w:bottom w:val="single" w:sz="4" w:space="0" w:color="auto"/>
+              <w:right w:val="single" w:sz="4" w:space="0" w:color="auto"/>
             </w:tcBorders>
             <w:shd w:val="clear" w:color="auto" w:fill="F2F2F2" w:themeFill="background1" w:themeFillShade="F2"/>
-            <w:tcMar/>
-          </w:tcPr>
-          <w:p wp14:textId="77777777">
+          </w:tcPr>
+          <w:p>
             <w:pPr>
               <w:spacing w:after="0" w:line="360" w:lineRule="auto"/>
               <w:ind w:left="148"/>
@@ -3498,15 +3385,15 @@
           </w:p>
         </w:tc>
       </w:tr>
-      <w:tr xmlns:wp14="http://schemas.microsoft.com/office/word/2010/wordml" wp14:textId="77777777">
+      <w:tr>
         <w:tc>
           <w:tcPr>
             <w:tcW w:w="1808" w:type="pct"/>
             <w:tcBorders>
-              <w:top w:val="single" w:color="auto" w:sz="4" w:space="0"/>
-              <w:left w:val="single" w:color="auto" w:sz="4" w:space="0"/>
-              <w:bottom w:val="single" w:color="auto" w:sz="4" w:space="0"/>
-              <w:right w:val="single" w:color="auto" w:sz="4" w:space="0"/>
+              <w:top w:val="single" w:sz="4" w:space="0" w:color="auto"/>
+              <w:left w:val="single" w:sz="4" w:space="0" w:color="auto"/>
+              <w:bottom w:val="single" w:sz="4" w:space="0" w:color="auto"/>
+              <w:right w:val="single" w:sz="4" w:space="0" w:color="auto"/>
             </w:tcBorders>
             <w:shd w:val="clear" w:color="auto" w:fill="F2F2F2" w:themeFill="background1" w:themeFillShade="F2"/>
             <w:noWrap/>
@@ -3519,7 +3406,7 @@
             <w:vAlign w:val="center"/>
             <w:hideMark/>
           </w:tcPr>
-          <w:p wp14:textId="77777777">
+          <w:p>
             <w:pPr>
               <w:spacing w:after="0" w:line="240" w:lineRule="auto"/>
               <w:rPr>
@@ -3545,10 +3432,10 @@
           <w:tcPr>
             <w:tcW w:w="1370" w:type="pct"/>
             <w:tcBorders>
-              <w:top w:val="single" w:color="auto" w:sz="4" w:space="0"/>
-              <w:left w:val="single" w:color="auto" w:sz="4" w:space="0"/>
-              <w:bottom w:val="single" w:color="auto" w:sz="4" w:space="0"/>
-              <w:right w:val="single" w:color="auto" w:sz="4" w:space="0"/>
+              <w:top w:val="single" w:sz="4" w:space="0" w:color="auto"/>
+              <w:left w:val="single" w:sz="4" w:space="0" w:color="auto"/>
+              <w:bottom w:val="single" w:sz="4" w:space="0" w:color="auto"/>
+              <w:right w:val="single" w:sz="4" w:space="0" w:color="auto"/>
             </w:tcBorders>
             <w:shd w:val="clear" w:color="auto" w:fill="F2F2F2" w:themeFill="background1" w:themeFillShade="F2"/>
             <w:tcMar>
@@ -3560,7 +3447,7 @@
             <w:vAlign w:val="center"/>
             <w:hideMark/>
           </w:tcPr>
-          <w:p wp14:textId="77777777">
+          <w:p>
             <w:pPr>
               <w:spacing w:after="0" w:line="360" w:lineRule="auto"/>
               <w:rPr>
@@ -3569,7 +3456,7 @@
                 <w:sz w:val="24"/>
                 <w:szCs w:val="24"/>
                 <w:highlight w:val="yellow"/>
-                <w:bdr w:val="none" w:color="auto" w:sz="0" w:space="0" w:frame="1"/>
+                <w:bdr w:val="none" w:sz="0" w:space="0" w:color="auto" w:frame="1"/>
               </w:rPr>
             </w:pPr>
             <w:r>
@@ -3589,7 +3476,7 @@
                 <w:sz w:val="24"/>
                 <w:szCs w:val="24"/>
                 <w:highlight w:val="yellow"/>
-                <w:bdr w:val="none" w:color="auto" w:sz="0" w:space="0" w:frame="1"/>
+                <w:bdr w:val="none" w:sz="0" w:space="0" w:color="auto" w:frame="1"/>
               </w:rPr>
               <w:t>/06/2014 a 21/07/2015</w:t>
             </w:r>
@@ -3599,15 +3486,14 @@
           <w:tcPr>
             <w:tcW w:w="1821" w:type="pct"/>
             <w:tcBorders>
-              <w:top w:val="single" w:color="auto" w:sz="4" w:space="0"/>
-              <w:left w:val="single" w:color="auto" w:sz="4" w:space="0"/>
-              <w:bottom w:val="single" w:color="auto" w:sz="4" w:space="0"/>
-              <w:right w:val="single" w:color="auto" w:sz="4" w:space="0"/>
+              <w:top w:val="single" w:sz="4" w:space="0" w:color="auto"/>
+              <w:left w:val="single" w:sz="4" w:space="0" w:color="auto"/>
+              <w:bottom w:val="single" w:sz="4" w:space="0" w:color="auto"/>
+              <w:right w:val="single" w:sz="4" w:space="0" w:color="auto"/>
             </w:tcBorders>
             <w:shd w:val="clear" w:color="auto" w:fill="F2F2F2" w:themeFill="background1" w:themeFillShade="F2"/>
-            <w:tcMar/>
-          </w:tcPr>
-          <w:p wp14:textId="77777777">
+          </w:tcPr>
+          <w:p>
             <w:pPr>
               <w:spacing w:after="0" w:line="360" w:lineRule="auto"/>
               <w:ind w:left="148"/>
@@ -3621,15 +3507,15 @@
           </w:p>
         </w:tc>
       </w:tr>
-      <w:tr xmlns:wp14="http://schemas.microsoft.com/office/word/2010/wordml" wp14:textId="77777777">
+      <w:tr>
         <w:tc>
           <w:tcPr>
             <w:tcW w:w="1808" w:type="pct"/>
             <w:tcBorders>
-              <w:top w:val="single" w:color="auto" w:sz="4" w:space="0"/>
-              <w:left w:val="single" w:color="auto" w:sz="4" w:space="0"/>
-              <w:bottom w:val="single" w:color="auto" w:sz="4" w:space="0"/>
-              <w:right w:val="single" w:color="auto" w:sz="4" w:space="0"/>
+              <w:top w:val="single" w:sz="4" w:space="0" w:color="auto"/>
+              <w:left w:val="single" w:sz="4" w:space="0" w:color="auto"/>
+              <w:bottom w:val="single" w:sz="4" w:space="0" w:color="auto"/>
+              <w:right w:val="single" w:sz="4" w:space="0" w:color="auto"/>
             </w:tcBorders>
             <w:shd w:val="clear" w:color="auto" w:fill="FFFFFF" w:themeFill="background1"/>
             <w:noWrap/>
@@ -3642,7 +3528,7 @@
             <w:vAlign w:val="center"/>
             <w:hideMark/>
           </w:tcPr>
-          <w:p wp14:textId="77777777">
+          <w:p>
             <w:pPr>
               <w:spacing w:after="0" w:line="240" w:lineRule="auto"/>
               <w:rPr>
@@ -3668,10 +3554,10 @@
           <w:tcPr>
             <w:tcW w:w="1370" w:type="pct"/>
             <w:tcBorders>
-              <w:top w:val="single" w:color="auto" w:sz="4" w:space="0"/>
-              <w:left w:val="single" w:color="auto" w:sz="4" w:space="0"/>
-              <w:bottom w:val="single" w:color="auto" w:sz="4" w:space="0"/>
-              <w:right w:val="single" w:color="auto" w:sz="4" w:space="0"/>
+              <w:top w:val="single" w:sz="4" w:space="0" w:color="auto"/>
+              <w:left w:val="single" w:sz="4" w:space="0" w:color="auto"/>
+              <w:bottom w:val="single" w:sz="4" w:space="0" w:color="auto"/>
+              <w:right w:val="single" w:sz="4" w:space="0" w:color="auto"/>
             </w:tcBorders>
             <w:shd w:val="clear" w:color="auto" w:fill="FFFFFF" w:themeFill="background1"/>
             <w:tcMar>
@@ -3683,7 +3569,7 @@
             <w:vAlign w:val="center"/>
             <w:hideMark/>
           </w:tcPr>
-          <w:p wp14:textId="77777777">
+          <w:p>
             <w:pPr>
               <w:spacing w:after="0" w:line="360" w:lineRule="auto"/>
               <w:rPr>
@@ -3693,7 +3579,7 @@
                 <w:sz w:val="24"/>
                 <w:szCs w:val="24"/>
                 <w:highlight w:val="yellow"/>
-                <w:bdr w:val="none" w:color="auto" w:sz="0" w:space="0" w:frame="1"/>
+                <w:bdr w:val="none" w:sz="0" w:space="0" w:color="auto" w:frame="1"/>
               </w:rPr>
             </w:pPr>
             <w:r>
@@ -3704,7 +3590,7 @@
                 <w:sz w:val="24"/>
                 <w:szCs w:val="24"/>
                 <w:highlight w:val="yellow"/>
-                <w:bdr w:val="none" w:color="auto" w:sz="0" w:space="0" w:frame="1"/>
+                <w:bdr w:val="none" w:sz="0" w:space="0" w:color="auto" w:frame="1"/>
               </w:rPr>
               <w:t>R$ 25.643,31</w:t>
             </w:r>
@@ -3724,15 +3610,14 @@
           <w:tcPr>
             <w:tcW w:w="1821" w:type="pct"/>
             <w:tcBorders>
-              <w:top w:val="single" w:color="auto" w:sz="4" w:space="0"/>
-              <w:left w:val="single" w:color="auto" w:sz="4" w:space="0"/>
-              <w:bottom w:val="single" w:color="auto" w:sz="4" w:space="0"/>
-              <w:right w:val="single" w:color="auto" w:sz="4" w:space="0"/>
+              <w:top w:val="single" w:sz="4" w:space="0" w:color="auto"/>
+              <w:left w:val="single" w:sz="4" w:space="0" w:color="auto"/>
+              <w:bottom w:val="single" w:sz="4" w:space="0" w:color="auto"/>
+              <w:right w:val="single" w:sz="4" w:space="0" w:color="auto"/>
             </w:tcBorders>
             <w:shd w:val="clear" w:color="auto" w:fill="FFFFFF" w:themeFill="background1"/>
-            <w:tcMar/>
-          </w:tcPr>
-          <w:p wp14:textId="77777777">
+          </w:tcPr>
+          <w:p>
             <w:pPr>
               <w:spacing w:after="0" w:line="360" w:lineRule="auto"/>
               <w:ind w:left="148"/>
@@ -3743,7 +3628,7 @@
                 <w:sz w:val="24"/>
                 <w:szCs w:val="24"/>
                 <w:highlight w:val="yellow"/>
-                <w:bdr w:val="none" w:color="auto" w:sz="0" w:space="0" w:frame="1"/>
+                <w:bdr w:val="none" w:sz="0" w:space="0" w:color="auto" w:frame="1"/>
               </w:rPr>
             </w:pPr>
             <w:r>
@@ -3759,15 +3644,15 @@
           </w:p>
         </w:tc>
       </w:tr>
-      <w:tr xmlns:wp14="http://schemas.microsoft.com/office/word/2010/wordml" wp14:textId="77777777">
+      <w:tr>
         <w:tc>
           <w:tcPr>
             <w:tcW w:w="1808" w:type="pct"/>
             <w:tcBorders>
-              <w:top w:val="single" w:color="auto" w:sz="4" w:space="0"/>
-              <w:left w:val="single" w:color="auto" w:sz="4" w:space="0"/>
-              <w:bottom w:val="single" w:color="auto" w:sz="4" w:space="0"/>
-              <w:right w:val="single" w:color="auto" w:sz="4" w:space="0"/>
+              <w:top w:val="single" w:sz="4" w:space="0" w:color="auto"/>
+              <w:left w:val="single" w:sz="4" w:space="0" w:color="auto"/>
+              <w:bottom w:val="single" w:sz="4" w:space="0" w:color="auto"/>
+              <w:right w:val="single" w:sz="4" w:space="0" w:color="auto"/>
             </w:tcBorders>
             <w:shd w:val="clear" w:color="auto" w:fill="FFFFFF" w:themeFill="background1"/>
             <w:noWrap/>
@@ -3780,7 +3665,7 @@
             <w:vAlign w:val="center"/>
             <w:hideMark/>
           </w:tcPr>
-          <w:p wp14:textId="77777777">
+          <w:p>
             <w:pPr>
               <w:spacing w:after="0" w:line="240" w:lineRule="auto"/>
               <w:rPr>
@@ -3805,10 +3690,10 @@
           <w:tcPr>
             <w:tcW w:w="1370" w:type="pct"/>
             <w:tcBorders>
-              <w:top w:val="single" w:color="auto" w:sz="4" w:space="0"/>
-              <w:left w:val="single" w:color="auto" w:sz="4" w:space="0"/>
-              <w:bottom w:val="single" w:color="auto" w:sz="4" w:space="0"/>
-              <w:right w:val="single" w:color="auto" w:sz="4" w:space="0"/>
+              <w:top w:val="single" w:sz="4" w:space="0" w:color="auto"/>
+              <w:left w:val="single" w:sz="4" w:space="0" w:color="auto"/>
+              <w:bottom w:val="single" w:sz="4" w:space="0" w:color="auto"/>
+              <w:right w:val="single" w:sz="4" w:space="0" w:color="auto"/>
             </w:tcBorders>
             <w:shd w:val="clear" w:color="auto" w:fill="FFFFFF" w:themeFill="background1"/>
             <w:tcMar>
@@ -3820,7 +3705,7 @@
             <w:vAlign w:val="center"/>
             <w:hideMark/>
           </w:tcPr>
-          <w:p wp14:textId="77777777">
+          <w:p>
             <w:pPr>
               <w:spacing w:after="0" w:line="360" w:lineRule="auto"/>
               <w:rPr>
@@ -3857,15 +3742,14 @@
           <w:tcPr>
             <w:tcW w:w="1821" w:type="pct"/>
             <w:tcBorders>
-              <w:top w:val="single" w:color="auto" w:sz="4" w:space="0"/>
-              <w:left w:val="single" w:color="auto" w:sz="4" w:space="0"/>
-              <w:bottom w:val="single" w:color="auto" w:sz="4" w:space="0"/>
-              <w:right w:val="single" w:color="auto" w:sz="4" w:space="0"/>
+              <w:top w:val="single" w:sz="4" w:space="0" w:color="auto"/>
+              <w:left w:val="single" w:sz="4" w:space="0" w:color="auto"/>
+              <w:bottom w:val="single" w:sz="4" w:space="0" w:color="auto"/>
+              <w:right w:val="single" w:sz="4" w:space="0" w:color="auto"/>
             </w:tcBorders>
             <w:shd w:val="clear" w:color="auto" w:fill="FFFFFF" w:themeFill="background1"/>
-            <w:tcMar/>
-          </w:tcPr>
-          <w:p wp14:textId="77777777">
+          </w:tcPr>
+          <w:p>
             <w:pPr>
               <w:spacing w:after="0" w:line="360" w:lineRule="auto"/>
               <w:ind w:left="148"/>
@@ -3879,15 +3763,15 @@
           </w:p>
         </w:tc>
       </w:tr>
-      <w:tr xmlns:wp14="http://schemas.microsoft.com/office/word/2010/wordml" wp14:textId="77777777">
+      <w:tr>
         <w:tc>
           <w:tcPr>
             <w:tcW w:w="1808" w:type="pct"/>
             <w:tcBorders>
-              <w:top w:val="single" w:color="auto" w:sz="4" w:space="0"/>
-              <w:left w:val="single" w:color="auto" w:sz="4" w:space="0"/>
-              <w:bottom w:val="single" w:color="auto" w:sz="4" w:space="0"/>
-              <w:right w:val="single" w:color="auto" w:sz="4" w:space="0"/>
+              <w:top w:val="single" w:sz="4" w:space="0" w:color="auto"/>
+              <w:left w:val="single" w:sz="4" w:space="0" w:color="auto"/>
+              <w:bottom w:val="single" w:sz="4" w:space="0" w:color="auto"/>
+              <w:right w:val="single" w:sz="4" w:space="0" w:color="auto"/>
             </w:tcBorders>
             <w:shd w:val="clear" w:color="auto" w:fill="F2F2F2" w:themeFill="background1" w:themeFillShade="F2"/>
             <w:noWrap/>
@@ -3900,7 +3784,7 @@
             <w:vAlign w:val="center"/>
             <w:hideMark/>
           </w:tcPr>
-          <w:p wp14:textId="77777777">
+          <w:p>
             <w:pPr>
               <w:spacing w:after="0" w:line="240" w:lineRule="auto"/>
               <w:rPr>
@@ -3925,10 +3809,10 @@
           <w:tcPr>
             <w:tcW w:w="1370" w:type="pct"/>
             <w:tcBorders>
-              <w:top w:val="single" w:color="auto" w:sz="4" w:space="0"/>
-              <w:left w:val="single" w:color="auto" w:sz="4" w:space="0"/>
-              <w:bottom w:val="single" w:color="auto" w:sz="4" w:space="0"/>
-              <w:right w:val="single" w:color="auto" w:sz="4" w:space="0"/>
+              <w:top w:val="single" w:sz="4" w:space="0" w:color="auto"/>
+              <w:left w:val="single" w:sz="4" w:space="0" w:color="auto"/>
+              <w:bottom w:val="single" w:sz="4" w:space="0" w:color="auto"/>
+              <w:right w:val="single" w:sz="4" w:space="0" w:color="auto"/>
             </w:tcBorders>
             <w:shd w:val="clear" w:color="auto" w:fill="F2F2F2" w:themeFill="background1" w:themeFillShade="F2"/>
             <w:tcMar>
@@ -3940,7 +3824,7 @@
             <w:vAlign w:val="center"/>
             <w:hideMark/>
           </w:tcPr>
-          <w:p wp14:textId="77777777">
+          <w:p>
             <w:pPr>
               <w:spacing w:after="0" w:line="360" w:lineRule="auto"/>
               <w:rPr>
@@ -3967,15 +3851,14 @@
           <w:tcPr>
             <w:tcW w:w="1821" w:type="pct"/>
             <w:tcBorders>
-              <w:top w:val="single" w:color="auto" w:sz="4" w:space="0"/>
-              <w:left w:val="single" w:color="auto" w:sz="4" w:space="0"/>
-              <w:bottom w:val="single" w:color="auto" w:sz="4" w:space="0"/>
-              <w:right w:val="single" w:color="auto" w:sz="4" w:space="0"/>
+              <w:top w:val="single" w:sz="4" w:space="0" w:color="auto"/>
+              <w:left w:val="single" w:sz="4" w:space="0" w:color="auto"/>
+              <w:bottom w:val="single" w:sz="4" w:space="0" w:color="auto"/>
+              <w:right w:val="single" w:sz="4" w:space="0" w:color="auto"/>
             </w:tcBorders>
             <w:shd w:val="clear" w:color="auto" w:fill="F2F2F2" w:themeFill="background1" w:themeFillShade="F2"/>
-            <w:tcMar/>
-          </w:tcPr>
-          <w:p wp14:textId="77777777">
+          </w:tcPr>
+          <w:p>
             <w:pPr>
               <w:spacing w:after="0" w:line="360" w:lineRule="auto"/>
               <w:ind w:left="148"/>
@@ -4000,15 +3883,15 @@
           </w:p>
         </w:tc>
       </w:tr>
-      <w:tr xmlns:wp14="http://schemas.microsoft.com/office/word/2010/wordml" wp14:textId="77777777">
+      <w:tr>
         <w:tc>
           <w:tcPr>
             <w:tcW w:w="1808" w:type="pct"/>
             <w:tcBorders>
-              <w:top w:val="single" w:color="auto" w:sz="4" w:space="0"/>
-              <w:left w:val="single" w:color="auto" w:sz="4" w:space="0"/>
-              <w:bottom w:val="single" w:color="auto" w:sz="4" w:space="0"/>
-              <w:right w:val="single" w:color="auto" w:sz="4" w:space="0"/>
+              <w:top w:val="single" w:sz="4" w:space="0" w:color="auto"/>
+              <w:left w:val="single" w:sz="4" w:space="0" w:color="auto"/>
+              <w:bottom w:val="single" w:sz="4" w:space="0" w:color="auto"/>
+              <w:right w:val="single" w:sz="4" w:space="0" w:color="auto"/>
             </w:tcBorders>
             <w:shd w:val="clear" w:color="auto" w:fill="F2F2F2" w:themeFill="background1" w:themeFillShade="F2"/>
             <w:noWrap/>
@@ -4021,7 +3904,7 @@
             <w:vAlign w:val="center"/>
             <w:hideMark/>
           </w:tcPr>
-          <w:p wp14:textId="77777777">
+          <w:p>
             <w:pPr>
               <w:spacing w:after="0" w:line="240" w:lineRule="auto"/>
               <w:rPr>
@@ -4046,10 +3929,10 @@
           <w:tcPr>
             <w:tcW w:w="1370" w:type="pct"/>
             <w:tcBorders>
-              <w:top w:val="single" w:color="auto" w:sz="4" w:space="0"/>
-              <w:left w:val="single" w:color="auto" w:sz="4" w:space="0"/>
-              <w:bottom w:val="single" w:color="auto" w:sz="4" w:space="0"/>
-              <w:right w:val="single" w:color="auto" w:sz="4" w:space="0"/>
+              <w:top w:val="single" w:sz="4" w:space="0" w:color="auto"/>
+              <w:left w:val="single" w:sz="4" w:space="0" w:color="auto"/>
+              <w:bottom w:val="single" w:sz="4" w:space="0" w:color="auto"/>
+              <w:right w:val="single" w:sz="4" w:space="0" w:color="auto"/>
             </w:tcBorders>
             <w:shd w:val="clear" w:color="auto" w:fill="F2F2F2" w:themeFill="background1" w:themeFillShade="F2"/>
             <w:tcMar>
@@ -4061,7 +3944,7 @@
             <w:vAlign w:val="center"/>
             <w:hideMark/>
           </w:tcPr>
-          <w:p wp14:textId="77777777">
+          <w:p>
             <w:pPr>
               <w:spacing w:after="0" w:line="360" w:lineRule="auto"/>
               <w:rPr>
@@ -4098,15 +3981,14 @@
           <w:tcPr>
             <w:tcW w:w="1821" w:type="pct"/>
             <w:tcBorders>
-              <w:top w:val="single" w:color="auto" w:sz="4" w:space="0"/>
-              <w:left w:val="single" w:color="auto" w:sz="4" w:space="0"/>
-              <w:bottom w:val="single" w:color="auto" w:sz="4" w:space="0"/>
-              <w:right w:val="single" w:color="auto" w:sz="4" w:space="0"/>
+              <w:top w:val="single" w:sz="4" w:space="0" w:color="auto"/>
+              <w:left w:val="single" w:sz="4" w:space="0" w:color="auto"/>
+              <w:bottom w:val="single" w:sz="4" w:space="0" w:color="auto"/>
+              <w:right w:val="single" w:sz="4" w:space="0" w:color="auto"/>
             </w:tcBorders>
             <w:shd w:val="clear" w:color="auto" w:fill="F2F2F2" w:themeFill="background1" w:themeFillShade="F2"/>
-            <w:tcMar/>
-          </w:tcPr>
-          <w:p wp14:textId="77777777">
+          </w:tcPr>
+          <w:p>
             <w:pPr>
               <w:spacing w:after="0" w:line="360" w:lineRule="auto"/>
               <w:ind w:left="148"/>
@@ -4120,15 +4002,15 @@
           </w:p>
         </w:tc>
       </w:tr>
-      <w:tr xmlns:wp14="http://schemas.microsoft.com/office/word/2010/wordml" wp14:textId="77777777">
+      <w:tr>
         <w:tc>
           <w:tcPr>
             <w:tcW w:w="1808" w:type="pct"/>
             <w:tcBorders>
-              <w:top w:val="single" w:color="auto" w:sz="4" w:space="0"/>
-              <w:left w:val="single" w:color="auto" w:sz="4" w:space="0"/>
-              <w:bottom w:val="single" w:color="auto" w:sz="4" w:space="0"/>
-              <w:right w:val="single" w:color="auto" w:sz="4" w:space="0"/>
+              <w:top w:val="single" w:sz="4" w:space="0" w:color="auto"/>
+              <w:left w:val="single" w:sz="4" w:space="0" w:color="auto"/>
+              <w:bottom w:val="single" w:sz="4" w:space="0" w:color="auto"/>
+              <w:right w:val="single" w:sz="4" w:space="0" w:color="auto"/>
             </w:tcBorders>
             <w:shd w:val="clear" w:color="auto" w:fill="FFFFFF" w:themeFill="background1"/>
             <w:noWrap/>
@@ -4140,7 +4022,7 @@
             </w:tcMar>
             <w:vAlign w:val="center"/>
           </w:tcPr>
-          <w:p wp14:textId="77777777">
+          <w:p>
             <w:pPr>
               <w:spacing w:after="0" w:line="240" w:lineRule="auto"/>
               <w:jc w:val="center"/>
@@ -4166,10 +4048,10 @@
           <w:tcPr>
             <w:tcW w:w="1370" w:type="pct"/>
             <w:tcBorders>
-              <w:top w:val="single" w:color="auto" w:sz="4" w:space="0"/>
-              <w:left w:val="single" w:color="auto" w:sz="4" w:space="0"/>
-              <w:bottom w:val="single" w:color="auto" w:sz="4" w:space="0"/>
-              <w:right w:val="single" w:color="auto" w:sz="4" w:space="0"/>
+              <w:top w:val="single" w:sz="4" w:space="0" w:color="auto"/>
+              <w:left w:val="single" w:sz="4" w:space="0" w:color="auto"/>
+              <w:bottom w:val="single" w:sz="4" w:space="0" w:color="auto"/>
+              <w:right w:val="single" w:sz="4" w:space="0" w:color="auto"/>
             </w:tcBorders>
             <w:shd w:val="clear" w:color="auto" w:fill="FFFFFF" w:themeFill="background1"/>
             <w:tcMar>
@@ -4180,7 +4062,7 @@
             </w:tcMar>
             <w:vAlign w:val="center"/>
           </w:tcPr>
-          <w:p wp14:textId="77777777">
+          <w:p>
             <w:pPr>
               <w:spacing w:after="0" w:line="360" w:lineRule="auto"/>
               <w:rPr>
@@ -4216,15 +4098,14 @@
           <w:tcPr>
             <w:tcW w:w="1821" w:type="pct"/>
             <w:tcBorders>
-              <w:top w:val="single" w:color="auto" w:sz="4" w:space="0"/>
-              <w:left w:val="single" w:color="auto" w:sz="4" w:space="0"/>
-              <w:bottom w:val="single" w:color="auto" w:sz="4" w:space="0"/>
-              <w:right w:val="single" w:color="auto" w:sz="4" w:space="0"/>
+              <w:top w:val="single" w:sz="4" w:space="0" w:color="auto"/>
+              <w:left w:val="single" w:sz="4" w:space="0" w:color="auto"/>
+              <w:bottom w:val="single" w:sz="4" w:space="0" w:color="auto"/>
+              <w:right w:val="single" w:sz="4" w:space="0" w:color="auto"/>
             </w:tcBorders>
             <w:shd w:val="clear" w:color="auto" w:fill="FFFFFF" w:themeFill="background1"/>
-            <w:tcMar/>
-          </w:tcPr>
-          <w:p wp14:textId="77777777">
+          </w:tcPr>
+          <w:p>
             <w:pPr>
               <w:spacing w:after="0" w:line="360" w:lineRule="auto"/>
               <w:ind w:left="148"/>
@@ -4249,7 +4130,7 @@
         </w:tc>
       </w:tr>
     </w:tbl>
-    <w:p xmlns:wp14="http://schemas.microsoft.com/office/word/2010/wordml" wp14:textId="77777777">
+    <w:p>
       <w:pPr>
         <w:pStyle w:val="NormalWeb"/>
         <w:shd w:val="clear" w:color="auto" w:fill="FFFFFF" w:themeFill="background1"/>
@@ -4263,7 +4144,7 @@
         </w:rPr>
       </w:pPr>
     </w:p>
-    <w:p xmlns:wp14="http://schemas.microsoft.com/office/word/2010/wordml" wp14:textId="77777777">
+    <w:p>
       <w:pPr>
         <w:pStyle w:val="NormalWeb"/>
         <w:shd w:val="clear" w:color="auto" w:fill="FFFFFF" w:themeFill="background1"/>
@@ -4296,7 +4177,7 @@
         <w:tab/>
       </w:r>
     </w:p>
-    <w:p xmlns:wp14="http://schemas.microsoft.com/office/word/2010/wordml" wp14:textId="77777777">
+    <w:p>
       <w:pPr>
         <w:pStyle w:val="NormalWeb"/>
         <w:shd w:val="clear" w:color="auto" w:fill="FFFFFF" w:themeFill="background1"/>
@@ -4310,7 +4191,7 @@
         </w:rPr>
       </w:pPr>
     </w:p>
-    <w:p xmlns:wp14="http://schemas.microsoft.com/office/word/2010/wordml" wp14:textId="77777777">
+    <w:p>
       <w:pPr>
         <w:pStyle w:val="NormalWeb"/>
         <w:shd w:val="clear" w:color="auto" w:fill="FFFFFF" w:themeFill="background1"/>
@@ -4563,7 +4444,7 @@
         <w:t xml:space="preserve"> </w:t>
       </w:r>
     </w:p>
-    <w:p xmlns:wp14="http://schemas.microsoft.com/office/word/2010/wordml" wp14:textId="77777777">
+    <w:p>
       <w:pPr>
         <w:pStyle w:val="Recuodecorpodetexto"/>
         <w:ind w:right="-994" w:firstLine="1701"/>
@@ -4581,8 +4462,10 @@
           <w:szCs w:val="24"/>
           <w:highlight w:val="yellow"/>
         </w:rPr>
+        <w:lastRenderedPageBreak/>
         <w:t xml:space="preserve">Concluirmos que a </w:t>
       </w:r>
+      <w:proofErr w:type="spellStart"/>
       <w:r>
         <w:rPr>
           <w:b/>
@@ -4596,23 +4479,24 @@
           <w:b/>
           <w:szCs w:val="24"/>
         </w:rPr>
-        <w:t xml:space="preserve">onobre Engenharia Construção e Comercio </w:t>
-      </w:r>
-      <w:proofErr w:type="spellStart"/>
+        <w:t>onobre</w:t>
+      </w:r>
+      <w:proofErr w:type="spellEnd"/>
       <w:r>
         <w:rPr>
           <w:b/>
           <w:szCs w:val="24"/>
         </w:rPr>
-        <w:t>ltda</w:t>
-      </w:r>
-      <w:proofErr w:type="spellEnd"/>
-      <w:r>
-        <w:rPr>
-          <w:b/>
+        <w:t xml:space="preserve"> Engenharia Construção e Comercio ltda, CNPJ Nº 04.934.819/0001-87</w:t>
+      </w:r>
+      <w:r>
+        <w:rPr>
+          <w:b/>
+          <w:color w:val="000000" w:themeColor="text1"/>
           <w:szCs w:val="24"/>
-        </w:rPr>
-        <w:t>, CNPJ Nº 04.934.819/0001-87</w:t>
+          <w:highlight w:val="yellow"/>
+        </w:rPr>
+        <w:t xml:space="preserve">, se encontra executado a </w:t>
       </w:r>
       <w:r>
         <w:rPr>
@@ -4621,7 +4505,7 @@
           <w:szCs w:val="24"/>
           <w:highlight w:val="yellow"/>
         </w:rPr>
-        <w:t xml:space="preserve">, se encontra executado a </w:t>
+        <w:t>o</w:t>
       </w:r>
       <w:r>
         <w:rPr>
@@ -4630,7 +4514,7 @@
           <w:szCs w:val="24"/>
           <w:highlight w:val="yellow"/>
         </w:rPr>
-        <w:t>o</w:t>
+        <w:t>bra</w:t>
       </w:r>
       <w:r>
         <w:rPr>
@@ -4639,7 +4523,7 @@
           <w:szCs w:val="24"/>
           <w:highlight w:val="yellow"/>
         </w:rPr>
-        <w:t>bra</w:t>
+        <w:t xml:space="preserve">, com </w:t>
       </w:r>
       <w:r>
         <w:rPr>
@@ -4648,16 +4532,15 @@
           <w:szCs w:val="24"/>
           <w:highlight w:val="yellow"/>
         </w:rPr>
-        <w:t xml:space="preserve">, com </w:t>
-      </w:r>
-      <w:r>
-        <w:rPr>
-          <w:b/>
-          <w:color w:val="000000" w:themeColor="text1"/>
+        <w:t xml:space="preserve">um percentual já executado de </w:t>
+      </w:r>
+      <w:r>
+        <w:rPr>
+          <w:b/>
           <w:szCs w:val="24"/>
           <w:highlight w:val="yellow"/>
         </w:rPr>
-        <w:t xml:space="preserve">um percentual já executado de </w:t>
+        <w:t>8</w:t>
       </w:r>
       <w:r>
         <w:rPr>
@@ -4665,7 +4548,7 @@
           <w:szCs w:val="24"/>
           <w:highlight w:val="yellow"/>
         </w:rPr>
-        <w:t>8</w:t>
+        <w:t>9</w:t>
       </w:r>
       <w:r>
         <w:rPr>
@@ -4673,7 +4556,7 @@
           <w:szCs w:val="24"/>
           <w:highlight w:val="yellow"/>
         </w:rPr>
-        <w:t>9</w:t>
+        <w:t>,14</w:t>
       </w:r>
       <w:r>
         <w:rPr>
@@ -4681,27 +4564,19 @@
           <w:szCs w:val="24"/>
           <w:highlight w:val="yellow"/>
         </w:rPr>
-        <w:t>,14</w:t>
-      </w:r>
-      <w:r>
-        <w:rPr>
-          <w:b/>
+        <w:t>%</w:t>
+      </w:r>
+      <w:r>
+        <w:rPr>
+          <w:b/>
+          <w:color w:val="000000" w:themeColor="text1"/>
           <w:szCs w:val="24"/>
           <w:highlight w:val="yellow"/>
         </w:rPr>
-        <w:t>%</w:t>
-      </w:r>
-      <w:r>
-        <w:rPr>
-          <w:b/>
-          <w:color w:val="000000" w:themeColor="text1"/>
-          <w:szCs w:val="24"/>
-          <w:highlight w:val="yellow"/>
-        </w:rPr>
         <w:t>.</w:t>
       </w:r>
     </w:p>
-    <w:p xmlns:wp14="http://schemas.microsoft.com/office/word/2010/wordml" wp14:textId="77777777">
+    <w:p>
       <w:pPr>
         <w:pStyle w:val="NormalWeb"/>
         <w:shd w:val="clear" w:color="auto" w:fill="FFFFFF" w:themeFill="background1"/>
@@ -4728,7 +4603,7 @@
         <w:t xml:space="preserve"> o Relatório.</w:t>
       </w:r>
     </w:p>
-    <w:p xmlns:wp14="http://schemas.microsoft.com/office/word/2010/wordml" wp14:textId="77777777">
+    <w:p>
       <w:pPr>
         <w:shd w:val="clear" w:color="auto" w:fill="FFFFFF" w:themeFill="background1"/>
         <w:tabs>
@@ -4836,7 +4711,7 @@
         <w:t>.</w:t>
       </w:r>
     </w:p>
-    <w:p xmlns:wp14="http://schemas.microsoft.com/office/word/2010/wordml" wp14:textId="77777777">
+    <w:p>
       <w:pPr>
         <w:shd w:val="clear" w:color="auto" w:fill="FFFFFF" w:themeFill="background1"/>
         <w:tabs>
@@ -4853,7 +4728,7 @@
         </w:rPr>
       </w:pPr>
     </w:p>
-    <w:p xmlns:wp14="http://schemas.microsoft.com/office/word/2010/wordml" wp14:textId="77777777">
+    <w:p>
       <w:pPr>
         <w:shd w:val="clear" w:color="auto" w:fill="FFFFFF" w:themeFill="background1"/>
         <w:tabs>
@@ -4870,7 +4745,7 @@
         </w:rPr>
       </w:pPr>
     </w:p>
-    <w:p xmlns:wp14="http://schemas.microsoft.com/office/word/2010/wordml" wp14:textId="77777777">
+    <w:p>
       <w:pPr>
         <w:shd w:val="clear" w:color="auto" w:fill="FFFFFF" w:themeFill="background1"/>
         <w:spacing w:after="0" w:line="240" w:lineRule="auto"/>
@@ -4894,7 +4769,7 @@
         <w:t>Gregory Primeiro Fernandes de Paiva</w:t>
       </w:r>
     </w:p>
-    <w:p xmlns:wp14="http://schemas.microsoft.com/office/word/2010/wordml" wp14:textId="77777777">
+    <w:p>
       <w:pPr>
         <w:spacing w:after="0" w:line="240" w:lineRule="auto"/>
         <w:jc w:val="center"/>
@@ -4936,7 +4811,7 @@
         <w:t>-PB nº 02101932385</w:t>
       </w:r>
     </w:p>
-    <w:p xmlns:wp14="http://schemas.microsoft.com/office/word/2010/wordml" wp14:textId="77777777">
+    <w:p>
       <w:pPr>
         <w:pStyle w:val="Recuodecorpodetexto"/>
         <w:spacing w:line="240" w:lineRule="auto"/>
@@ -4951,7 +4826,7 @@
     <w:sectPr>
       <w:headerReference w:type="default" r:id="rId7"/>
       <w:footerReference w:type="default" r:id="rId8"/>
-      <w:pgSz w:w="11906" w:h="16838" w:orient="portrait" w:code="9"/>
+      <w:pgSz w:w="11906" w:h="16838" w:code="9"/>
       <w:pgMar w:top="567" w:right="1701" w:bottom="284" w:left="1701" w:header="284" w:footer="284" w:gutter="0"/>
       <w:cols w:space="708"/>
       <w:docGrid w:linePitch="360"/>
@@ -4961,9 +4836,9 @@
 </file>
 
 <file path=word/endnotes.xml><?xml version="1.0" encoding="utf-8"?>
-<w:endnotes xmlns:w14="http://schemas.microsoft.com/office/word/2010/wordml" xmlns:wp14="http://schemas.microsoft.com/office/word/2010/wordprocessingDrawing" xmlns:ve="http://schemas.openxmlformats.org/markup-compatibility/2006" xmlns:o="urn:schemas-microsoft-com:office:office" xmlns:r="http://schemas.openxmlformats.org/officeDocument/2006/relationships" xmlns:m="http://schemas.openxmlformats.org/officeDocument/2006/math" xmlns:v="urn:schemas-microsoft-com:vml" xmlns:wp="http://schemas.openxmlformats.org/drawingml/2006/wordprocessingDrawing" xmlns:w10="urn:schemas-microsoft-com:office:word" xmlns:w="http://schemas.openxmlformats.org/wordprocessingml/2006/main" xmlns:wne="http://schemas.microsoft.com/office/word/2006/wordml" xmlns:mc="http://schemas.openxmlformats.org/markup-compatibility/2006" mc:Ignorable="w14 wp14">
+<w:endnotes xmlns:wpc="http://schemas.microsoft.com/office/word/2010/wordprocessingCanvas" xmlns:cx="http://schemas.microsoft.com/office/drawing/2014/chartex" xmlns:cx1="http://schemas.microsoft.com/office/drawing/2015/9/8/chartex" xmlns:cx2="http://schemas.microsoft.com/office/drawing/2015/10/21/chartex" xmlns:cx3="http://schemas.microsoft.com/office/drawing/2016/5/9/chartex" xmlns:cx4="http://schemas.microsoft.com/office/drawing/2016/5/10/chartex" xmlns:cx5="http://schemas.microsoft.com/office/drawing/2016/5/11/chartex" xmlns:cx6="http://schemas.microsoft.com/office/drawing/2016/5/12/chartex" xmlns:cx7="http://schemas.microsoft.com/office/drawing/2016/5/13/chartex" xmlns:cx8="http://schemas.microsoft.com/office/drawing/2016/5/14/chartex" xmlns:mc="http://schemas.openxmlformats.org/markup-compatibility/2006" xmlns:aink="http://schemas.microsoft.com/office/drawing/2016/ink" xmlns:am3d="http://schemas.microsoft.com/office/drawing/2017/model3d" xmlns:o="urn:schemas-microsoft-com:office:office" xmlns:r="http://schemas.openxmlformats.org/officeDocument/2006/relationships" xmlns:m="http://schemas.openxmlformats.org/officeDocument/2006/math" xmlns:v="urn:schemas-microsoft-com:vml" xmlns:wp14="http://schemas.microsoft.com/office/word/2010/wordprocessingDrawing" xmlns:wp="http://schemas.openxmlformats.org/drawingml/2006/wordprocessingDrawing" xmlns:w10="urn:schemas-microsoft-com:office:word" xmlns:w="http://schemas.openxmlformats.org/wordprocessingml/2006/main" xmlns:w14="http://schemas.microsoft.com/office/word/2010/wordml" xmlns:w15="http://schemas.microsoft.com/office/word/2012/wordml" xmlns:w16cex="http://schemas.microsoft.com/office/word/2018/wordml/cex" xmlns:w16cid="http://schemas.microsoft.com/office/word/2016/wordml/cid" xmlns:w16="http://schemas.microsoft.com/office/word/2018/wordml" xmlns:w16sdtdh="http://schemas.microsoft.com/office/word/2020/wordml/sdtdatahash" xmlns:w16se="http://schemas.microsoft.com/office/word/2015/wordml/symex" xmlns:wpg="http://schemas.microsoft.com/office/word/2010/wordprocessingGroup" xmlns:wpi="http://schemas.microsoft.com/office/word/2010/wordprocessingInk" xmlns:wne="http://schemas.microsoft.com/office/word/2006/wordml" xmlns:wps="http://schemas.microsoft.com/office/word/2010/wordprocessingShape" mc:Ignorable="w14 w15 w16se w16cid w16 w16cex w16sdtdh wp14">
   <w:endnote w:type="separator" w:id="-1">
-    <w:p xmlns:wp14="http://schemas.microsoft.com/office/word/2010/wordml" wp14:textId="77777777">
+    <w:p>
       <w:pPr>
         <w:spacing w:after="0" w:line="240" w:lineRule="auto"/>
       </w:pPr>
@@ -4973,7 +4848,7 @@
     </w:p>
   </w:endnote>
   <w:endnote w:type="continuationSeparator" w:id="0">
-    <w:p xmlns:wp14="http://schemas.microsoft.com/office/word/2010/wordml" wp14:textId="77777777">
+    <w:p>
       <w:pPr>
         <w:spacing w:after="0" w:line="240" w:lineRule="auto"/>
       </w:pPr>
@@ -4986,7 +4861,7 @@
 </file>
 
 <file path=word/footer1.xml><?xml version="1.0" encoding="utf-8"?>
-<w:ftr xmlns:w14="http://schemas.microsoft.com/office/word/2010/wordml" xmlns:wp14="http://schemas.microsoft.com/office/word/2010/wordprocessingDrawing" xmlns:ve="http://schemas.openxmlformats.org/markup-compatibility/2006" xmlns:o="urn:schemas-microsoft-com:office:office" xmlns:r="http://schemas.openxmlformats.org/officeDocument/2006/relationships" xmlns:m="http://schemas.openxmlformats.org/officeDocument/2006/math" xmlns:v="urn:schemas-microsoft-com:vml" xmlns:wp="http://schemas.openxmlformats.org/drawingml/2006/wordprocessingDrawing" xmlns:w10="urn:schemas-microsoft-com:office:word" xmlns:w="http://schemas.openxmlformats.org/wordprocessingml/2006/main" xmlns:wne="http://schemas.microsoft.com/office/word/2006/wordml" xmlns:mc="http://schemas.openxmlformats.org/markup-compatibility/2006" mc:Ignorable="w14 wp14">
+<w:ftr xmlns:wpc="http://schemas.microsoft.com/office/word/2010/wordprocessingCanvas" xmlns:cx="http://schemas.microsoft.com/office/drawing/2014/chartex" xmlns:cx1="http://schemas.microsoft.com/office/drawing/2015/9/8/chartex" xmlns:cx2="http://schemas.microsoft.com/office/drawing/2015/10/21/chartex" xmlns:cx3="http://schemas.microsoft.com/office/drawing/2016/5/9/chartex" xmlns:cx4="http://schemas.microsoft.com/office/drawing/2016/5/10/chartex" xmlns:cx5="http://schemas.microsoft.com/office/drawing/2016/5/11/chartex" xmlns:cx6="http://schemas.microsoft.com/office/drawing/2016/5/12/chartex" xmlns:cx7="http://schemas.microsoft.com/office/drawing/2016/5/13/chartex" xmlns:cx8="http://schemas.microsoft.com/office/drawing/2016/5/14/chartex" xmlns:mc="http://schemas.openxmlformats.org/markup-compatibility/2006" xmlns:aink="http://schemas.microsoft.com/office/drawing/2016/ink" xmlns:am3d="http://schemas.microsoft.com/office/drawing/2017/model3d" xmlns:o="urn:schemas-microsoft-com:office:office" xmlns:r="http://schemas.openxmlformats.org/officeDocument/2006/relationships" xmlns:m="http://schemas.openxmlformats.org/officeDocument/2006/math" xmlns:v="urn:schemas-microsoft-com:vml" xmlns:wp14="http://schemas.microsoft.com/office/word/2010/wordprocessingDrawing" xmlns:wp="http://schemas.openxmlformats.org/drawingml/2006/wordprocessingDrawing" xmlns:w10="urn:schemas-microsoft-com:office:word" xmlns:w="http://schemas.openxmlformats.org/wordprocessingml/2006/main" xmlns:w14="http://schemas.microsoft.com/office/word/2010/wordml" xmlns:w15="http://schemas.microsoft.com/office/word/2012/wordml" xmlns:w16cex="http://schemas.microsoft.com/office/word/2018/wordml/cex" xmlns:w16cid="http://schemas.microsoft.com/office/word/2016/wordml/cid" xmlns:w16="http://schemas.microsoft.com/office/word/2018/wordml" xmlns:w16sdtdh="http://schemas.microsoft.com/office/word/2020/wordml/sdtdatahash" xmlns:w16se="http://schemas.microsoft.com/office/word/2015/wordml/symex" xmlns:wpg="http://schemas.microsoft.com/office/word/2010/wordprocessingGroup" xmlns:wpi="http://schemas.microsoft.com/office/word/2010/wordprocessingInk" xmlns:wne="http://schemas.microsoft.com/office/word/2006/wordml" xmlns:wps="http://schemas.microsoft.com/office/word/2010/wordprocessingShape" mc:Ignorable="w14 w15 w16se w16cid w16 w16cex w16sdtdh wp14">
   <w:sdt>
     <w:sdtPr>
       <w:id w:val="1586960699"/>
@@ -4995,6 +4870,7 @@
         <w:docPartUnique/>
       </w:docPartObj>
     </w:sdtPr>
+    <w:sdtEndPr/>
     <w:sdtContent>
       <w:sdt>
         <w:sdtPr>
@@ -5004,8 +4880,9 @@
             <w:docPartUnique/>
           </w:docPartObj>
         </w:sdtPr>
+        <w:sdtEndPr/>
         <w:sdtContent>
-          <w:p xmlns:wp14="http://schemas.microsoft.com/office/word/2010/wordml" wp14:textId="77777777">
+          <w:p>
             <w:pPr>
               <w:pStyle w:val="Rodap"/>
               <w:tabs>
@@ -5110,7 +4987,7 @@
       </w:sdt>
     </w:sdtContent>
   </w:sdt>
-  <w:p xmlns:wp14="http://schemas.microsoft.com/office/word/2010/wordml" wp14:textId="77777777">
+  <w:p>
     <w:pPr>
       <w:pStyle w:val="Rodap"/>
     </w:pPr>
@@ -5119,9 +4996,9 @@
 </file>
 
 <file path=word/footnotes.xml><?xml version="1.0" encoding="utf-8"?>
-<w:footnotes xmlns:w14="http://schemas.microsoft.com/office/word/2010/wordml" xmlns:wp14="http://schemas.microsoft.com/office/word/2010/wordprocessingDrawing" xmlns:ve="http://schemas.openxmlformats.org/markup-compatibility/2006" xmlns:o="urn:schemas-microsoft-com:office:office" xmlns:r="http://schemas.openxmlformats.org/officeDocument/2006/relationships" xmlns:m="http://schemas.openxmlformats.org/officeDocument/2006/math" xmlns:v="urn:schemas-microsoft-com:vml" xmlns:wp="http://schemas.openxmlformats.org/drawingml/2006/wordprocessingDrawing" xmlns:w10="urn:schemas-microsoft-com:office:word" xmlns:w="http://schemas.openxmlformats.org/wordprocessingml/2006/main" xmlns:wne="http://schemas.microsoft.com/office/word/2006/wordml" xmlns:mc="http://schemas.openxmlformats.org/markup-compatibility/2006" mc:Ignorable="w14 wp14">
+<w:footnotes xmlns:wpc="http://schemas.microsoft.com/office/word/2010/wordprocessingCanvas" xmlns:cx="http://schemas.microsoft.com/office/drawing/2014/chartex" xmlns:cx1="http://schemas.microsoft.com/office/drawing/2015/9/8/chartex" xmlns:cx2="http://schemas.microsoft.com/office/drawing/2015/10/21/chartex" xmlns:cx3="http://schemas.microsoft.com/office/drawing/2016/5/9/chartex" xmlns:cx4="http://schemas.microsoft.com/office/drawing/2016/5/10/chartex" xmlns:cx5="http://schemas.microsoft.com/office/drawing/2016/5/11/chartex" xmlns:cx6="http://schemas.microsoft.com/office/drawing/2016/5/12/chartex" xmlns:cx7="http://schemas.microsoft.com/office/drawing/2016/5/13/chartex" xmlns:cx8="http://schemas.microsoft.com/office/drawing/2016/5/14/chartex" xmlns:mc="http://schemas.openxmlformats.org/markup-compatibility/2006" xmlns:aink="http://schemas.microsoft.com/office/drawing/2016/ink" xmlns:am3d="http://schemas.microsoft.com/office/drawing/2017/model3d" xmlns:o="urn:schemas-microsoft-com:office:office" xmlns:r="http://schemas.openxmlformats.org/officeDocument/2006/relationships" xmlns:m="http://schemas.openxmlformats.org/officeDocument/2006/math" xmlns:v="urn:schemas-microsoft-com:vml" xmlns:wp14="http://schemas.microsoft.com/office/word/2010/wordprocessingDrawing" xmlns:wp="http://schemas.openxmlformats.org/drawingml/2006/wordprocessingDrawing" xmlns:w10="urn:schemas-microsoft-com:office:word" xmlns:w="http://schemas.openxmlformats.org/wordprocessingml/2006/main" xmlns:w14="http://schemas.microsoft.com/office/word/2010/wordml" xmlns:w15="http://schemas.microsoft.com/office/word/2012/wordml" xmlns:w16cex="http://schemas.microsoft.com/office/word/2018/wordml/cex" xmlns:w16cid="http://schemas.microsoft.com/office/word/2016/wordml/cid" xmlns:w16="http://schemas.microsoft.com/office/word/2018/wordml" xmlns:w16sdtdh="http://schemas.microsoft.com/office/word/2020/wordml/sdtdatahash" xmlns:w16se="http://schemas.microsoft.com/office/word/2015/wordml/symex" xmlns:wpg="http://schemas.microsoft.com/office/word/2010/wordprocessingGroup" xmlns:wpi="http://schemas.microsoft.com/office/word/2010/wordprocessingInk" xmlns:wne="http://schemas.microsoft.com/office/word/2006/wordml" xmlns:wps="http://schemas.microsoft.com/office/word/2010/wordprocessingShape" mc:Ignorable="w14 w15 w16se w16cid w16 w16cex w16sdtdh wp14">
   <w:footnote w:type="separator" w:id="-1">
-    <w:p xmlns:wp14="http://schemas.microsoft.com/office/word/2010/wordml" wp14:textId="77777777">
+    <w:p>
       <w:pPr>
         <w:spacing w:after="0" w:line="240" w:lineRule="auto"/>
       </w:pPr>
@@ -5131,7 +5008,7 @@
     </w:p>
   </w:footnote>
   <w:footnote w:type="continuationSeparator" w:id="0">
-    <w:p xmlns:wp14="http://schemas.microsoft.com/office/word/2010/wordml" wp14:textId="77777777">
+    <w:p>
       <w:pPr>
         <w:spacing w:after="0" w:line="240" w:lineRule="auto"/>
       </w:pPr>
@@ -5144,8 +5021,8 @@
 </file>
 
 <file path=word/header1.xml><?xml version="1.0" encoding="utf-8"?>
-<w:hdr xmlns:w14="http://schemas.microsoft.com/office/word/2010/wordml" xmlns:wp14="http://schemas.microsoft.com/office/word/2010/wordprocessingDrawing" xmlns:ve="http://schemas.openxmlformats.org/markup-compatibility/2006" xmlns:o="urn:schemas-microsoft-com:office:office" xmlns:r="http://schemas.openxmlformats.org/officeDocument/2006/relationships" xmlns:m="http://schemas.openxmlformats.org/officeDocument/2006/math" xmlns:v="urn:schemas-microsoft-com:vml" xmlns:wp="http://schemas.openxmlformats.org/drawingml/2006/wordprocessingDrawing" xmlns:w10="urn:schemas-microsoft-com:office:word" xmlns:w="http://schemas.openxmlformats.org/wordprocessingml/2006/main" xmlns:wne="http://schemas.microsoft.com/office/word/2006/wordml" xmlns:mc="http://schemas.openxmlformats.org/markup-compatibility/2006" xmlns:a="http://schemas.openxmlformats.org/drawingml/2006/main" xmlns:pic="http://schemas.openxmlformats.org/drawingml/2006/picture" xmlns:a14="http://schemas.microsoft.com/office/drawing/2010/main" mc:Ignorable="w14 wp14">
-  <w:p xmlns:wp14="http://schemas.microsoft.com/office/word/2010/wordml" wp14:textId="77777777">
+<w:hdr xmlns:wpc="http://schemas.microsoft.com/office/word/2010/wordprocessingCanvas" xmlns:cx="http://schemas.microsoft.com/office/drawing/2014/chartex" xmlns:cx1="http://schemas.microsoft.com/office/drawing/2015/9/8/chartex" xmlns:cx2="http://schemas.microsoft.com/office/drawing/2015/10/21/chartex" xmlns:cx3="http://schemas.microsoft.com/office/drawing/2016/5/9/chartex" xmlns:cx4="http://schemas.microsoft.com/office/drawing/2016/5/10/chartex" xmlns:cx5="http://schemas.microsoft.com/office/drawing/2016/5/11/chartex" xmlns:cx6="http://schemas.microsoft.com/office/drawing/2016/5/12/chartex" xmlns:cx7="http://schemas.microsoft.com/office/drawing/2016/5/13/chartex" xmlns:cx8="http://schemas.microsoft.com/office/drawing/2016/5/14/chartex" xmlns:mc="http://schemas.openxmlformats.org/markup-compatibility/2006" xmlns:aink="http://schemas.microsoft.com/office/drawing/2016/ink" xmlns:am3d="http://schemas.microsoft.com/office/drawing/2017/model3d" xmlns:o="urn:schemas-microsoft-com:office:office" xmlns:r="http://schemas.openxmlformats.org/officeDocument/2006/relationships" xmlns:m="http://schemas.openxmlformats.org/officeDocument/2006/math" xmlns:v="urn:schemas-microsoft-com:vml" xmlns:wp14="http://schemas.microsoft.com/office/word/2010/wordprocessingDrawing" xmlns:wp="http://schemas.openxmlformats.org/drawingml/2006/wordprocessingDrawing" xmlns:w10="urn:schemas-microsoft-com:office:word" xmlns:w="http://schemas.openxmlformats.org/wordprocessingml/2006/main" xmlns:w14="http://schemas.microsoft.com/office/word/2010/wordml" xmlns:w15="http://schemas.microsoft.com/office/word/2012/wordml" xmlns:w16cex="http://schemas.microsoft.com/office/word/2018/wordml/cex" xmlns:w16cid="http://schemas.microsoft.com/office/word/2016/wordml/cid" xmlns:w16="http://schemas.microsoft.com/office/word/2018/wordml" xmlns:w16sdtdh="http://schemas.microsoft.com/office/word/2020/wordml/sdtdatahash" xmlns:w16se="http://schemas.microsoft.com/office/word/2015/wordml/symex" xmlns:wpg="http://schemas.microsoft.com/office/word/2010/wordprocessingGroup" xmlns:wpi="http://schemas.microsoft.com/office/word/2010/wordprocessingInk" xmlns:wne="http://schemas.microsoft.com/office/word/2006/wordml" xmlns:wps="http://schemas.microsoft.com/office/word/2010/wordprocessingShape" mc:Ignorable="w14 w15 w16se w16cid w16 w16cex w16sdtdh wp14">
+  <w:p>
     <w:pPr>
       <w:pStyle w:val="Cabealho"/>
       <w:ind w:right="-852"/>
@@ -5164,7 +5041,7 @@
         <w:lang w:eastAsia="pt-BR"/>
       </w:rPr>
       <w:drawing>
-        <wp:inline xmlns:wp14="http://schemas.microsoft.com/office/word/2010/wordprocessingDrawing" distT="0" distB="0" distL="0" distR="0" wp14:anchorId="04FE97C2" wp14:editId="7777777">
+        <wp:inline distT="0" distB="0" distL="0" distR="0" wp14:anchorId="04FE97C2" wp14:editId="07777777">
           <wp:extent cx="427355" cy="457200"/>
           <wp:effectExtent l="0" t="0" r="0" b="0"/>
           <wp:docPr id="2" name="Imagem 2" descr="Descrição: C:\Users\Edilson Oliveira\AppData\Local\Microsoft\Windows\INetCacheContent.Word\COREMAS-FINAL.JPG"/>
@@ -5184,7 +5061,7 @@
                   <a:blip r:embed="rId1">
                     <a:extLst>
                       <a:ext uri="{28A0092B-C50C-407E-A947-70E740481C1C}">
-                        <a14:useLocalDpi xmlns="" xmlns:wpc="http://schemas.microsoft.com/office/word/2010/wordprocessingCanvas" xmlns:mc="http://schemas.openxmlformats.org/markup-compatibility/2006" xmlns:o="urn:schemas-microsoft-com:office:office" xmlns:v="urn:schemas-microsoft-com:vml" xmlns:wp14="http://schemas.microsoft.com/office/word/2010/wordprocessingDrawing" xmlns:w10="urn:schemas-microsoft-com:office:word" xmlns:w="http://schemas.openxmlformats.org/wordprocessingml/2006/main" xmlns:w14="http://schemas.microsoft.com/office/word/2010/wordml" xmlns:w15="http://schemas.microsoft.com/office/word/2012/wordml" xmlns:wpg="http://schemas.microsoft.com/office/word/2010/wordprocessingGroup" xmlns:wpi="http://schemas.microsoft.com/office/word/2010/wordprocessingInk" xmlns:wps="http://schemas.microsoft.com/office/word/2010/wordprocessingShape" xmlns:a14="http://schemas.microsoft.com/office/drawing/2010/main" val="0"/>
+                        <a14:useLocalDpi xmlns:a14="http://schemas.microsoft.com/office/drawing/2010/main" val="0"/>
                       </a:ext>
                     </a:extLst>
                   </a:blip>
@@ -5222,7 +5099,7 @@
       <w:t xml:space="preserve"> </w:t>
     </w:r>
   </w:p>
-  <w:p xmlns:wp14="http://schemas.microsoft.com/office/word/2010/wordml" wp14:textId="77777777">
+  <w:p>
     <w:pPr>
       <w:pStyle w:val="Cabealho"/>
       <w:ind w:right="-852"/>
@@ -5244,7 +5121,7 @@
       <w:t>Estado da Paraíba</w:t>
     </w:r>
   </w:p>
-  <w:p xmlns:wp14="http://schemas.microsoft.com/office/word/2010/wordml" wp14:textId="77777777">
+  <w:p>
     <w:pPr>
       <w:pStyle w:val="Cabealho"/>
       <w:ind w:right="-852"/>
@@ -5262,7 +5139,7 @@
       <w:t>PREFEITURA MUNICIPAL DE COREMAS</w:t>
     </w:r>
   </w:p>
-  <w:p xmlns:wp14="http://schemas.microsoft.com/office/word/2010/wordml" wp14:textId="77777777">
+  <w:p>
     <w:pPr>
       <w:ind w:right="-852"/>
       <w:jc w:val="center"/>
@@ -5297,7 +5174,7 @@
       <w:t xml:space="preserve"> </w:t>
     </w:r>
   </w:p>
-  <w:p xmlns:wp14="http://schemas.microsoft.com/office/word/2010/wordml" wp14:textId="77777777">
+  <w:p>
     <w:pPr>
       <w:spacing w:after="0" w:line="240" w:lineRule="auto"/>
       <w:ind w:right="-852"/>
@@ -5318,7 +5195,7 @@
       <w:t>RELATÓRIO DE OBRA Nº 001</w:t>
     </w:r>
   </w:p>
-  <w:p xmlns:wp14="http://schemas.microsoft.com/office/word/2010/wordml" wp14:textId="77777777">
+  <w:p>
     <w:pPr>
       <w:spacing w:after="0" w:line="240" w:lineRule="auto"/>
       <w:ind w:right="-852"/>
@@ -5366,14 +5243,14 @@
       <w:t>)</w:t>
     </w:r>
   </w:p>
-  <w:p xmlns:wp14="http://schemas.microsoft.com/office/word/2010/wordml" wp14:textId="77777777">
+  <w:p>
     <w:pPr>
       <w:spacing w:after="0" w:line="240" w:lineRule="auto"/>
       <w:ind w:right="-994"/>
       <w:jc w:val="center"/>
     </w:pPr>
   </w:p>
-  <w:p xmlns:wp14="http://schemas.microsoft.com/office/word/2010/wordml" wp14:textId="77777777">
+  <w:p>
     <w:pPr>
       <w:spacing w:after="0" w:line="240" w:lineRule="auto"/>
       <w:ind w:right="-994"/>
@@ -5384,11 +5261,11 @@
 </file>
 
 <file path=word/styles.xml><?xml version="1.0" encoding="utf-8"?>
-<w:styles xmlns:w14="http://schemas.microsoft.com/office/word/2010/wordml" xmlns:wp14="http://schemas.microsoft.com/office/word/2010/wordprocessingDrawing" xmlns:r="http://schemas.openxmlformats.org/officeDocument/2006/relationships" xmlns:w="http://schemas.openxmlformats.org/wordprocessingml/2006/main" xmlns:mc="http://schemas.openxmlformats.org/markup-compatibility/2006" mc:Ignorable="w14 wp14">
+<w:styles xmlns:mc="http://schemas.openxmlformats.org/markup-compatibility/2006" xmlns:r="http://schemas.openxmlformats.org/officeDocument/2006/relationships" xmlns:w="http://schemas.openxmlformats.org/wordprocessingml/2006/main" xmlns:w14="http://schemas.microsoft.com/office/word/2010/wordml" xmlns:w15="http://schemas.microsoft.com/office/word/2012/wordml" xmlns:w16cex="http://schemas.microsoft.com/office/word/2018/wordml/cex" xmlns:w16cid="http://schemas.microsoft.com/office/word/2016/wordml/cid" xmlns:w16="http://schemas.microsoft.com/office/word/2018/wordml" xmlns:w16sdtdh="http://schemas.microsoft.com/office/word/2020/wordml/sdtdatahash" xmlns:w16se="http://schemas.microsoft.com/office/word/2015/wordml/symex" mc:Ignorable="w14 w15 w16se w16cid w16 w16cex w16sdtdh">
   <w:docDefaults>
     <w:rPrDefault>
       <w:rPr>
-        <w:rFonts w:asciiTheme="minorHAnsi" w:hAnsiTheme="minorHAnsi" w:eastAsiaTheme="minorHAnsi" w:cstheme="minorBidi"/>
+        <w:rFonts w:asciiTheme="minorHAnsi" w:eastAsiaTheme="minorHAnsi" w:hAnsiTheme="minorHAnsi" w:cstheme="minorBidi"/>
         <w:sz w:val="22"/>
         <w:szCs w:val="22"/>
         <w:lang w:val="pt-BR" w:eastAsia="en-US" w:bidi="ar-SA"/>
@@ -5400,147 +5277,385 @@
       </w:pPr>
     </w:pPrDefault>
   </w:docDefaults>
-  <w:latentStyles w:defLockedState="0" w:defUIPriority="99" w:defSemiHidden="1" w:defUnhideWhenUsed="1" w:defQFormat="0" w:count="267">
-    <w:lsdException w:name="Normal" w:uiPriority="0" w:semiHidden="0" w:unhideWhenUsed="0" w:qFormat="1"/>
-    <w:lsdException w:name="heading 1" w:uiPriority="9" w:semiHidden="0" w:unhideWhenUsed="0" w:qFormat="1"/>
-    <w:lsdException w:name="heading 2" w:uiPriority="9" w:qFormat="1"/>
-    <w:lsdException w:name="heading 3" w:uiPriority="9" w:qFormat="1"/>
-    <w:lsdException w:name="heading 4" w:uiPriority="9" w:qFormat="1"/>
-    <w:lsdException w:name="heading 5" w:uiPriority="9" w:qFormat="1"/>
-    <w:lsdException w:name="heading 6" w:uiPriority="9" w:qFormat="1"/>
-    <w:lsdException w:name="heading 7" w:qFormat="1"/>
-    <w:lsdException w:name="heading 8" w:uiPriority="9" w:qFormat="1"/>
-    <w:lsdException w:name="heading 9" w:uiPriority="9" w:qFormat="1"/>
-    <w:lsdException w:name="toc 1" w:uiPriority="39"/>
-    <w:lsdException w:name="toc 2" w:uiPriority="39"/>
-    <w:lsdException w:name="toc 3" w:uiPriority="39"/>
-    <w:lsdException w:name="toc 4" w:uiPriority="39"/>
-    <w:lsdException w:name="toc 5" w:uiPriority="39"/>
-    <w:lsdException w:name="toc 6" w:uiPriority="39"/>
-    <w:lsdException w:name="toc 7" w:uiPriority="39"/>
-    <w:lsdException w:name="toc 8" w:uiPriority="39"/>
-    <w:lsdException w:name="toc 9" w:uiPriority="39"/>
-    <w:lsdException w:name="caption" w:uiPriority="35" w:qFormat="1"/>
-    <w:lsdException w:name="Title" w:uiPriority="10" w:semiHidden="0" w:unhideWhenUsed="0" w:qFormat="1"/>
-    <w:lsdException w:name="Default Paragraph Font" w:uiPriority="1"/>
-    <w:lsdException w:name="Body Text Indent" w:uiPriority="0"/>
-    <w:lsdException w:name="Subtitle" w:uiPriority="11" w:semiHidden="0" w:unhideWhenUsed="0" w:qFormat="1"/>
-    <w:lsdException w:name="Strong" w:uiPriority="22" w:semiHidden="0" w:unhideWhenUsed="0" w:qFormat="1"/>
-    <w:lsdException w:name="Emphasis" w:uiPriority="20" w:semiHidden="0" w:unhideWhenUsed="0" w:qFormat="1"/>
-    <w:lsdException w:name="Table Grid" w:uiPriority="59" w:semiHidden="0" w:unhideWhenUsed="0"/>
-    <w:lsdException w:name="Placeholder Text" w:unhideWhenUsed="0"/>
-    <w:lsdException w:name="No Spacing" w:uiPriority="1" w:semiHidden="0" w:unhideWhenUsed="0" w:qFormat="1"/>
-    <w:lsdException w:name="Light Shading" w:uiPriority="60" w:semiHidden="0" w:unhideWhenUsed="0"/>
-    <w:lsdException w:name="Light List" w:uiPriority="61" w:semiHidden="0" w:unhideWhenUsed="0"/>
-    <w:lsdException w:name="Light Grid" w:uiPriority="62" w:semiHidden="0" w:unhideWhenUsed="0"/>
-    <w:lsdException w:name="Medium Shading 1" w:uiPriority="63" w:semiHidden="0" w:unhideWhenUsed="0"/>
-    <w:lsdException w:name="Medium Shading 2" w:uiPriority="64" w:semiHidden="0" w:unhideWhenUsed="0"/>
-    <w:lsdException w:name="Medium List 1" w:uiPriority="65" w:semiHidden="0" w:unhideWhenUsed="0"/>
-    <w:lsdException w:name="Medium List 2" w:uiPriority="66" w:semiHidden="0" w:unhideWhenUsed="0"/>
-    <w:lsdException w:name="Medium Grid 1" w:uiPriority="67" w:semiHidden="0" w:unhideWhenUsed="0"/>
-    <w:lsdException w:name="Medium Grid 2" w:uiPriority="68" w:semiHidden="0" w:unhideWhenUsed="0"/>
-    <w:lsdException w:name="Medium Grid 3" w:uiPriority="69" w:semiHidden="0" w:unhideWhenUsed="0"/>
-    <w:lsdException w:name="Dark List" w:uiPriority="70" w:semiHidden="0" w:unhideWhenUsed="0"/>
-    <w:lsdException w:name="Colorful Shading" w:uiPriority="71" w:semiHidden="0" w:unhideWhenUsed="0"/>
-    <w:lsdException w:name="Colorful List" w:uiPriority="72" w:semiHidden="0" w:unhideWhenUsed="0"/>
-    <w:lsdException w:name="Colorful Grid" w:uiPriority="73" w:semiHidden="0" w:unhideWhenUsed="0"/>
-    <w:lsdException w:name="Light Shading Accent 1" w:uiPriority="60" w:semiHidden="0" w:unhideWhenUsed="0"/>
-    <w:lsdException w:name="Light List Accent 1" w:uiPriority="61" w:semiHidden="0" w:unhideWhenUsed="0"/>
-    <w:lsdException w:name="Light Grid Accent 1" w:uiPriority="62" w:semiHidden="0" w:unhideWhenUsed="0"/>
-    <w:lsdException w:name="Medium Shading 1 Accent 1" w:uiPriority="63" w:semiHidden="0" w:unhideWhenUsed="0"/>
-    <w:lsdException w:name="Medium Shading 2 Accent 1" w:uiPriority="64" w:semiHidden="0" w:unhideWhenUsed="0"/>
-    <w:lsdException w:name="Medium List 1 Accent 1" w:uiPriority="65" w:semiHidden="0" w:unhideWhenUsed="0"/>
-    <w:lsdException w:name="Revision" w:unhideWhenUsed="0"/>
-    <w:lsdException w:name="List Paragraph" w:uiPriority="34" w:semiHidden="0" w:unhideWhenUsed="0" w:qFormat="1"/>
-    <w:lsdException w:name="Quote" w:uiPriority="29" w:semiHidden="0" w:unhideWhenUsed="0" w:qFormat="1"/>
-    <w:lsdException w:name="Intense Quote" w:uiPriority="30" w:semiHidden="0" w:unhideWhenUsed="0" w:qFormat="1"/>
-    <w:lsdException w:name="Medium List 2 Accent 1" w:uiPriority="66" w:semiHidden="0" w:unhideWhenUsed="0"/>
-    <w:lsdException w:name="Medium Grid 1 Accent 1" w:uiPriority="67" w:semiHidden="0" w:unhideWhenUsed="0"/>
-    <w:lsdException w:name="Medium Grid 2 Accent 1" w:uiPriority="68" w:semiHidden="0" w:unhideWhenUsed="0"/>
-    <w:lsdException w:name="Medium Grid 3 Accent 1" w:uiPriority="69" w:semiHidden="0" w:unhideWhenUsed="0"/>
-    <w:lsdException w:name="Dark List Accent 1" w:uiPriority="70" w:semiHidden="0" w:unhideWhenUsed="0"/>
-    <w:lsdException w:name="Colorful Shading Accent 1" w:uiPriority="71" w:semiHidden="0" w:unhideWhenUsed="0"/>
-    <w:lsdException w:name="Colorful List Accent 1" w:uiPriority="72" w:semiHidden="0" w:unhideWhenUsed="0"/>
-    <w:lsdException w:name="Colorful Grid Accent 1" w:uiPriority="73" w:semiHidden="0" w:unhideWhenUsed="0"/>
-    <w:lsdException w:name="Light Shading Accent 2" w:uiPriority="60" w:semiHidden="0" w:unhideWhenUsed="0"/>
-    <w:lsdException w:name="Light List Accent 2" w:uiPriority="61" w:semiHidden="0" w:unhideWhenUsed="0"/>
-    <w:lsdException w:name="Light Grid Accent 2" w:uiPriority="62" w:semiHidden="0" w:unhideWhenUsed="0"/>
-    <w:lsdException w:name="Medium Shading 1 Accent 2" w:uiPriority="63" w:semiHidden="0" w:unhideWhenUsed="0"/>
-    <w:lsdException w:name="Medium Shading 2 Accent 2" w:uiPriority="64" w:semiHidden="0" w:unhideWhenUsed="0"/>
-    <w:lsdException w:name="Medium List 1 Accent 2" w:uiPriority="65" w:semiHidden="0" w:unhideWhenUsed="0"/>
-    <w:lsdException w:name="Medium List 2 Accent 2" w:uiPriority="66" w:semiHidden="0" w:unhideWhenUsed="0"/>
-    <w:lsdException w:name="Medium Grid 1 Accent 2" w:uiPriority="67" w:semiHidden="0" w:unhideWhenUsed="0"/>
-    <w:lsdException w:name="Medium Grid 2 Accent 2" w:uiPriority="68" w:semiHidden="0" w:unhideWhenUsed="0"/>
-    <w:lsdException w:name="Medium Grid 3 Accent 2" w:uiPriority="69" w:semiHidden="0" w:unhideWhenUsed="0"/>
-    <w:lsdException w:name="Dark List Accent 2" w:uiPriority="70" w:semiHidden="0" w:unhideWhenUsed="0"/>
-    <w:lsdException w:name="Colorful Shading Accent 2" w:uiPriority="71" w:semiHidden="0" w:unhideWhenUsed="0"/>
-    <w:lsdException w:name="Colorful List Accent 2" w:uiPriority="72" w:semiHidden="0" w:unhideWhenUsed="0"/>
-    <w:lsdException w:name="Colorful Grid Accent 2" w:uiPriority="73" w:semiHidden="0" w:unhideWhenUsed="0"/>
-    <w:lsdException w:name="Light Shading Accent 3" w:uiPriority="60" w:semiHidden="0" w:unhideWhenUsed="0"/>
-    <w:lsdException w:name="Light List Accent 3" w:uiPriority="61" w:semiHidden="0" w:unhideWhenUsed="0"/>
-    <w:lsdException w:name="Light Grid Accent 3" w:uiPriority="62" w:semiHidden="0" w:unhideWhenUsed="0"/>
-    <w:lsdException w:name="Medium Shading 1 Accent 3" w:uiPriority="63" w:semiHidden="0" w:unhideWhenUsed="0"/>
-    <w:lsdException w:name="Medium Shading 2 Accent 3" w:uiPriority="64" w:semiHidden="0" w:unhideWhenUsed="0"/>
-    <w:lsdException w:name="Medium List 1 Accent 3" w:uiPriority="65" w:semiHidden="0" w:unhideWhenUsed="0"/>
-    <w:lsdException w:name="Medium List 2 Accent 3" w:uiPriority="66" w:semiHidden="0" w:unhideWhenUsed="0"/>
-    <w:lsdException w:name="Medium Grid 1 Accent 3" w:uiPriority="67" w:semiHidden="0" w:unhideWhenUsed="0"/>
-    <w:lsdException w:name="Medium Grid 2 Accent 3" w:uiPriority="68" w:semiHidden="0" w:unhideWhenUsed="0"/>
-    <w:lsdException w:name="Medium Grid 3 Accent 3" w:uiPriority="69" w:semiHidden="0" w:unhideWhenUsed="0"/>
-    <w:lsdException w:name="Dark List Accent 3" w:uiPriority="70" w:semiHidden="0" w:unhideWhenUsed="0"/>
-    <w:lsdException w:name="Colorful Shading Accent 3" w:uiPriority="71" w:semiHidden="0" w:unhideWhenUsed="0"/>
-    <w:lsdException w:name="Colorful List Accent 3" w:uiPriority="72" w:semiHidden="0" w:unhideWhenUsed="0"/>
-    <w:lsdException w:name="Colorful Grid Accent 3" w:uiPriority="73" w:semiHidden="0" w:unhideWhenUsed="0"/>
-    <w:lsdException w:name="Light Shading Accent 4" w:uiPriority="60" w:semiHidden="0" w:unhideWhenUsed="0"/>
-    <w:lsdException w:name="Light List Accent 4" w:uiPriority="61" w:semiHidden="0" w:unhideWhenUsed="0"/>
-    <w:lsdException w:name="Light Grid Accent 4" w:uiPriority="62" w:semiHidden="0" w:unhideWhenUsed="0"/>
-    <w:lsdException w:name="Medium Shading 1 Accent 4" w:uiPriority="63" w:semiHidden="0" w:unhideWhenUsed="0"/>
-    <w:lsdException w:name="Medium Shading 2 Accent 4" w:uiPriority="64" w:semiHidden="0" w:unhideWhenUsed="0"/>
-    <w:lsdException w:name="Medium List 1 Accent 4" w:uiPriority="65" w:semiHidden="0" w:unhideWhenUsed="0"/>
-    <w:lsdException w:name="Medium List 2 Accent 4" w:uiPriority="66" w:semiHidden="0" w:unhideWhenUsed="0"/>
-    <w:lsdException w:name="Medium Grid 1 Accent 4" w:uiPriority="67" w:semiHidden="0" w:unhideWhenUsed="0"/>
-    <w:lsdException w:name="Medium Grid 2 Accent 4" w:uiPriority="68" w:semiHidden="0" w:unhideWhenUsed="0"/>
-    <w:lsdException w:name="Medium Grid 3 Accent 4" w:uiPriority="69" w:semiHidden="0" w:unhideWhenUsed="0"/>
-    <w:lsdException w:name="Dark List Accent 4" w:uiPriority="70" w:semiHidden="0" w:unhideWhenUsed="0"/>
-    <w:lsdException w:name="Colorful Shading Accent 4" w:uiPriority="71" w:semiHidden="0" w:unhideWhenUsed="0"/>
-    <w:lsdException w:name="Colorful List Accent 4" w:uiPriority="72" w:semiHidden="0" w:unhideWhenUsed="0"/>
-    <w:lsdException w:name="Colorful Grid Accent 4" w:uiPriority="73" w:semiHidden="0" w:unhideWhenUsed="0"/>
-    <w:lsdException w:name="Light Shading Accent 5" w:uiPriority="60" w:semiHidden="0" w:unhideWhenUsed="0"/>
-    <w:lsdException w:name="Light List Accent 5" w:uiPriority="61" w:semiHidden="0" w:unhideWhenUsed="0"/>
-    <w:lsdException w:name="Light Grid Accent 5" w:uiPriority="62" w:semiHidden="0" w:unhideWhenUsed="0"/>
-    <w:lsdException w:name="Medium Shading 1 Accent 5" w:uiPriority="63" w:semiHidden="0" w:unhideWhenUsed="0"/>
-    <w:lsdException w:name="Medium Shading 2 Accent 5" w:uiPriority="64" w:semiHidden="0" w:unhideWhenUsed="0"/>
-    <w:lsdException w:name="Medium List 1 Accent 5" w:uiPriority="65" w:semiHidden="0" w:unhideWhenUsed="0"/>
-    <w:lsdException w:name="Medium List 2 Accent 5" w:uiPriority="66" w:semiHidden="0" w:unhideWhenUsed="0"/>
-    <w:lsdException w:name="Medium Grid 1 Accent 5" w:uiPriority="67" w:semiHidden="0" w:unhideWhenUsed="0"/>
-    <w:lsdException w:name="Medium Grid 2 Accent 5" w:uiPriority="68" w:semiHidden="0" w:unhideWhenUsed="0"/>
-    <w:lsdException w:name="Medium Grid 3 Accent 5" w:uiPriority="69" w:semiHidden="0" w:unhideWhenUsed="0"/>
-    <w:lsdException w:name="Dark List Accent 5" w:uiPriority="70" w:semiHidden="0" w:unhideWhenUsed="0"/>
-    <w:lsdException w:name="Colorful Shading Accent 5" w:uiPriority="71" w:semiHidden="0" w:unhideWhenUsed="0"/>
-    <w:lsdException w:name="Colorful List Accent 5" w:uiPriority="72" w:semiHidden="0" w:unhideWhenUsed="0"/>
-    <w:lsdException w:name="Colorful Grid Accent 5" w:uiPriority="73" w:semiHidden="0" w:unhideWhenUsed="0"/>
-    <w:lsdException w:name="Light Shading Accent 6" w:uiPriority="60" w:semiHidden="0" w:unhideWhenUsed="0"/>
-    <w:lsdException w:name="Light List Accent 6" w:uiPriority="61" w:semiHidden="0" w:unhideWhenUsed="0"/>
-    <w:lsdException w:name="Light Grid Accent 6" w:uiPriority="62" w:semiHidden="0" w:unhideWhenUsed="0"/>
-    <w:lsdException w:name="Medium Shading 1 Accent 6" w:uiPriority="63" w:semiHidden="0" w:unhideWhenUsed="0"/>
-    <w:lsdException w:name="Medium Shading 2 Accent 6" w:uiPriority="64" w:semiHidden="0" w:unhideWhenUsed="0"/>
-    <w:lsdException w:name="Medium List 1 Accent 6" w:uiPriority="65" w:semiHidden="0" w:unhideWhenUsed="0"/>
-    <w:lsdException w:name="Medium List 2 Accent 6" w:uiPriority="66" w:semiHidden="0" w:unhideWhenUsed="0"/>
-    <w:lsdException w:name="Medium Grid 1 Accent 6" w:uiPriority="67" w:semiHidden="0" w:unhideWhenUsed="0"/>
-    <w:lsdException w:name="Medium Grid 2 Accent 6" w:uiPriority="68" w:semiHidden="0" w:unhideWhenUsed="0"/>
-    <w:lsdException w:name="Medium Grid 3 Accent 6" w:uiPriority="69" w:semiHidden="0" w:unhideWhenUsed="0"/>
-    <w:lsdException w:name="Dark List Accent 6" w:uiPriority="70" w:semiHidden="0" w:unhideWhenUsed="0"/>
-    <w:lsdException w:name="Colorful Shading Accent 6" w:uiPriority="71" w:semiHidden="0" w:unhideWhenUsed="0"/>
-    <w:lsdException w:name="Colorful List Accent 6" w:uiPriority="72" w:semiHidden="0" w:unhideWhenUsed="0"/>
-    <w:lsdException w:name="Colorful Grid Accent 6" w:uiPriority="73" w:semiHidden="0" w:unhideWhenUsed="0"/>
-    <w:lsdException w:name="Subtle Emphasis" w:uiPriority="19" w:semiHidden="0" w:unhideWhenUsed="0" w:qFormat="1"/>
-    <w:lsdException w:name="Intense Emphasis" w:uiPriority="21" w:semiHidden="0" w:unhideWhenUsed="0" w:qFormat="1"/>
-    <w:lsdException w:name="Subtle Reference" w:uiPriority="31" w:semiHidden="0" w:unhideWhenUsed="0" w:qFormat="1"/>
-    <w:lsdException w:name="Intense Reference" w:uiPriority="32" w:semiHidden="0" w:unhideWhenUsed="0" w:qFormat="1"/>
-    <w:lsdException w:name="Book Title" w:uiPriority="33" w:semiHidden="0" w:unhideWhenUsed="0" w:qFormat="1"/>
-    <w:lsdException w:name="Bibliography" w:uiPriority="37"/>
-    <w:lsdException w:name="TOC Heading" w:uiPriority="39" w:qFormat="1"/>
+  <w:latentStyles w:defLockedState="0" w:defUIPriority="99" w:defSemiHidden="0" w:defUnhideWhenUsed="0" w:defQFormat="0" w:count="376">
+    <w:lsdException w:name="Normal" w:uiPriority="0" w:qFormat="1"/>
+    <w:lsdException w:name="heading 1" w:uiPriority="9" w:qFormat="1"/>
+    <w:lsdException w:name="heading 2" w:semiHidden="1" w:uiPriority="9" w:unhideWhenUsed="1" w:qFormat="1"/>
+    <w:lsdException w:name="heading 3" w:semiHidden="1" w:uiPriority="9" w:unhideWhenUsed="1" w:qFormat="1"/>
+    <w:lsdException w:name="heading 4" w:semiHidden="1" w:uiPriority="9" w:unhideWhenUsed="1" w:qFormat="1"/>
+    <w:lsdException w:name="heading 5" w:semiHidden="1" w:uiPriority="9" w:unhideWhenUsed="1" w:qFormat="1"/>
+    <w:lsdException w:name="heading 6" w:semiHidden="1" w:uiPriority="9" w:unhideWhenUsed="1" w:qFormat="1"/>
+    <w:lsdException w:name="heading 7" w:semiHidden="1" w:unhideWhenUsed="1" w:qFormat="1"/>
+    <w:lsdException w:name="heading 8" w:semiHidden="1" w:uiPriority="9" w:unhideWhenUsed="1" w:qFormat="1"/>
+    <w:lsdException w:name="heading 9" w:semiHidden="1" w:uiPriority="9" w:unhideWhenUsed="1" w:qFormat="1"/>
+    <w:lsdException w:name="index 1" w:semiHidden="1" w:unhideWhenUsed="1"/>
+    <w:lsdException w:name="index 2" w:semiHidden="1" w:unhideWhenUsed="1"/>
+    <w:lsdException w:name="index 3" w:semiHidden="1" w:unhideWhenUsed="1"/>
+    <w:lsdException w:name="index 4" w:semiHidden="1" w:unhideWhenUsed="1"/>
+    <w:lsdException w:name="index 5" w:semiHidden="1" w:unhideWhenUsed="1"/>
+    <w:lsdException w:name="index 6" w:semiHidden="1" w:unhideWhenUsed="1"/>
+    <w:lsdException w:name="index 7" w:semiHidden="1" w:unhideWhenUsed="1"/>
+    <w:lsdException w:name="index 8" w:semiHidden="1" w:unhideWhenUsed="1"/>
+    <w:lsdException w:name="index 9" w:semiHidden="1" w:unhideWhenUsed="1"/>
+    <w:lsdException w:name="toc 1" w:semiHidden="1" w:uiPriority="39" w:unhideWhenUsed="1"/>
+    <w:lsdException w:name="toc 2" w:semiHidden="1" w:uiPriority="39" w:unhideWhenUsed="1"/>
+    <w:lsdException w:name="toc 3" w:semiHidden="1" w:uiPriority="39" w:unhideWhenUsed="1"/>
+    <w:lsdException w:name="toc 4" w:semiHidden="1" w:uiPriority="39" w:unhideWhenUsed="1"/>
+    <w:lsdException w:name="toc 5" w:semiHidden="1" w:uiPriority="39" w:unhideWhenUsed="1"/>
+    <w:lsdException w:name="toc 6" w:semiHidden="1" w:uiPriority="39" w:unhideWhenUsed="1"/>
+    <w:lsdException w:name="toc 7" w:semiHidden="1" w:uiPriority="39" w:unhideWhenUsed="1"/>
+    <w:lsdException w:name="toc 8" w:semiHidden="1" w:uiPriority="39" w:unhideWhenUsed="1"/>
+    <w:lsdException w:name="toc 9" w:semiHidden="1" w:uiPriority="39" w:unhideWhenUsed="1"/>
+    <w:lsdException w:name="Normal Indent" w:semiHidden="1" w:unhideWhenUsed="1"/>
+    <w:lsdException w:name="footnote text" w:semiHidden="1" w:unhideWhenUsed="1"/>
+    <w:lsdException w:name="annotation text" w:semiHidden="1" w:unhideWhenUsed="1"/>
+    <w:lsdException w:name="header" w:semiHidden="1" w:unhideWhenUsed="1"/>
+    <w:lsdException w:name="footer" w:semiHidden="1" w:unhideWhenUsed="1"/>
+    <w:lsdException w:name="index heading" w:semiHidden="1" w:unhideWhenUsed="1"/>
+    <w:lsdException w:name="caption" w:semiHidden="1" w:uiPriority="35" w:unhideWhenUsed="1" w:qFormat="1"/>
+    <w:lsdException w:name="table of figures" w:semiHidden="1" w:unhideWhenUsed="1"/>
+    <w:lsdException w:name="envelope address" w:semiHidden="1" w:unhideWhenUsed="1"/>
+    <w:lsdException w:name="envelope return" w:semiHidden="1" w:unhideWhenUsed="1"/>
+    <w:lsdException w:name="footnote reference" w:semiHidden="1" w:unhideWhenUsed="1"/>
+    <w:lsdException w:name="annotation reference" w:semiHidden="1" w:unhideWhenUsed="1"/>
+    <w:lsdException w:name="line number" w:semiHidden="1" w:unhideWhenUsed="1"/>
+    <w:lsdException w:name="page number" w:semiHidden="1" w:unhideWhenUsed="1"/>
+    <w:lsdException w:name="endnote reference" w:semiHidden="1" w:unhideWhenUsed="1"/>
+    <w:lsdException w:name="endnote text" w:semiHidden="1" w:unhideWhenUsed="1"/>
+    <w:lsdException w:name="table of authorities" w:semiHidden="1" w:unhideWhenUsed="1"/>
+    <w:lsdException w:name="macro" w:semiHidden="1" w:unhideWhenUsed="1"/>
+    <w:lsdException w:name="toa heading" w:semiHidden="1" w:unhideWhenUsed="1"/>
+    <w:lsdException w:name="List" w:semiHidden="1" w:unhideWhenUsed="1"/>
+    <w:lsdException w:name="List Bullet" w:semiHidden="1" w:unhideWhenUsed="1"/>
+    <w:lsdException w:name="List Number" w:semiHidden="1" w:unhideWhenUsed="1"/>
+    <w:lsdException w:name="List 2" w:semiHidden="1" w:unhideWhenUsed="1"/>
+    <w:lsdException w:name="List 3" w:semiHidden="1" w:unhideWhenUsed="1"/>
+    <w:lsdException w:name="List 4" w:semiHidden="1" w:unhideWhenUsed="1"/>
+    <w:lsdException w:name="List 5" w:semiHidden="1" w:unhideWhenUsed="1"/>
+    <w:lsdException w:name="List Bullet 2" w:semiHidden="1" w:unhideWhenUsed="1"/>
+    <w:lsdException w:name="List Bullet 3" w:semiHidden="1" w:unhideWhenUsed="1"/>
+    <w:lsdException w:name="List Bullet 4" w:semiHidden="1" w:unhideWhenUsed="1"/>
+    <w:lsdException w:name="List Bullet 5" w:semiHidden="1" w:unhideWhenUsed="1"/>
+    <w:lsdException w:name="List Number 2" w:semiHidden="1" w:unhideWhenUsed="1"/>
+    <w:lsdException w:name="List Number 3" w:semiHidden="1" w:unhideWhenUsed="1"/>
+    <w:lsdException w:name="List Number 4" w:semiHidden="1" w:unhideWhenUsed="1"/>
+    <w:lsdException w:name="List Number 5" w:semiHidden="1" w:unhideWhenUsed="1"/>
+    <w:lsdException w:name="Title" w:uiPriority="10" w:qFormat="1"/>
+    <w:lsdException w:name="Closing" w:semiHidden="1" w:unhideWhenUsed="1"/>
+    <w:lsdException w:name="Signature" w:semiHidden="1" w:unhideWhenUsed="1"/>
+    <w:lsdException w:name="Default Paragraph Font" w:semiHidden="1" w:uiPriority="1" w:unhideWhenUsed="1"/>
+    <w:lsdException w:name="Body Text" w:semiHidden="1" w:unhideWhenUsed="1"/>
+    <w:lsdException w:name="Body Text Indent" w:semiHidden="1" w:uiPriority="0" w:unhideWhenUsed="1"/>
+    <w:lsdException w:name="List Continue" w:semiHidden="1" w:unhideWhenUsed="1"/>
+    <w:lsdException w:name="List Continue 2" w:semiHidden="1" w:unhideWhenUsed="1"/>
+    <w:lsdException w:name="List Continue 3" w:semiHidden="1" w:unhideWhenUsed="1"/>
+    <w:lsdException w:name="List Continue 4" w:semiHidden="1" w:unhideWhenUsed="1"/>
+    <w:lsdException w:name="List Continue 5" w:semiHidden="1" w:unhideWhenUsed="1"/>
+    <w:lsdException w:name="Message Header" w:semiHidden="1" w:unhideWhenUsed="1"/>
+    <w:lsdException w:name="Subtitle" w:uiPriority="11" w:qFormat="1"/>
+    <w:lsdException w:name="Salutation" w:semiHidden="1" w:unhideWhenUsed="1"/>
+    <w:lsdException w:name="Date" w:semiHidden="1" w:unhideWhenUsed="1"/>
+    <w:lsdException w:name="Body Text First Indent" w:semiHidden="1" w:unhideWhenUsed="1"/>
+    <w:lsdException w:name="Body Text First Indent 2" w:semiHidden="1" w:unhideWhenUsed="1"/>
+    <w:lsdException w:name="Note Heading" w:semiHidden="1" w:unhideWhenUsed="1"/>
+    <w:lsdException w:name="Body Text 2" w:semiHidden="1" w:unhideWhenUsed="1"/>
+    <w:lsdException w:name="Body Text 3" w:semiHidden="1" w:unhideWhenUsed="1"/>
+    <w:lsdException w:name="Body Text Indent 2" w:semiHidden="1" w:unhideWhenUsed="1"/>
+    <w:lsdException w:name="Body Text Indent 3" w:semiHidden="1" w:unhideWhenUsed="1"/>
+    <w:lsdException w:name="Block Text" w:semiHidden="1" w:unhideWhenUsed="1"/>
+    <w:lsdException w:name="Hyperlink" w:semiHidden="1" w:unhideWhenUsed="1"/>
+    <w:lsdException w:name="FollowedHyperlink" w:semiHidden="1" w:unhideWhenUsed="1"/>
+    <w:lsdException w:name="Strong" w:uiPriority="22" w:qFormat="1"/>
+    <w:lsdException w:name="Emphasis" w:uiPriority="20" w:qFormat="1"/>
+    <w:lsdException w:name="Document Map" w:semiHidden="1" w:unhideWhenUsed="1"/>
+    <w:lsdException w:name="Plain Text" w:semiHidden="1" w:unhideWhenUsed="1"/>
+    <w:lsdException w:name="E-mail Signature" w:semiHidden="1" w:unhideWhenUsed="1"/>
+    <w:lsdException w:name="HTML Top of Form" w:semiHidden="1" w:unhideWhenUsed="1"/>
+    <w:lsdException w:name="HTML Bottom of Form" w:semiHidden="1" w:unhideWhenUsed="1"/>
+    <w:lsdException w:name="Normal (Web)" w:semiHidden="1" w:unhideWhenUsed="1"/>
+    <w:lsdException w:name="HTML Acronym" w:semiHidden="1" w:unhideWhenUsed="1"/>
+    <w:lsdException w:name="HTML Address" w:semiHidden="1" w:unhideWhenUsed="1"/>
+    <w:lsdException w:name="HTML Cite" w:semiHidden="1" w:unhideWhenUsed="1"/>
+    <w:lsdException w:name="HTML Code" w:semiHidden="1" w:unhideWhenUsed="1"/>
+    <w:lsdException w:name="HTML Definition" w:semiHidden="1" w:unhideWhenUsed="1"/>
+    <w:lsdException w:name="HTML Keyboard" w:semiHidden="1" w:unhideWhenUsed="1"/>
+    <w:lsdException w:name="HTML Preformatted" w:semiHidden="1" w:unhideWhenUsed="1"/>
+    <w:lsdException w:name="HTML Sample" w:semiHidden="1" w:unhideWhenUsed="1"/>
+    <w:lsdException w:name="HTML Typewriter" w:semiHidden="1" w:unhideWhenUsed="1"/>
+    <w:lsdException w:name="HTML Variable" w:semiHidden="1" w:unhideWhenUsed="1"/>
+    <w:lsdException w:name="Normal Table" w:semiHidden="1" w:unhideWhenUsed="1"/>
+    <w:lsdException w:name="annotation subject" w:semiHidden="1" w:unhideWhenUsed="1"/>
+    <w:lsdException w:name="No List" w:semiHidden="1" w:unhideWhenUsed="1"/>
+    <w:lsdException w:name="Outline List 1" w:semiHidden="1" w:unhideWhenUsed="1"/>
+    <w:lsdException w:name="Outline List 2" w:semiHidden="1" w:unhideWhenUsed="1"/>
+    <w:lsdException w:name="Outline List 3" w:semiHidden="1" w:unhideWhenUsed="1"/>
+    <w:lsdException w:name="Table Simple 1" w:semiHidden="1" w:unhideWhenUsed="1"/>
+    <w:lsdException w:name="Table Simple 2" w:semiHidden="1" w:unhideWhenUsed="1"/>
+    <w:lsdException w:name="Table Simple 3" w:semiHidden="1" w:unhideWhenUsed="1"/>
+    <w:lsdException w:name="Table Classic 1" w:semiHidden="1" w:unhideWhenUsed="1"/>
+    <w:lsdException w:name="Table Classic 2" w:semiHidden="1" w:unhideWhenUsed="1"/>
+    <w:lsdException w:name="Table Classic 3" w:semiHidden="1" w:unhideWhenUsed="1"/>
+    <w:lsdException w:name="Table Classic 4" w:semiHidden="1" w:unhideWhenUsed="1"/>
+    <w:lsdException w:name="Table Colorful 1" w:semiHidden="1" w:unhideWhenUsed="1"/>
+    <w:lsdException w:name="Table Colorful 2" w:semiHidden="1" w:unhideWhenUsed="1"/>
+    <w:lsdException w:name="Table Colorful 3" w:semiHidden="1" w:unhideWhenUsed="1"/>
+    <w:lsdException w:name="Table Columns 1" w:semiHidden="1" w:unhideWhenUsed="1"/>
+    <w:lsdException w:name="Table Columns 2" w:semiHidden="1" w:unhideWhenUsed="1"/>
+    <w:lsdException w:name="Table Columns 3" w:semiHidden="1" w:unhideWhenUsed="1"/>
+    <w:lsdException w:name="Table Columns 4" w:semiHidden="1" w:unhideWhenUsed="1"/>
+    <w:lsdException w:name="Table Columns 5" w:semiHidden="1" w:unhideWhenUsed="1"/>
+    <w:lsdException w:name="Table Grid 1" w:semiHidden="1" w:unhideWhenUsed="1"/>
+    <w:lsdException w:name="Table Grid 2" w:semiHidden="1" w:unhideWhenUsed="1"/>
+    <w:lsdException w:name="Table Grid 3" w:semiHidden="1" w:unhideWhenUsed="1"/>
+    <w:lsdException w:name="Table Grid 4" w:semiHidden="1" w:unhideWhenUsed="1"/>
+    <w:lsdException w:name="Table Grid 5" w:semiHidden="1" w:unhideWhenUsed="1"/>
+    <w:lsdException w:name="Table Grid 6" w:semiHidden="1" w:unhideWhenUsed="1"/>
+    <w:lsdException w:name="Table Grid 7" w:semiHidden="1" w:unhideWhenUsed="1"/>
+    <w:lsdException w:name="Table Grid 8" w:semiHidden="1" w:unhideWhenUsed="1"/>
+    <w:lsdException w:name="Table List 1" w:semiHidden="1" w:unhideWhenUsed="1"/>
+    <w:lsdException w:name="Table List 2" w:semiHidden="1" w:unhideWhenUsed="1"/>
+    <w:lsdException w:name="Table List 3" w:semiHidden="1" w:unhideWhenUsed="1"/>
+    <w:lsdException w:name="Table List 4" w:semiHidden="1" w:unhideWhenUsed="1"/>
+    <w:lsdException w:name="Table List 5" w:semiHidden="1" w:unhideWhenUsed="1"/>
+    <w:lsdException w:name="Table List 6" w:semiHidden="1" w:unhideWhenUsed="1"/>
+    <w:lsdException w:name="Table List 7" w:semiHidden="1" w:unhideWhenUsed="1"/>
+    <w:lsdException w:name="Table List 8" w:semiHidden="1" w:unhideWhenUsed="1"/>
+    <w:lsdException w:name="Table 3D effects 1" w:semiHidden="1" w:unhideWhenUsed="1"/>
+    <w:lsdException w:name="Table 3D effects 2" w:semiHidden="1" w:unhideWhenUsed="1"/>
+    <w:lsdException w:name="Table 3D effects 3" w:semiHidden="1" w:unhideWhenUsed="1"/>
+    <w:lsdException w:name="Table Contemporary" w:semiHidden="1" w:unhideWhenUsed="1"/>
+    <w:lsdException w:name="Table Elegant" w:semiHidden="1" w:unhideWhenUsed="1"/>
+    <w:lsdException w:name="Table Professional" w:semiHidden="1" w:unhideWhenUsed="1"/>
+    <w:lsdException w:name="Table Subtle 1" w:semiHidden="1" w:unhideWhenUsed="1"/>
+    <w:lsdException w:name="Table Subtle 2" w:semiHidden="1" w:unhideWhenUsed="1"/>
+    <w:lsdException w:name="Table Web 1" w:semiHidden="1" w:unhideWhenUsed="1"/>
+    <w:lsdException w:name="Table Web 2" w:semiHidden="1" w:unhideWhenUsed="1"/>
+    <w:lsdException w:name="Table Web 3" w:semiHidden="1" w:unhideWhenUsed="1"/>
+    <w:lsdException w:name="Balloon Text" w:semiHidden="1" w:unhideWhenUsed="1"/>
+    <w:lsdException w:name="Table Grid" w:semiHidden="1" w:uiPriority="59" w:unhideWhenUsed="1"/>
+    <w:lsdException w:name="Table Theme" w:semiHidden="1" w:unhideWhenUsed="1"/>
+    <w:lsdException w:name="Placeholder Text" w:semiHidden="1"/>
+    <w:lsdException w:name="No Spacing" w:uiPriority="1" w:qFormat="1"/>
+    <w:lsdException w:name="Light Shading" w:uiPriority="60"/>
+    <w:lsdException w:name="Light List" w:uiPriority="61"/>
+    <w:lsdException w:name="Light Grid" w:uiPriority="62"/>
+    <w:lsdException w:name="Medium Shading 1" w:uiPriority="63"/>
+    <w:lsdException w:name="Medium Shading 2" w:uiPriority="64"/>
+    <w:lsdException w:name="Medium List 1" w:uiPriority="65"/>
+    <w:lsdException w:name="Medium List 2" w:uiPriority="66"/>
+    <w:lsdException w:name="Medium Grid 1" w:uiPriority="67"/>
+    <w:lsdException w:name="Medium Grid 2" w:uiPriority="68"/>
+    <w:lsdException w:name="Medium Grid 3" w:uiPriority="69"/>
+    <w:lsdException w:name="Dark List" w:uiPriority="70"/>
+    <w:lsdException w:name="Colorful Shading" w:uiPriority="71"/>
+    <w:lsdException w:name="Colorful List" w:uiPriority="72"/>
+    <w:lsdException w:name="Colorful Grid" w:uiPriority="73"/>
+    <w:lsdException w:name="Light Shading Accent 1" w:uiPriority="60"/>
+    <w:lsdException w:name="Light List Accent 1" w:uiPriority="61"/>
+    <w:lsdException w:name="Light Grid Accent 1" w:uiPriority="62"/>
+    <w:lsdException w:name="Medium Shading 1 Accent 1" w:uiPriority="63"/>
+    <w:lsdException w:name="Medium Shading 2 Accent 1" w:uiPriority="64"/>
+    <w:lsdException w:name="Medium List 1 Accent 1" w:uiPriority="65"/>
+    <w:lsdException w:name="Revision" w:semiHidden="1"/>
+    <w:lsdException w:name="List Paragraph" w:uiPriority="34" w:qFormat="1"/>
+    <w:lsdException w:name="Quote" w:uiPriority="29" w:qFormat="1"/>
+    <w:lsdException w:name="Intense Quote" w:uiPriority="30" w:qFormat="1"/>
+    <w:lsdException w:name="Medium List 2 Accent 1" w:uiPriority="66"/>
+    <w:lsdException w:name="Medium Grid 1 Accent 1" w:uiPriority="67"/>
+    <w:lsdException w:name="Medium Grid 2 Accent 1" w:uiPriority="68"/>
+    <w:lsdException w:name="Medium Grid 3 Accent 1" w:uiPriority="69"/>
+    <w:lsdException w:name="Dark List Accent 1" w:uiPriority="70"/>
+    <w:lsdException w:name="Colorful Shading Accent 1" w:uiPriority="71"/>
+    <w:lsdException w:name="Colorful List Accent 1" w:uiPriority="72"/>
+    <w:lsdException w:name="Colorful Grid Accent 1" w:uiPriority="73"/>
+    <w:lsdException w:name="Light Shading Accent 2" w:uiPriority="60"/>
+    <w:lsdException w:name="Light List Accent 2" w:uiPriority="61"/>
+    <w:lsdException w:name="Light Grid Accent 2" w:uiPriority="62"/>
+    <w:lsdException w:name="Medium Shading 1 Accent 2" w:uiPriority="63"/>
+    <w:lsdException w:name="Medium Shading 2 Accent 2" w:uiPriority="64"/>
+    <w:lsdException w:name="Medium List 1 Accent 2" w:uiPriority="65"/>
+    <w:lsdException w:name="Medium List 2 Accent 2" w:uiPriority="66"/>
+    <w:lsdException w:name="Medium Grid 1 Accent 2" w:uiPriority="67"/>
+    <w:lsdException w:name="Medium Grid 2 Accent 2" w:uiPriority="68"/>
+    <w:lsdException w:name="Medium Grid 3 Accent 2" w:uiPriority="69"/>
+    <w:lsdException w:name="Dark List Accent 2" w:uiPriority="70"/>
+    <w:lsdException w:name="Colorful Shading Accent 2" w:uiPriority="71"/>
+    <w:lsdException w:name="Colorful List Accent 2" w:uiPriority="72"/>
+    <w:lsdException w:name="Colorful Grid Accent 2" w:uiPriority="73"/>
+    <w:lsdException w:name="Light Shading Accent 3" w:uiPriority="60"/>
+    <w:lsdException w:name="Light List Accent 3" w:uiPriority="61"/>
+    <w:lsdException w:name="Light Grid Accent 3" w:uiPriority="62"/>
+    <w:lsdException w:name="Medium Shading 1 Accent 3" w:uiPriority="63"/>
+    <w:lsdException w:name="Medium Shading 2 Accent 3" w:uiPriority="64"/>
+    <w:lsdException w:name="Medium List 1 Accent 3" w:uiPriority="65"/>
+    <w:lsdException w:name="Medium List 2 Accent 3" w:uiPriority="66"/>
+    <w:lsdException w:name="Medium Grid 1 Accent 3" w:uiPriority="67"/>
+    <w:lsdException w:name="Medium Grid 2 Accent 3" w:uiPriority="68"/>
+    <w:lsdException w:name="Medium Grid 3 Accent 3" w:uiPriority="69"/>
+    <w:lsdException w:name="Dark List Accent 3" w:uiPriority="70"/>
+    <w:lsdException w:name="Colorful Shading Accent 3" w:uiPriority="71"/>
+    <w:lsdException w:name="Colorful List Accent 3" w:uiPriority="72"/>
+    <w:lsdException w:name="Colorful Grid Accent 3" w:uiPriority="73"/>
+    <w:lsdException w:name="Light Shading Accent 4" w:uiPriority="60"/>
+    <w:lsdException w:name="Light List Accent 4" w:uiPriority="61"/>
+    <w:lsdException w:name="Light Grid Accent 4" w:uiPriority="62"/>
+    <w:lsdException w:name="Medium Shading 1 Accent 4" w:uiPriority="63"/>
+    <w:lsdException w:name="Medium Shading 2 Accent 4" w:uiPriority="64"/>
+    <w:lsdException w:name="Medium List 1 Accent 4" w:uiPriority="65"/>
+    <w:lsdException w:name="Medium List 2 Accent 4" w:uiPriority="66"/>
+    <w:lsdException w:name="Medium Grid 1 Accent 4" w:uiPriority="67"/>
+    <w:lsdException w:name="Medium Grid 2 Accent 4" w:uiPriority="68"/>
+    <w:lsdException w:name="Medium Grid 3 Accent 4" w:uiPriority="69"/>
+    <w:lsdException w:name="Dark List Accent 4" w:uiPriority="70"/>
+    <w:lsdException w:name="Colorful Shading Accent 4" w:uiPriority="71"/>
+    <w:lsdException w:name="Colorful List Accent 4" w:uiPriority="72"/>
+    <w:lsdException w:name="Colorful Grid Accent 4" w:uiPriority="73"/>
+    <w:lsdException w:name="Light Shading Accent 5" w:uiPriority="60"/>
+    <w:lsdException w:name="Light List Accent 5" w:uiPriority="61"/>
+    <w:lsdException w:name="Light Grid Accent 5" w:uiPriority="62"/>
+    <w:lsdException w:name="Medium Shading 1 Accent 5" w:uiPriority="63"/>
+    <w:lsdException w:name="Medium Shading 2 Accent 5" w:uiPriority="64"/>
+    <w:lsdException w:name="Medium List 1 Accent 5" w:uiPriority="65"/>
+    <w:lsdException w:name="Medium List 2 Accent 5" w:uiPriority="66"/>
+    <w:lsdException w:name="Medium Grid 1 Accent 5" w:uiPriority="67"/>
+    <w:lsdException w:name="Medium Grid 2 Accent 5" w:uiPriority="68"/>
+    <w:lsdException w:name="Medium Grid 3 Accent 5" w:uiPriority="69"/>
+    <w:lsdException w:name="Dark List Accent 5" w:uiPriority="70"/>
+    <w:lsdException w:name="Colorful Shading Accent 5" w:uiPriority="71"/>
+    <w:lsdException w:name="Colorful List Accent 5" w:uiPriority="72"/>
+    <w:lsdException w:name="Colorful Grid Accent 5" w:uiPriority="73"/>
+    <w:lsdException w:name="Light Shading Accent 6" w:uiPriority="60"/>
+    <w:lsdException w:name="Light List Accent 6" w:uiPriority="61"/>
+    <w:lsdException w:name="Light Grid Accent 6" w:uiPriority="62"/>
+    <w:lsdException w:name="Medium Shading 1 Accent 6" w:uiPriority="63"/>
+    <w:lsdException w:name="Medium Shading 2 Accent 6" w:uiPriority="64"/>
+    <w:lsdException w:name="Medium List 1 Accent 6" w:uiPriority="65"/>
+    <w:lsdException w:name="Medium List 2 Accent 6" w:uiPriority="66"/>
+    <w:lsdException w:name="Medium Grid 1 Accent 6" w:uiPriority="67"/>
+    <w:lsdException w:name="Medium Grid 2 Accent 6" w:uiPriority="68"/>
+    <w:lsdException w:name="Medium Grid 3 Accent 6" w:uiPriority="69"/>
+    <w:lsdException w:name="Dark List Accent 6" w:uiPriority="70"/>
+    <w:lsdException w:name="Colorful Shading Accent 6" w:uiPriority="71"/>
+    <w:lsdException w:name="Colorful List Accent 6" w:uiPriority="72"/>
+    <w:lsdException w:name="Colorful Grid Accent 6" w:uiPriority="73"/>
+    <w:lsdException w:name="Subtle Emphasis" w:uiPriority="19" w:qFormat="1"/>
+    <w:lsdException w:name="Intense Emphasis" w:uiPriority="21" w:qFormat="1"/>
+    <w:lsdException w:name="Subtle Reference" w:uiPriority="31" w:qFormat="1"/>
+    <w:lsdException w:name="Intense Reference" w:uiPriority="32" w:qFormat="1"/>
+    <w:lsdException w:name="Book Title" w:uiPriority="33" w:qFormat="1"/>
+    <w:lsdException w:name="Bibliography" w:semiHidden="1" w:uiPriority="37" w:unhideWhenUsed="1"/>
+    <w:lsdException w:name="TOC Heading" w:semiHidden="1" w:uiPriority="39" w:unhideWhenUsed="1" w:qFormat="1"/>
+    <w:lsdException w:name="Plain Table 1" w:uiPriority="41"/>
+    <w:lsdException w:name="Plain Table 2" w:uiPriority="42"/>
+    <w:lsdException w:name="Plain Table 3" w:uiPriority="43"/>
+    <w:lsdException w:name="Plain Table 4" w:uiPriority="44"/>
+    <w:lsdException w:name="Plain Table 5" w:uiPriority="45"/>
+    <w:lsdException w:name="Grid Table Light" w:uiPriority="40"/>
+    <w:lsdException w:name="Grid Table 1 Light" w:uiPriority="46"/>
+    <w:lsdException w:name="Grid Table 2" w:uiPriority="47"/>
+    <w:lsdException w:name="Grid Table 3" w:uiPriority="48"/>
+    <w:lsdException w:name="Grid Table 4" w:uiPriority="49"/>
+    <w:lsdException w:name="Grid Table 5 Dark" w:uiPriority="50"/>
+    <w:lsdException w:name="Grid Table 6 Colorful" w:uiPriority="51"/>
+    <w:lsdException w:name="Grid Table 7 Colorful" w:uiPriority="52"/>
+    <w:lsdException w:name="Grid Table 1 Light Accent 1" w:uiPriority="46"/>
+    <w:lsdException w:name="Grid Table 2 Accent 1" w:uiPriority="47"/>
+    <w:lsdException w:name="Grid Table 3 Accent 1" w:uiPriority="48"/>
+    <w:lsdException w:name="Grid Table 4 Accent 1" w:uiPriority="49"/>
+    <w:lsdException w:name="Grid Table 5 Dark Accent 1" w:uiPriority="50"/>
+    <w:lsdException w:name="Grid Table 6 Colorful Accent 1" w:uiPriority="51"/>
+    <w:lsdException w:name="Grid Table 7 Colorful Accent 1" w:uiPriority="52"/>
+    <w:lsdException w:name="Grid Table 1 Light Accent 2" w:uiPriority="46"/>
+    <w:lsdException w:name="Grid Table 2 Accent 2" w:uiPriority="47"/>
+    <w:lsdException w:name="Grid Table 3 Accent 2" w:uiPriority="48"/>
+    <w:lsdException w:name="Grid Table 4 Accent 2" w:uiPriority="49"/>
+    <w:lsdException w:name="Grid Table 5 Dark Accent 2" w:uiPriority="50"/>
+    <w:lsdException w:name="Grid Table 6 Colorful Accent 2" w:uiPriority="51"/>
+    <w:lsdException w:name="Grid Table 7 Colorful Accent 2" w:uiPriority="52"/>
+    <w:lsdException w:name="Grid Table 1 Light Accent 3" w:uiPriority="46"/>
+    <w:lsdException w:name="Grid Table 2 Accent 3" w:uiPriority="47"/>
+    <w:lsdException w:name="Grid Table 3 Accent 3" w:uiPriority="48"/>
+    <w:lsdException w:name="Grid Table 4 Accent 3" w:uiPriority="49"/>
+    <w:lsdException w:name="Grid Table 5 Dark Accent 3" w:uiPriority="50"/>
+    <w:lsdException w:name="Grid Table 6 Colorful Accent 3" w:uiPriority="51"/>
+    <w:lsdException w:name="Grid Table 7 Colorful Accent 3" w:uiPriority="52"/>
+    <w:lsdException w:name="Grid Table 1 Light Accent 4" w:uiPriority="46"/>
+    <w:lsdException w:name="Grid Table 2 Accent 4" w:uiPriority="47"/>
+    <w:lsdException w:name="Grid Table 3 Accent 4" w:uiPriority="48"/>
+    <w:lsdException w:name="Grid Table 4 Accent 4" w:uiPriority="49"/>
+    <w:lsdException w:name="Grid Table 5 Dark Accent 4" w:uiPriority="50"/>
+    <w:lsdException w:name="Grid Table 6 Colorful Accent 4" w:uiPriority="51"/>
+    <w:lsdException w:name="Grid Table 7 Colorful Accent 4" w:uiPriority="52"/>
+    <w:lsdException w:name="Grid Table 1 Light Accent 5" w:uiPriority="46"/>
+    <w:lsdException w:name="Grid Table 2 Accent 5" w:uiPriority="47"/>
+    <w:lsdException w:name="Grid Table 3 Accent 5" w:uiPriority="48"/>
+    <w:lsdException w:name="Grid Table 4 Accent 5" w:uiPriority="49"/>
+    <w:lsdException w:name="Grid Table 5 Dark Accent 5" w:uiPriority="50"/>
+    <w:lsdException w:name="Grid Table 6 Colorful Accent 5" w:uiPriority="51"/>
+    <w:lsdException w:name="Grid Table 7 Colorful Accent 5" w:uiPriority="52"/>
+    <w:lsdException w:name="Grid Table 1 Light Accent 6" w:uiPriority="46"/>
+    <w:lsdException w:name="Grid Table 2 Accent 6" w:uiPriority="47"/>
+    <w:lsdException w:name="Grid Table 3 Accent 6" w:uiPriority="48"/>
+    <w:lsdException w:name="Grid Table 4 Accent 6" w:uiPriority="49"/>
+    <w:lsdException w:name="Grid Table 5 Dark Accent 6" w:uiPriority="50"/>
+    <w:lsdException w:name="Grid Table 6 Colorful Accent 6" w:uiPriority="51"/>
+    <w:lsdException w:name="Grid Table 7 Colorful Accent 6" w:uiPriority="52"/>
+    <w:lsdException w:name="List Table 1 Light" w:uiPriority="46"/>
+    <w:lsdException w:name="List Table 2" w:uiPriority="47"/>
+    <w:lsdException w:name="List Table 3" w:uiPriority="48"/>
+    <w:lsdException w:name="List Table 4" w:uiPriority="49"/>
+    <w:lsdException w:name="List Table 5 Dark" w:uiPriority="50"/>
+    <w:lsdException w:name="List Table 6 Colorful" w:uiPriority="51"/>
+    <w:lsdException w:name="List Table 7 Colorful" w:uiPriority="52"/>
+    <w:lsdException w:name="List Table 1 Light Accent 1" w:uiPriority="46"/>
+    <w:lsdException w:name="List Table 2 Accent 1" w:uiPriority="47"/>
+    <w:lsdException w:name="List Table 3 Accent 1" w:uiPriority="48"/>
+    <w:lsdException w:name="List Table 4 Accent 1" w:uiPriority="49"/>
+    <w:lsdException w:name="List Table 5 Dark Accent 1" w:uiPriority="50"/>
+    <w:lsdException w:name="List Table 6 Colorful Accent 1" w:uiPriority="51"/>
+    <w:lsdException w:name="List Table 7 Colorful Accent 1" w:uiPriority="52"/>
+    <w:lsdException w:name="List Table 1 Light Accent 2" w:uiPriority="46"/>
+    <w:lsdException w:name="List Table 2 Accent 2" w:uiPriority="47"/>
+    <w:lsdException w:name="List Table 3 Accent 2" w:uiPriority="48"/>
+    <w:lsdException w:name="List Table 4 Accent 2" w:uiPriority="49"/>
+    <w:lsdException w:name="List Table 5 Dark Accent 2" w:uiPriority="50"/>
+    <w:lsdException w:name="List Table 6 Colorful Accent 2" w:uiPriority="51"/>
+    <w:lsdException w:name="List Table 7 Colorful Accent 2" w:uiPriority="52"/>
+    <w:lsdException w:name="List Table 1 Light Accent 3" w:uiPriority="46"/>
+    <w:lsdException w:name="List Table 2 Accent 3" w:uiPriority="47"/>
+    <w:lsdException w:name="List Table 3 Accent 3" w:uiPriority="48"/>
+    <w:lsdException w:name="List Table 4 Accent 3" w:uiPriority="49"/>
+    <w:lsdException w:name="List Table 5 Dark Accent 3" w:uiPriority="50"/>
+    <w:lsdException w:name="List Table 6 Colorful Accent 3" w:uiPriority="51"/>
+    <w:lsdException w:name="List Table 7 Colorful Accent 3" w:uiPriority="52"/>
+    <w:lsdException w:name="List Table 1 Light Accent 4" w:uiPriority="46"/>
+    <w:lsdException w:name="List Table 2 Accent 4" w:uiPriority="47"/>
+    <w:lsdException w:name="List Table 3 Accent 4" w:uiPriority="48"/>
+    <w:lsdException w:name="List Table 4 Accent 4" w:uiPriority="49"/>
+    <w:lsdException w:name="List Table 5 Dark Accent 4" w:uiPriority="50"/>
+    <w:lsdException w:name="List Table 6 Colorful Accent 4" w:uiPriority="51"/>
+    <w:lsdException w:name="List Table 7 Colorful Accent 4" w:uiPriority="52"/>
+    <w:lsdException w:name="List Table 1 Light Accent 5" w:uiPriority="46"/>
+    <w:lsdException w:name="List Table 2 Accent 5" w:uiPriority="47"/>
+    <w:lsdException w:name="List Table 3 Accent 5" w:uiPriority="48"/>
+    <w:lsdException w:name="List Table 4 Accent 5" w:uiPriority="49"/>
+    <w:lsdException w:name="List Table 5 Dark Accent 5" w:uiPriority="50"/>
+    <w:lsdException w:name="List Table 6 Colorful Accent 5" w:uiPriority="51"/>
+    <w:lsdException w:name="List Table 7 Colorful Accent 5" w:uiPriority="52"/>
+    <w:lsdException w:name="List Table 1 Light Accent 6" w:uiPriority="46"/>
+    <w:lsdException w:name="List Table 2 Accent 6" w:uiPriority="47"/>
+    <w:lsdException w:name="List Table 3 Accent 6" w:uiPriority="48"/>
+    <w:lsdException w:name="List Table 4 Accent 6" w:uiPriority="49"/>
+    <w:lsdException w:name="List Table 5 Dark Accent 6" w:uiPriority="50"/>
+    <w:lsdException w:name="List Table 6 Colorful Accent 6" w:uiPriority="51"/>
+    <w:lsdException w:name="List Table 7 Colorful Accent 6" w:uiPriority="52"/>
+    <w:lsdException w:name="Mention" w:semiHidden="1" w:unhideWhenUsed="1"/>
+    <w:lsdException w:name="Smart Hyperlink" w:semiHidden="1" w:unhideWhenUsed="1"/>
+    <w:lsdException w:name="Hashtag" w:semiHidden="1" w:unhideWhenUsed="1"/>
+    <w:lsdException w:name="Unresolved Mention" w:semiHidden="1" w:unhideWhenUsed="1"/>
+    <w:lsdException w:name="Smart Link" w:semiHidden="1" w:unhideWhenUsed="1"/>
   </w:latentStyles>
-  <w:style w:type="paragraph" w:styleId="Normal" w:default="1">
+  <w:style w:type="paragraph" w:default="1" w:styleId="Normal">
     <w:name w:val="Normal"/>
     <w:qFormat/>
     <w:rsid w:val="00A1044A"/>
@@ -5560,24 +5675,23 @@
       <w:outlineLvl w:val="6"/>
     </w:pPr>
     <w:rPr>
-      <w:rFonts w:ascii="Arial" w:hAnsi="Arial" w:eastAsia="Times New Roman" w:cs="Times New Roman"/>
+      <w:rFonts w:ascii="Arial" w:eastAsia="Times New Roman" w:hAnsi="Arial" w:cs="Times New Roman"/>
       <w:color w:val="000000"/>
       <w:sz w:val="24"/>
       <w:szCs w:val="20"/>
     </w:rPr>
   </w:style>
-  <w:style w:type="character" w:styleId="Fontepargpadro" w:default="1">
+  <w:style w:type="character" w:default="1" w:styleId="Fontepargpadro">
     <w:name w:val="Default Paragraph Font"/>
     <w:uiPriority w:val="1"/>
     <w:semiHidden/>
     <w:unhideWhenUsed/>
   </w:style>
-  <w:style w:type="table" w:styleId="Tabelanormal" w:default="1">
+  <w:style w:type="table" w:default="1" w:styleId="Tabelanormal">
     <w:name w:val="Normal Table"/>
     <w:uiPriority w:val="99"/>
     <w:semiHidden/>
     <w:unhideWhenUsed/>
-    <w:qFormat/>
     <w:tblPr>
       <w:tblInd w:w="0" w:type="dxa"/>
       <w:tblCellMar>
@@ -5588,7 +5702,7 @@
       </w:tblCellMar>
     </w:tblPr>
   </w:style>
-  <w:style w:type="numbering" w:styleId="Semlista" w:default="1">
+  <w:style w:type="numbering" w:default="1" w:styleId="Semlista">
     <w:name w:val="No List"/>
     <w:uiPriority w:val="99"/>
     <w:semiHidden/>
@@ -5603,21 +5717,14 @@
       <w:spacing w:after="0" w:line="240" w:lineRule="auto"/>
     </w:pPr>
     <w:tblPr>
-      <w:tblInd w:w="0" w:type="dxa"/>
       <w:tblBorders>
-        <w:top w:val="single" w:color="auto" w:sz="4" w:space="0"/>
-        <w:left w:val="single" w:color="auto" w:sz="4" w:space="0"/>
-        <w:bottom w:val="single" w:color="auto" w:sz="4" w:space="0"/>
-        <w:right w:val="single" w:color="auto" w:sz="4" w:space="0"/>
-        <w:insideH w:val="single" w:color="auto" w:sz="4" w:space="0"/>
-        <w:insideV w:val="single" w:color="auto" w:sz="4" w:space="0"/>
+        <w:top w:val="single" w:sz="4" w:space="0" w:color="auto"/>
+        <w:left w:val="single" w:sz="4" w:space="0" w:color="auto"/>
+        <w:bottom w:val="single" w:sz="4" w:space="0" w:color="auto"/>
+        <w:right w:val="single" w:sz="4" w:space="0" w:color="auto"/>
+        <w:insideH w:val="single" w:sz="4" w:space="0" w:color="auto"/>
+        <w:insideV w:val="single" w:sz="4" w:space="0" w:color="auto"/>
       </w:tblBorders>
-      <w:tblCellMar>
-        <w:top w:w="0" w:type="dxa"/>
-        <w:left w:w="108" w:type="dxa"/>
-        <w:bottom w:w="0" w:type="dxa"/>
-        <w:right w:w="108" w:type="dxa"/>
-      </w:tblCellMar>
     </w:tblPr>
   </w:style>
   <w:style w:type="character" w:styleId="Hyperlink">
@@ -5632,7 +5739,7 @@
       <w:u w:val="single"/>
     </w:rPr>
   </w:style>
-  <w:style w:type="character" w:styleId="apple-converted-space" w:customStyle="1">
+  <w:style w:type="character" w:customStyle="1" w:styleId="apple-converted-space">
     <w:name w:val="apple-converted-space"/>
     <w:basedOn w:val="Fontepargpadro"/>
     <w:rsid w:val="0047566E"/>
@@ -5663,7 +5770,7 @@
       <w:spacing w:after="0" w:line="240" w:lineRule="auto"/>
     </w:pPr>
   </w:style>
-  <w:style w:type="character" w:styleId="CabealhoChar" w:customStyle="1">
+  <w:style w:type="character" w:customStyle="1" w:styleId="CabealhoChar">
     <w:name w:val="Cabeçalho Char"/>
     <w:basedOn w:val="Fontepargpadro"/>
     <w:link w:val="Cabealho"/>
@@ -5685,7 +5792,7 @@
       <w:spacing w:after="0" w:line="240" w:lineRule="auto"/>
     </w:pPr>
   </w:style>
-  <w:style w:type="character" w:styleId="RodapChar" w:customStyle="1">
+  <w:style w:type="character" w:customStyle="1" w:styleId="RodapChar">
     <w:name w:val="Rodapé Char"/>
     <w:basedOn w:val="Fontepargpadro"/>
     <w:link w:val="Rodap"/>
@@ -5709,7 +5816,7 @@
       <w:szCs w:val="16"/>
     </w:rPr>
   </w:style>
-  <w:style w:type="character" w:styleId="TextodebaloChar" w:customStyle="1">
+  <w:style w:type="character" w:customStyle="1" w:styleId="TextodebaloChar">
     <w:name w:val="Texto de balão Char"/>
     <w:basedOn w:val="Fontepargpadro"/>
     <w:link w:val="Textodebalo"/>
@@ -5722,14 +5829,14 @@
       <w:szCs w:val="16"/>
     </w:rPr>
   </w:style>
-  <w:style w:type="character" w:styleId="Ttulo7Char" w:customStyle="1">
+  <w:style w:type="character" w:customStyle="1" w:styleId="Ttulo7Char">
     <w:name w:val="Título 7 Char"/>
     <w:basedOn w:val="Fontepargpadro"/>
     <w:link w:val="Ttulo7"/>
     <w:uiPriority w:val="99"/>
     <w:rsid w:val="00976CD0"/>
     <w:rPr>
-      <w:rFonts w:ascii="Arial" w:hAnsi="Arial" w:eastAsia="Times New Roman" w:cs="Times New Roman"/>
+      <w:rFonts w:ascii="Arial" w:eastAsia="Times New Roman" w:hAnsi="Arial" w:cs="Times New Roman"/>
       <w:color w:val="000000"/>
       <w:sz w:val="24"/>
       <w:szCs w:val="20"/>
@@ -5746,7 +5853,7 @@
       <w:jc w:val="both"/>
     </w:pPr>
     <w:rPr>
-      <w:rFonts w:ascii="Times New Roman" w:hAnsi="Times New Roman" w:eastAsia="Times New Roman" w:cs="Times New Roman"/>
+      <w:rFonts w:ascii="Times New Roman" w:eastAsia="Times New Roman" w:hAnsi="Times New Roman" w:cs="Times New Roman"/>
       <w:b/>
       <w:sz w:val="32"/>
       <w:szCs w:val="20"/>
@@ -5763,7 +5870,7 @@
       <w:spacing w:before="100" w:beforeAutospacing="1" w:after="100" w:afterAutospacing="1" w:line="240" w:lineRule="auto"/>
     </w:pPr>
     <w:rPr>
-      <w:rFonts w:ascii="Times New Roman" w:hAnsi="Times New Roman" w:eastAsia="Times New Roman" w:cs="Times New Roman"/>
+      <w:rFonts w:ascii="Times New Roman" w:eastAsia="Times New Roman" w:hAnsi="Times New Roman" w:cs="Times New Roman"/>
       <w:sz w:val="24"/>
       <w:szCs w:val="24"/>
       <w:lang w:eastAsia="pt-BR"/>
@@ -5799,13 +5906,13 @@
       <w:spacing w:after="0" w:line="240" w:lineRule="auto"/>
     </w:pPr>
     <w:rPr>
-      <w:rFonts w:ascii="Courier New" w:hAnsi="Courier New" w:eastAsia="Times New Roman" w:cs="Courier New"/>
+      <w:rFonts w:ascii="Courier New" w:eastAsia="Times New Roman" w:hAnsi="Courier New" w:cs="Courier New"/>
       <w:sz w:val="20"/>
       <w:szCs w:val="20"/>
       <w:lang w:eastAsia="pt-BR"/>
     </w:rPr>
   </w:style>
-  <w:style w:type="character" w:styleId="Pr-formataoHTMLChar" w:customStyle="1">
+  <w:style w:type="character" w:customStyle="1" w:styleId="Pr-formataoHTMLChar">
     <w:name w:val="Pré-formatação HTML Char"/>
     <w:basedOn w:val="Fontepargpadro"/>
     <w:link w:val="Pr-formataoHTML"/>
@@ -5813,7 +5920,7 @@
     <w:semiHidden/>
     <w:rsid w:val="00D510B7"/>
     <w:rPr>
-      <w:rFonts w:ascii="Courier New" w:hAnsi="Courier New" w:eastAsia="Times New Roman" w:cs="Courier New"/>
+      <w:rFonts w:ascii="Courier New" w:eastAsia="Times New Roman" w:hAnsi="Courier New" w:cs="Courier New"/>
       <w:sz w:val="20"/>
       <w:szCs w:val="20"/>
       <w:lang w:eastAsia="pt-BR"/>
@@ -5833,19 +5940,19 @@
       <w:jc w:val="both"/>
     </w:pPr>
     <w:rPr>
-      <w:rFonts w:ascii="Times New Roman" w:hAnsi="Times New Roman" w:eastAsia="Times New Roman" w:cs="Times New Roman"/>
+      <w:rFonts w:ascii="Times New Roman" w:eastAsia="Times New Roman" w:hAnsi="Times New Roman" w:cs="Times New Roman"/>
       <w:sz w:val="24"/>
       <w:szCs w:val="20"/>
       <w:lang w:eastAsia="pt-BR"/>
     </w:rPr>
   </w:style>
-  <w:style w:type="character" w:styleId="RecuodecorpodetextoChar" w:customStyle="1">
+  <w:style w:type="character" w:customStyle="1" w:styleId="RecuodecorpodetextoChar">
     <w:name w:val="Recuo de corpo de texto Char"/>
     <w:basedOn w:val="Fontepargpadro"/>
     <w:link w:val="Recuodecorpodetexto"/>
     <w:rsid w:val="000E7EB7"/>
     <w:rPr>
-      <w:rFonts w:ascii="Times New Roman" w:hAnsi="Times New Roman" w:eastAsia="Times New Roman" w:cs="Times New Roman"/>
+      <w:rFonts w:ascii="Times New Roman" w:eastAsia="Times New Roman" w:hAnsi="Times New Roman" w:cs="Times New Roman"/>
       <w:sz w:val="24"/>
       <w:szCs w:val="20"/>
       <w:lang w:eastAsia="pt-BR"/>

</xml_diff>